<commit_message>
docs(pdf-parser): clarify report metrics
</commit_message>
<xml_diff>
--- a/research/pdf-parser/reports/PDF_Parser_Degerlendirme_ve_Yonlendirme_Raporu_Agustos_2026.docx
+++ b/research/pdf-parser/reports/PDF_Parser_Degerlendirme_ve_Yonlendirme_Raporu_Agustos_2026.docx
@@ -139,7 +139,7 @@
       <w:r>
         <w:fldChar w:fldCharType="separate"/>
       </w:r>
-      <w:hyperlink w:anchor="_Toc238549432" w:history="1">
+      <w:hyperlink w:anchor="_Toc238555610" w:history="1">
         <w:r>
           <w:rPr>
             <w:rStyle w:val="Kpr"/>
@@ -166,7 +166,7 @@
             <w:noProof/>
             <w:webHidden/>
           </w:rPr>
-          <w:instrText xml:space="preserve"> PAGEREF _Toc238549432 \h </w:instrText>
+          <w:instrText xml:space="preserve"> PAGEREF _Toc238555610 \h </w:instrText>
         </w:r>
         <w:r>
           <w:rPr>
@@ -213,7 +213,7 @@
           <w:lang w:val="tr-TR" w:eastAsia="tr-TR"/>
         </w:rPr>
       </w:pPr>
-      <w:hyperlink w:anchor="_Toc238549433" w:history="1">
+      <w:hyperlink w:anchor="_Toc238555611" w:history="1">
         <w:r>
           <w:rPr>
             <w:rStyle w:val="Kpr"/>
@@ -240,7 +240,7 @@
             <w:noProof/>
             <w:webHidden/>
           </w:rPr>
-          <w:instrText xml:space="preserve"> PAGEREF _Toc238549433 \h </w:instrText>
+          <w:instrText xml:space="preserve"> PAGEREF _Toc238555611 \h </w:instrText>
         </w:r>
         <w:r>
           <w:rPr>
@@ -287,7 +287,7 @@
           <w:lang w:val="tr-TR" w:eastAsia="tr-TR"/>
         </w:rPr>
       </w:pPr>
-      <w:hyperlink w:anchor="_Toc238549434" w:history="1">
+      <w:hyperlink w:anchor="_Toc238555612" w:history="1">
         <w:r>
           <w:rPr>
             <w:rStyle w:val="Kpr"/>
@@ -314,7 +314,7 @@
             <w:noProof/>
             <w:webHidden/>
           </w:rPr>
-          <w:instrText xml:space="preserve"> PAGEREF _Toc238549434 \h </w:instrText>
+          <w:instrText xml:space="preserve"> PAGEREF _Toc238555612 \h </w:instrText>
         </w:r>
         <w:r>
           <w:rPr>
@@ -361,7 +361,7 @@
           <w:lang w:val="tr-TR" w:eastAsia="tr-TR"/>
         </w:rPr>
       </w:pPr>
-      <w:hyperlink w:anchor="_Toc238549435" w:history="1">
+      <w:hyperlink w:anchor="_Toc238555613" w:history="1">
         <w:r>
           <w:rPr>
             <w:rStyle w:val="Kpr"/>
@@ -388,7 +388,7 @@
             <w:noProof/>
             <w:webHidden/>
           </w:rPr>
-          <w:instrText xml:space="preserve"> PAGEREF _Toc238549435 \h </w:instrText>
+          <w:instrText xml:space="preserve"> PAGEREF _Toc238555613 \h </w:instrText>
         </w:r>
         <w:r>
           <w:rPr>
@@ -435,7 +435,7 @@
           <w:lang w:val="tr-TR" w:eastAsia="tr-TR"/>
         </w:rPr>
       </w:pPr>
-      <w:hyperlink w:anchor="_Toc238549436" w:history="1">
+      <w:hyperlink w:anchor="_Toc238555614" w:history="1">
         <w:r>
           <w:rPr>
             <w:rStyle w:val="Kpr"/>
@@ -462,7 +462,7 @@
             <w:noProof/>
             <w:webHidden/>
           </w:rPr>
-          <w:instrText xml:space="preserve"> PAGEREF _Toc238549436 \h </w:instrText>
+          <w:instrText xml:space="preserve"> PAGEREF _Toc238555614 \h </w:instrText>
         </w:r>
         <w:r>
           <w:rPr>
@@ -509,7 +509,7 @@
           <w:lang w:val="tr-TR" w:eastAsia="tr-TR"/>
         </w:rPr>
       </w:pPr>
-      <w:hyperlink w:anchor="_Toc238549437" w:history="1">
+      <w:hyperlink w:anchor="_Toc238555615" w:history="1">
         <w:r>
           <w:rPr>
             <w:rStyle w:val="Kpr"/>
@@ -536,7 +536,7 @@
             <w:noProof/>
             <w:webHidden/>
           </w:rPr>
-          <w:instrText xml:space="preserve"> PAGEREF _Toc238549437 \h </w:instrText>
+          <w:instrText xml:space="preserve"> PAGEREF _Toc238555615 \h </w:instrText>
         </w:r>
         <w:r>
           <w:rPr>
@@ -583,7 +583,7 @@
           <w:lang w:val="tr-TR" w:eastAsia="tr-TR"/>
         </w:rPr>
       </w:pPr>
-      <w:hyperlink w:anchor="_Toc238549438" w:history="1">
+      <w:hyperlink w:anchor="_Toc238555616" w:history="1">
         <w:r>
           <w:rPr>
             <w:rStyle w:val="Kpr"/>
@@ -610,7 +610,7 @@
             <w:noProof/>
             <w:webHidden/>
           </w:rPr>
-          <w:instrText xml:space="preserve"> PAGEREF _Toc238549438 \h </w:instrText>
+          <w:instrText xml:space="preserve"> PAGEREF _Toc238555616 \h </w:instrText>
         </w:r>
         <w:r>
           <w:rPr>
@@ -657,7 +657,7 @@
           <w:lang w:val="tr-TR" w:eastAsia="tr-TR"/>
         </w:rPr>
       </w:pPr>
-      <w:hyperlink w:anchor="_Toc238549439" w:history="1">
+      <w:hyperlink w:anchor="_Toc238555617" w:history="1">
         <w:r>
           <w:rPr>
             <w:rStyle w:val="Kpr"/>
@@ -684,7 +684,7 @@
             <w:noProof/>
             <w:webHidden/>
           </w:rPr>
-          <w:instrText xml:space="preserve"> PAGEREF _Toc238549439 \h </w:instrText>
+          <w:instrText xml:space="preserve"> PAGEREF _Toc238555617 \h </w:instrText>
         </w:r>
         <w:r>
           <w:rPr>
@@ -731,7 +731,7 @@
           <w:lang w:val="tr-TR" w:eastAsia="tr-TR"/>
         </w:rPr>
       </w:pPr>
-      <w:hyperlink w:anchor="_Toc238549440" w:history="1">
+      <w:hyperlink w:anchor="_Toc238555618" w:history="1">
         <w:r>
           <w:rPr>
             <w:rStyle w:val="Kpr"/>
@@ -758,7 +758,7 @@
             <w:noProof/>
             <w:webHidden/>
           </w:rPr>
-          <w:instrText xml:space="preserve"> PAGEREF _Toc238549440 \h </w:instrText>
+          <w:instrText xml:space="preserve"> PAGEREF _Toc238555618 \h </w:instrText>
         </w:r>
         <w:r>
           <w:rPr>
@@ -805,7 +805,7 @@
           <w:lang w:val="tr-TR" w:eastAsia="tr-TR"/>
         </w:rPr>
       </w:pPr>
-      <w:hyperlink w:anchor="_Toc238549441" w:history="1">
+      <w:hyperlink w:anchor="_Toc238555619" w:history="1">
         <w:r>
           <w:rPr>
             <w:rStyle w:val="Kpr"/>
@@ -832,7 +832,7 @@
             <w:noProof/>
             <w:webHidden/>
           </w:rPr>
-          <w:instrText xml:space="preserve"> PAGEREF _Toc238549441 \h </w:instrText>
+          <w:instrText xml:space="preserve"> PAGEREF _Toc238555619 \h </w:instrText>
         </w:r>
         <w:r>
           <w:rPr>
@@ -879,7 +879,7 @@
           <w:lang w:val="tr-TR" w:eastAsia="tr-TR"/>
         </w:rPr>
       </w:pPr>
-      <w:hyperlink w:anchor="_Toc238549442" w:history="1">
+      <w:hyperlink w:anchor="_Toc238555620" w:history="1">
         <w:r>
           <w:rPr>
             <w:rStyle w:val="Kpr"/>
@@ -906,7 +906,7 @@
             <w:noProof/>
             <w:webHidden/>
           </w:rPr>
-          <w:instrText xml:space="preserve"> PAGEREF _Toc238549442 \h </w:instrText>
+          <w:instrText xml:space="preserve"> PAGEREF _Toc238555620 \h </w:instrText>
         </w:r>
         <w:r>
           <w:rPr>
@@ -953,7 +953,7 @@
           <w:lang w:val="tr-TR" w:eastAsia="tr-TR"/>
         </w:rPr>
       </w:pPr>
-      <w:hyperlink w:anchor="_Toc238549443" w:history="1">
+      <w:hyperlink w:anchor="_Toc238555621" w:history="1">
         <w:r>
           <w:rPr>
             <w:rStyle w:val="Kpr"/>
@@ -980,7 +980,7 @@
             <w:noProof/>
             <w:webHidden/>
           </w:rPr>
-          <w:instrText xml:space="preserve"> PAGEREF _Toc238549443 \h </w:instrText>
+          <w:instrText xml:space="preserve"> PAGEREF _Toc238555621 \h </w:instrText>
         </w:r>
         <w:r>
           <w:rPr>
@@ -1027,7 +1027,7 @@
           <w:lang w:val="tr-TR" w:eastAsia="tr-TR"/>
         </w:rPr>
       </w:pPr>
-      <w:hyperlink w:anchor="_Toc238549444" w:history="1">
+      <w:hyperlink w:anchor="_Toc238555622" w:history="1">
         <w:r>
           <w:rPr>
             <w:rStyle w:val="Kpr"/>
@@ -1054,7 +1054,7 @@
             <w:noProof/>
             <w:webHidden/>
           </w:rPr>
-          <w:instrText xml:space="preserve"> PAGEREF _Toc238549444 \h </w:instrText>
+          <w:instrText xml:space="preserve"> PAGEREF _Toc238555622 \h </w:instrText>
         </w:r>
         <w:r>
           <w:rPr>
@@ -1101,7 +1101,7 @@
           <w:lang w:val="tr-TR" w:eastAsia="tr-TR"/>
         </w:rPr>
       </w:pPr>
-      <w:hyperlink w:anchor="_Toc238549445" w:history="1">
+      <w:hyperlink w:anchor="_Toc238555623" w:history="1">
         <w:r>
           <w:rPr>
             <w:rStyle w:val="Kpr"/>
@@ -1128,7 +1128,7 @@
             <w:noProof/>
             <w:webHidden/>
           </w:rPr>
-          <w:instrText xml:space="preserve"> PAGEREF _Toc238549445 \h </w:instrText>
+          <w:instrText xml:space="preserve"> PAGEREF _Toc238555623 \h </w:instrText>
         </w:r>
         <w:r>
           <w:rPr>
@@ -1175,7 +1175,7 @@
           <w:lang w:val="tr-TR" w:eastAsia="tr-TR"/>
         </w:rPr>
       </w:pPr>
-      <w:hyperlink w:anchor="_Toc238549446" w:history="1">
+      <w:hyperlink w:anchor="_Toc238555624" w:history="1">
         <w:r>
           <w:rPr>
             <w:rStyle w:val="Kpr"/>
@@ -1202,7 +1202,7 @@
             <w:noProof/>
             <w:webHidden/>
           </w:rPr>
-          <w:instrText xml:space="preserve"> PAGEREF _Toc238549446 \h </w:instrText>
+          <w:instrText xml:space="preserve"> PAGEREF _Toc238555624 \h </w:instrText>
         </w:r>
         <w:r>
           <w:rPr>
@@ -1224,7 +1224,7 @@
             <w:noProof/>
             <w:webHidden/>
           </w:rPr>
-          <w:t>8</w:t>
+          <w:t>9</w:t>
         </w:r>
         <w:r>
           <w:rPr>
@@ -1249,7 +1249,7 @@
           <w:lang w:val="tr-TR" w:eastAsia="tr-TR"/>
         </w:rPr>
       </w:pPr>
-      <w:hyperlink w:anchor="_Toc238549447" w:history="1">
+      <w:hyperlink w:anchor="_Toc238555625" w:history="1">
         <w:r>
           <w:rPr>
             <w:rStyle w:val="Kpr"/>
@@ -1276,7 +1276,7 @@
             <w:noProof/>
             <w:webHidden/>
           </w:rPr>
-          <w:instrText xml:space="preserve"> PAGEREF _Toc238549447 \h </w:instrText>
+          <w:instrText xml:space="preserve"> PAGEREF _Toc238555625 \h </w:instrText>
         </w:r>
         <w:r>
           <w:rPr>
@@ -1323,7 +1323,7 @@
           <w:lang w:val="tr-TR" w:eastAsia="tr-TR"/>
         </w:rPr>
       </w:pPr>
-      <w:hyperlink w:anchor="_Toc238549448" w:history="1">
+      <w:hyperlink w:anchor="_Toc238555626" w:history="1">
         <w:r>
           <w:rPr>
             <w:rStyle w:val="Kpr"/>
@@ -1350,7 +1350,7 @@
             <w:noProof/>
             <w:webHidden/>
           </w:rPr>
-          <w:instrText xml:space="preserve"> PAGEREF _Toc238549448 \h </w:instrText>
+          <w:instrText xml:space="preserve"> PAGEREF _Toc238555626 \h </w:instrText>
         </w:r>
         <w:r>
           <w:rPr>
@@ -1372,7 +1372,7 @@
             <w:noProof/>
             <w:webHidden/>
           </w:rPr>
-          <w:t>9</w:t>
+          <w:t>10</w:t>
         </w:r>
         <w:r>
           <w:rPr>
@@ -1397,7 +1397,7 @@
           <w:lang w:val="tr-TR" w:eastAsia="tr-TR"/>
         </w:rPr>
       </w:pPr>
-      <w:hyperlink w:anchor="_Toc238549449" w:history="1">
+      <w:hyperlink w:anchor="_Toc238555627" w:history="1">
         <w:r>
           <w:rPr>
             <w:rStyle w:val="Kpr"/>
@@ -1424,7 +1424,7 @@
             <w:noProof/>
             <w:webHidden/>
           </w:rPr>
-          <w:instrText xml:space="preserve"> PAGEREF _Toc238549449 \h </w:instrText>
+          <w:instrText xml:space="preserve"> PAGEREF _Toc238555627 \h </w:instrText>
         </w:r>
         <w:r>
           <w:rPr>
@@ -1471,7 +1471,7 @@
           <w:lang w:val="tr-TR" w:eastAsia="tr-TR"/>
         </w:rPr>
       </w:pPr>
-      <w:hyperlink w:anchor="_Toc238549450" w:history="1">
+      <w:hyperlink w:anchor="_Toc238555628" w:history="1">
         <w:r>
           <w:rPr>
             <w:rStyle w:val="Kpr"/>
@@ -1498,7 +1498,7 @@
             <w:noProof/>
             <w:webHidden/>
           </w:rPr>
-          <w:instrText xml:space="preserve"> PAGEREF _Toc238549450 \h </w:instrText>
+          <w:instrText xml:space="preserve"> PAGEREF _Toc238555628 \h </w:instrText>
         </w:r>
         <w:r>
           <w:rPr>
@@ -1545,7 +1545,7 @@
           <w:lang w:val="tr-TR" w:eastAsia="tr-TR"/>
         </w:rPr>
       </w:pPr>
-      <w:hyperlink w:anchor="_Toc238549451" w:history="1">
+      <w:hyperlink w:anchor="_Toc238555629" w:history="1">
         <w:r>
           <w:rPr>
             <w:rStyle w:val="Kpr"/>
@@ -1572,7 +1572,7 @@
             <w:noProof/>
             <w:webHidden/>
           </w:rPr>
-          <w:instrText xml:space="preserve"> PAGEREF _Toc238549451 \h </w:instrText>
+          <w:instrText xml:space="preserve"> PAGEREF _Toc238555629 \h </w:instrText>
         </w:r>
         <w:r>
           <w:rPr>
@@ -1619,7 +1619,7 @@
           <w:lang w:val="tr-TR" w:eastAsia="tr-TR"/>
         </w:rPr>
       </w:pPr>
-      <w:hyperlink w:anchor="_Toc238549452" w:history="1">
+      <w:hyperlink w:anchor="_Toc238555630" w:history="1">
         <w:r>
           <w:rPr>
             <w:rStyle w:val="Kpr"/>
@@ -1646,7 +1646,7 @@
             <w:noProof/>
             <w:webHidden/>
           </w:rPr>
-          <w:instrText xml:space="preserve"> PAGEREF _Toc238549452 \h </w:instrText>
+          <w:instrText xml:space="preserve"> PAGEREF _Toc238555630 \h </w:instrText>
         </w:r>
         <w:r>
           <w:rPr>
@@ -1693,7 +1693,7 @@
           <w:lang w:val="tr-TR" w:eastAsia="tr-TR"/>
         </w:rPr>
       </w:pPr>
-      <w:hyperlink w:anchor="_Toc238549453" w:history="1">
+      <w:hyperlink w:anchor="_Toc238555631" w:history="1">
         <w:r>
           <w:rPr>
             <w:rStyle w:val="Kpr"/>
@@ -1720,7 +1720,7 @@
             <w:noProof/>
             <w:webHidden/>
           </w:rPr>
-          <w:instrText xml:space="preserve"> PAGEREF _Toc238549453 \h </w:instrText>
+          <w:instrText xml:space="preserve"> PAGEREF _Toc238555631 \h </w:instrText>
         </w:r>
         <w:r>
           <w:rPr>
@@ -1767,7 +1767,7 @@
           <w:lang w:val="tr-TR" w:eastAsia="tr-TR"/>
         </w:rPr>
       </w:pPr>
-      <w:hyperlink w:anchor="_Toc238549454" w:history="1">
+      <w:hyperlink w:anchor="_Toc238555632" w:history="1">
         <w:r>
           <w:rPr>
             <w:rStyle w:val="Kpr"/>
@@ -1794,7 +1794,7 @@
             <w:noProof/>
             <w:webHidden/>
           </w:rPr>
-          <w:instrText xml:space="preserve"> PAGEREF _Toc238549454 \h </w:instrText>
+          <w:instrText xml:space="preserve"> PAGEREF _Toc238555632 \h </w:instrText>
         </w:r>
         <w:r>
           <w:rPr>
@@ -1841,7 +1841,7 @@
           <w:lang w:val="tr-TR" w:eastAsia="tr-TR"/>
         </w:rPr>
       </w:pPr>
-      <w:hyperlink w:anchor="_Toc238549455" w:history="1">
+      <w:hyperlink w:anchor="_Toc238555633" w:history="1">
         <w:r>
           <w:rPr>
             <w:rStyle w:val="Kpr"/>
@@ -1868,7 +1868,7 @@
             <w:noProof/>
             <w:webHidden/>
           </w:rPr>
-          <w:instrText xml:space="preserve"> PAGEREF _Toc238549455 \h </w:instrText>
+          <w:instrText xml:space="preserve"> PAGEREF _Toc238555633 \h </w:instrText>
         </w:r>
         <w:r>
           <w:rPr>
@@ -1915,7 +1915,7 @@
           <w:lang w:val="tr-TR" w:eastAsia="tr-TR"/>
         </w:rPr>
       </w:pPr>
-      <w:hyperlink w:anchor="_Toc238549456" w:history="1">
+      <w:hyperlink w:anchor="_Toc238555634" w:history="1">
         <w:r>
           <w:rPr>
             <w:rStyle w:val="Kpr"/>
@@ -1942,7 +1942,7 @@
             <w:noProof/>
             <w:webHidden/>
           </w:rPr>
-          <w:instrText xml:space="preserve"> PAGEREF _Toc238549456 \h </w:instrText>
+          <w:instrText xml:space="preserve"> PAGEREF _Toc238555634 \h </w:instrText>
         </w:r>
         <w:r>
           <w:rPr>
@@ -1989,7 +1989,7 @@
           <w:lang w:val="tr-TR" w:eastAsia="tr-TR"/>
         </w:rPr>
       </w:pPr>
-      <w:hyperlink w:anchor="_Toc238549457" w:history="1">
+      <w:hyperlink w:anchor="_Toc238555635" w:history="1">
         <w:r>
           <w:rPr>
             <w:rStyle w:val="Kpr"/>
@@ -2016,7 +2016,7 @@
             <w:noProof/>
             <w:webHidden/>
           </w:rPr>
-          <w:instrText xml:space="preserve"> PAGEREF _Toc238549457 \h </w:instrText>
+          <w:instrText xml:space="preserve"> PAGEREF _Toc238555635 \h </w:instrText>
         </w:r>
         <w:r>
           <w:rPr>
@@ -2063,7 +2063,7 @@
           <w:lang w:val="tr-TR" w:eastAsia="tr-TR"/>
         </w:rPr>
       </w:pPr>
-      <w:hyperlink w:anchor="_Toc238549458" w:history="1">
+      <w:hyperlink w:anchor="_Toc238555636" w:history="1">
         <w:r>
           <w:rPr>
             <w:rStyle w:val="Kpr"/>
@@ -2090,7 +2090,7 @@
             <w:noProof/>
             <w:webHidden/>
           </w:rPr>
-          <w:instrText xml:space="preserve"> PAGEREF _Toc238549458 \h </w:instrText>
+          <w:instrText xml:space="preserve"> PAGEREF _Toc238555636 \h </w:instrText>
         </w:r>
         <w:r>
           <w:rPr>
@@ -2112,7 +2112,7 @@
             <w:noProof/>
             <w:webHidden/>
           </w:rPr>
-          <w:t>15</w:t>
+          <w:t>16</w:t>
         </w:r>
         <w:r>
           <w:rPr>
@@ -2137,7 +2137,7 @@
           <w:lang w:val="tr-TR" w:eastAsia="tr-TR"/>
         </w:rPr>
       </w:pPr>
-      <w:hyperlink w:anchor="_Toc238549459" w:history="1">
+      <w:hyperlink w:anchor="_Toc238555637" w:history="1">
         <w:r>
           <w:rPr>
             <w:rStyle w:val="Kpr"/>
@@ -2164,7 +2164,7 @@
             <w:noProof/>
             <w:webHidden/>
           </w:rPr>
-          <w:instrText xml:space="preserve"> PAGEREF _Toc238549459 \h </w:instrText>
+          <w:instrText xml:space="preserve"> PAGEREF _Toc238555637 \h </w:instrText>
         </w:r>
         <w:r>
           <w:rPr>
@@ -2211,7 +2211,7 @@
           <w:lang w:val="tr-TR" w:eastAsia="tr-TR"/>
         </w:rPr>
       </w:pPr>
-      <w:hyperlink w:anchor="_Toc238549460" w:history="1">
+      <w:hyperlink w:anchor="_Toc238555638" w:history="1">
         <w:r>
           <w:rPr>
             <w:rStyle w:val="Kpr"/>
@@ -2238,7 +2238,7 @@
             <w:noProof/>
             <w:webHidden/>
           </w:rPr>
-          <w:instrText xml:space="preserve"> PAGEREF _Toc238549460 \h </w:instrText>
+          <w:instrText xml:space="preserve"> PAGEREF _Toc238555638 \h </w:instrText>
         </w:r>
         <w:r>
           <w:rPr>
@@ -2285,7 +2285,7 @@
           <w:lang w:val="tr-TR" w:eastAsia="tr-TR"/>
         </w:rPr>
       </w:pPr>
-      <w:hyperlink w:anchor="_Toc238549461" w:history="1">
+      <w:hyperlink w:anchor="_Toc238555639" w:history="1">
         <w:r>
           <w:rPr>
             <w:rStyle w:val="Kpr"/>
@@ -2312,7 +2312,7 @@
             <w:noProof/>
             <w:webHidden/>
           </w:rPr>
-          <w:instrText xml:space="preserve"> PAGEREF _Toc238549461 \h </w:instrText>
+          <w:instrText xml:space="preserve"> PAGEREF _Toc238555639 \h </w:instrText>
         </w:r>
         <w:r>
           <w:rPr>
@@ -2359,7 +2359,7 @@
           <w:lang w:val="tr-TR" w:eastAsia="tr-TR"/>
         </w:rPr>
       </w:pPr>
-      <w:hyperlink w:anchor="_Toc238549462" w:history="1">
+      <w:hyperlink w:anchor="_Toc238555640" w:history="1">
         <w:r>
           <w:rPr>
             <w:rStyle w:val="Kpr"/>
@@ -2386,7 +2386,7 @@
             <w:noProof/>
             <w:webHidden/>
           </w:rPr>
-          <w:instrText xml:space="preserve"> PAGEREF _Toc238549462 \h </w:instrText>
+          <w:instrText xml:space="preserve"> PAGEREF _Toc238555640 \h </w:instrText>
         </w:r>
         <w:r>
           <w:rPr>
@@ -2408,7 +2408,7 @@
             <w:noProof/>
             <w:webHidden/>
           </w:rPr>
-          <w:t>16</w:t>
+          <w:t>17</w:t>
         </w:r>
         <w:r>
           <w:rPr>
@@ -2433,7 +2433,7 @@
           <w:lang w:val="tr-TR" w:eastAsia="tr-TR"/>
         </w:rPr>
       </w:pPr>
-      <w:hyperlink w:anchor="_Toc238549463" w:history="1">
+      <w:hyperlink w:anchor="_Toc238555641" w:history="1">
         <w:r>
           <w:rPr>
             <w:rStyle w:val="Kpr"/>
@@ -2460,7 +2460,7 @@
             <w:noProof/>
             <w:webHidden/>
           </w:rPr>
-          <w:instrText xml:space="preserve"> PAGEREF _Toc238549463 \h </w:instrText>
+          <w:instrText xml:space="preserve"> PAGEREF _Toc238555641 \h </w:instrText>
         </w:r>
         <w:r>
           <w:rPr>
@@ -2482,7 +2482,7 @@
             <w:noProof/>
             <w:webHidden/>
           </w:rPr>
-          <w:t>17</w:t>
+          <w:t>18</w:t>
         </w:r>
         <w:r>
           <w:rPr>
@@ -2507,7 +2507,7 @@
           <w:lang w:val="tr-TR" w:eastAsia="tr-TR"/>
         </w:rPr>
       </w:pPr>
-      <w:hyperlink w:anchor="_Toc238549464" w:history="1">
+      <w:hyperlink w:anchor="_Toc238555642" w:history="1">
         <w:r>
           <w:rPr>
             <w:rStyle w:val="Kpr"/>
@@ -2534,7 +2534,7 @@
             <w:noProof/>
             <w:webHidden/>
           </w:rPr>
-          <w:instrText xml:space="preserve"> PAGEREF _Toc238549464 \h </w:instrText>
+          <w:instrText xml:space="preserve"> PAGEREF _Toc238555642 \h </w:instrText>
         </w:r>
         <w:r>
           <w:rPr>
@@ -2556,7 +2556,7 @@
             <w:noProof/>
             <w:webHidden/>
           </w:rPr>
-          <w:t>18</w:t>
+          <w:t>19</w:t>
         </w:r>
         <w:r>
           <w:rPr>
@@ -2581,7 +2581,7 @@
           <w:lang w:val="tr-TR" w:eastAsia="tr-TR"/>
         </w:rPr>
       </w:pPr>
-      <w:hyperlink w:anchor="_Toc238549465" w:history="1">
+      <w:hyperlink w:anchor="_Toc238555643" w:history="1">
         <w:r>
           <w:rPr>
             <w:rStyle w:val="Kpr"/>
@@ -2608,7 +2608,7 @@
             <w:noProof/>
             <w:webHidden/>
           </w:rPr>
-          <w:instrText xml:space="preserve"> PAGEREF _Toc238549465 \h </w:instrText>
+          <w:instrText xml:space="preserve"> PAGEREF _Toc238555643 \h </w:instrText>
         </w:r>
         <w:r>
           <w:rPr>
@@ -2655,7 +2655,7 @@
           <w:lang w:val="tr-TR" w:eastAsia="tr-TR"/>
         </w:rPr>
       </w:pPr>
-      <w:hyperlink w:anchor="_Toc238549466" w:history="1">
+      <w:hyperlink w:anchor="_Toc238555644" w:history="1">
         <w:r>
           <w:rPr>
             <w:rStyle w:val="Kpr"/>
@@ -2682,7 +2682,7 @@
             <w:noProof/>
             <w:webHidden/>
           </w:rPr>
-          <w:instrText xml:space="preserve"> PAGEREF _Toc238549466 \h </w:instrText>
+          <w:instrText xml:space="preserve"> PAGEREF _Toc238555644 \h </w:instrText>
         </w:r>
         <w:r>
           <w:rPr>
@@ -2729,7 +2729,7 @@
           <w:lang w:val="tr-TR" w:eastAsia="tr-TR"/>
         </w:rPr>
       </w:pPr>
-      <w:hyperlink w:anchor="_Toc238549467" w:history="1">
+      <w:hyperlink w:anchor="_Toc238555645" w:history="1">
         <w:r>
           <w:rPr>
             <w:rStyle w:val="Kpr"/>
@@ -2756,7 +2756,7 @@
             <w:noProof/>
             <w:webHidden/>
           </w:rPr>
-          <w:instrText xml:space="preserve"> PAGEREF _Toc238549467 \h </w:instrText>
+          <w:instrText xml:space="preserve"> PAGEREF _Toc238555645 \h </w:instrText>
         </w:r>
         <w:r>
           <w:rPr>
@@ -2803,7 +2803,7 @@
           <w:lang w:val="tr-TR" w:eastAsia="tr-TR"/>
         </w:rPr>
       </w:pPr>
-      <w:hyperlink w:anchor="_Toc238549468" w:history="1">
+      <w:hyperlink w:anchor="_Toc238555646" w:history="1">
         <w:r>
           <w:rPr>
             <w:rStyle w:val="Kpr"/>
@@ -2830,7 +2830,7 @@
             <w:noProof/>
             <w:webHidden/>
           </w:rPr>
-          <w:instrText xml:space="preserve"> PAGEREF _Toc238549468 \h </w:instrText>
+          <w:instrText xml:space="preserve"> PAGEREF _Toc238555646 \h </w:instrText>
         </w:r>
         <w:r>
           <w:rPr>
@@ -2877,7 +2877,7 @@
           <w:lang w:val="tr-TR" w:eastAsia="tr-TR"/>
         </w:rPr>
       </w:pPr>
-      <w:hyperlink w:anchor="_Toc238549469" w:history="1">
+      <w:hyperlink w:anchor="_Toc238555647" w:history="1">
         <w:r>
           <w:rPr>
             <w:rStyle w:val="Kpr"/>
@@ -2904,7 +2904,7 @@
             <w:noProof/>
             <w:webHidden/>
           </w:rPr>
-          <w:instrText xml:space="preserve"> PAGEREF _Toc238549469 \h </w:instrText>
+          <w:instrText xml:space="preserve"> PAGEREF _Toc238555647 \h </w:instrText>
         </w:r>
         <w:r>
           <w:rPr>
@@ -2951,7 +2951,7 @@
           <w:lang w:val="tr-TR" w:eastAsia="tr-TR"/>
         </w:rPr>
       </w:pPr>
-      <w:hyperlink w:anchor="_Toc238549470" w:history="1">
+      <w:hyperlink w:anchor="_Toc238555648" w:history="1">
         <w:r>
           <w:rPr>
             <w:rStyle w:val="Kpr"/>
@@ -2978,7 +2978,7 @@
             <w:noProof/>
             <w:webHidden/>
           </w:rPr>
-          <w:instrText xml:space="preserve"> PAGEREF _Toc238549470 \h </w:instrText>
+          <w:instrText xml:space="preserve"> PAGEREF _Toc238555648 \h </w:instrText>
         </w:r>
         <w:r>
           <w:rPr>
@@ -3025,7 +3025,7 @@
           <w:lang w:val="tr-TR" w:eastAsia="tr-TR"/>
         </w:rPr>
       </w:pPr>
-      <w:hyperlink w:anchor="_Toc238549471" w:history="1">
+      <w:hyperlink w:anchor="_Toc238555649" w:history="1">
         <w:r>
           <w:rPr>
             <w:rStyle w:val="Kpr"/>
@@ -3052,7 +3052,7 @@
             <w:noProof/>
             <w:webHidden/>
           </w:rPr>
-          <w:instrText xml:space="preserve"> PAGEREF _Toc238549471 \h </w:instrText>
+          <w:instrText xml:space="preserve"> PAGEREF _Toc238555649 \h </w:instrText>
         </w:r>
         <w:r>
           <w:rPr>
@@ -3099,7 +3099,7 @@
           <w:lang w:val="tr-TR" w:eastAsia="tr-TR"/>
         </w:rPr>
       </w:pPr>
-      <w:hyperlink w:anchor="_Toc238549472" w:history="1">
+      <w:hyperlink w:anchor="_Toc238555650" w:history="1">
         <w:r>
           <w:rPr>
             <w:rStyle w:val="Kpr"/>
@@ -3126,7 +3126,7 @@
             <w:noProof/>
             <w:webHidden/>
           </w:rPr>
-          <w:instrText xml:space="preserve"> PAGEREF _Toc238549472 \h </w:instrText>
+          <w:instrText xml:space="preserve"> PAGEREF _Toc238555650 \h </w:instrText>
         </w:r>
         <w:r>
           <w:rPr>
@@ -3173,7 +3173,7 @@
           <w:lang w:val="tr-TR" w:eastAsia="tr-TR"/>
         </w:rPr>
       </w:pPr>
-      <w:hyperlink w:anchor="_Toc238549473" w:history="1">
+      <w:hyperlink w:anchor="_Toc238555651" w:history="1">
         <w:r>
           <w:rPr>
             <w:rStyle w:val="Kpr"/>
@@ -3200,7 +3200,7 @@
             <w:noProof/>
             <w:webHidden/>
           </w:rPr>
-          <w:instrText xml:space="preserve"> PAGEREF _Toc238549473 \h </w:instrText>
+          <w:instrText xml:space="preserve"> PAGEREF _Toc238555651 \h </w:instrText>
         </w:r>
         <w:r>
           <w:rPr>
@@ -3222,7 +3222,7 @@
             <w:noProof/>
             <w:webHidden/>
           </w:rPr>
-          <w:t>22</w:t>
+          <w:t>23</w:t>
         </w:r>
         <w:r>
           <w:rPr>
@@ -3247,7 +3247,7 @@
           <w:lang w:val="tr-TR" w:eastAsia="tr-TR"/>
         </w:rPr>
       </w:pPr>
-      <w:hyperlink w:anchor="_Toc238549474" w:history="1">
+      <w:hyperlink w:anchor="_Toc238555652" w:history="1">
         <w:r>
           <w:rPr>
             <w:rStyle w:val="Kpr"/>
@@ -3274,7 +3274,7 @@
             <w:noProof/>
             <w:webHidden/>
           </w:rPr>
-          <w:instrText xml:space="preserve"> PAGEREF _Toc238549474 \h </w:instrText>
+          <w:instrText xml:space="preserve"> PAGEREF _Toc238555652 \h </w:instrText>
         </w:r>
         <w:r>
           <w:rPr>
@@ -3334,7 +3334,7 @@
           <w:bottom w:val="single" w:sz="8" w:space="5" w:color="207B79"/>
         </w:pBdr>
       </w:pPr>
-      <w:bookmarkStart w:id="0" w:name="_Toc238549432"/>
+      <w:bookmarkStart w:id="0" w:name="_Toc238555610"/>
       <w:r>
         <w:lastRenderedPageBreak/>
         <w:t>1. Çalışmanın Amacı ve Genel Sonuç</w:t>
@@ -3494,7 +3494,7 @@
           <w:bottom w:val="single" w:sz="8" w:space="5" w:color="207B79"/>
         </w:pBdr>
       </w:pPr>
-      <w:bookmarkStart w:id="1" w:name="_Toc238549433"/>
+      <w:bookmarkStart w:id="1" w:name="_Toc238555611"/>
       <w:r>
         <w:lastRenderedPageBreak/>
         <w:t>2. Değerlendirme Yöntemi ve Veri Setleri</w:t>
@@ -3505,7 +3505,7 @@
       <w:pPr>
         <w:pStyle w:val="Balk2"/>
       </w:pPr>
-      <w:bookmarkStart w:id="2" w:name="_Toc238549434"/>
+      <w:bookmarkStart w:id="2" w:name="_Toc238555612"/>
       <w:r>
         <w:t>2.1 Nelerin ölçüldüğü</w:t>
       </w:r>
@@ -3563,7 +3563,7 @@
       <w:pPr>
         <w:pStyle w:val="Balk3"/>
       </w:pPr>
-      <w:bookmarkStart w:id="3" w:name="_Toc238549435"/>
+      <w:bookmarkStart w:id="3" w:name="_Toc238555613"/>
       <w:r>
         <w:t>Birleşik fayda puanı ve net fayda</w:t>
       </w:r>
@@ -3620,10 +3620,29 @@
         </w:rPr>
       </w:pPr>
       <w:r>
-        <w:t>Net fayda, yönlendirilmiş sistemin hızlı yolu ne kadar iyileştirdiğini veya kötüleştirdiğini gösteriyor. Önce her belge için yönlen</w:t>
-      </w:r>
-      <w:r>
-        <w:t>dirilmiş çıktının puanından hızlı çıktının puanı çıkarılıyor, ardından bütün belge farkları toplanıyor:</w:t>
+        <w:t>Bu katsayılar yayımlanmış bir standarttan veya OpenDataLoader benchmark'ından alınmadı. Metin içeriğini puanın ana bileşeni yapmak,</w:t>
+      </w:r>
+      <w:r>
+        <w:t xml:space="preserve"> aynı içeriği karakter ve kelime düzeyinde iki farklı açıdan denetlemek, yalnız uzunluğa dayalı benzerliğin etkisini sınırlamak ve yapıya daha küçük fakat görünür bir pay vermek amacıyla proje içinde sezgisel olarak belirlendi. Bu nedenle puan kesin doğrul</w:t>
+      </w:r>
+      <w:r>
+        <w:t>uk ölçüsü değil, parser sürümlerini aynı koşullarda karşılaştırmaya yarayan bir geliştirme ölçütüdür. Katsayıların kalıcı kabul edilmesinden önce, yönlendirme çalışmalarında kullanılmamış belgeler üzerinde insan değerlendirmesiyle karşılaştırılması ve fark</w:t>
+      </w:r>
+      <w:r>
+        <w:t>lı ağırlıklarda motor sıralamasının değişip değişmediğinin incelenmesi gerekir.</w:t>
+      </w:r>
+    </w:p>
+    <w:p>
+      <w:pPr>
+        <w:rPr>
+          <w:rFonts w:hint="eastAsia"/>
+        </w:rPr>
+      </w:pPr>
+      <w:r>
+        <w:t>Net fayda, yönlendirilmiş sistemin hızlı yolu ne kadar iyileştirdiğini veya kötüleştirdiğini gösteriyor. Önce her belge için yönlendirilmiş çıktının puanından hızlı çıktının pu</w:t>
+      </w:r>
+      <w:r>
+        <w:t>anı çıkarılıyor, ardından bütün belge farkları toplanıyor:</w:t>
       </w:r>
     </w:p>
     <w:p>
@@ -3700,13 +3719,10 @@
         <w:t>+0,03</w:t>
       </w:r>
       <w:r>
-        <w:t xml:space="preserve"> olur. Pozitif değer,</w:t>
-      </w:r>
-      <w:r>
-        <w:t xml:space="preserve"> yönlendirmenin korpus genelinde hızlı yoldan daha iyi sonuç ürettiğini; negatif değer ise verdiği zararın sağladığı kazançtan büyük olduğunu gösterir. Bu hesap yalnız olumlu farkları toplamaz, gereksiz ağır motor çağrılarının yol açtığı kayıpları da aynı </w:t>
-      </w:r>
-      <w:r>
-        <w:t xml:space="preserve">toplamda tutar. Rapordaki </w:t>
+        <w:t xml:space="preserve"> olur. Pozitif değer, yönlendirmenin korpus genelinde hızlı yoldan</w:t>
+      </w:r>
+      <w:r>
+        <w:t xml:space="preserve"> daha iyi sonuç ürettiğini; negatif değer ise verdiği zararın sağladığı kazançtan büyük olduğunu gösterir. Bu hesap yalnız olumlu farkları toplamaz, gereksiz ağır motor çağrılarının yol açtığı kayıpları da aynı toplamda tutar. Rapordaki </w:t>
       </w:r>
       <w:r>
         <w:rPr>
@@ -3717,7 +3733,10 @@
         <w:t>+4,0550</w:t>
       </w:r>
       <w:r>
-        <w:t xml:space="preserve"> değeri bu nedenle bir yüzde veya belge ortalaması değil, 380 belgedeki puan farklarının toplamıdır; farklı büyüklükteki korpusların toplamları doğrudan karşılaştırılmamalıdır.</w:t>
+        <w:t xml:space="preserve"> değeri bu n</w:t>
+      </w:r>
+      <w:r>
+        <w:t>edenle bir yüzde veya belge ortalaması değil, 380 belgedeki puan farklarının toplamıdır; farklı büyüklükteki korpusların toplamları doğrudan karşılaştırılmamalıdır.</w:t>
       </w:r>
     </w:p>
     <w:p>
@@ -3727,10 +3746,11 @@
         </w:rPr>
       </w:pPr>
       <w:r>
-        <w:t>“Faydalı ağır çağrı” etiketi net faydadan ayrı</w:t>
-      </w:r>
-      <w:r>
-        <w:t xml:space="preserve"> bir sınıflandırmadır. Ağır çıktının hızlı çıktıdan en az </w:t>
+        <w:lastRenderedPageBreak/>
+        <w:t>“Faydalı ağır çağrı” etiketi net faydadan ayrı bir sınıflandırmadır. Ağır çıktının hızlı çı</w:t>
+      </w:r>
+      <w:r>
+        <w:t xml:space="preserve">ktıdan en az </w:t>
       </w:r>
       <w:r>
         <w:rPr>
@@ -3765,11 +3785,7 @@
         <w:t>Hız ölçümlerinde yalnız toplam süre değil, sayfa başına maliyet ve karşılaştırmanın aynı donanım üzerinde yapılıp yapılmadığı da dikkate alındı. GPU çalı</w:t>
       </w:r>
       <w:r>
-        <w:t xml:space="preserve">şmasında farklı makinelerin sonuçlarını karşılaştırmanın yanıltıcı olduğu görüldüğü için CPU ve GPU hızlanması aynı makinede alınan iki </w:t>
-      </w:r>
-      <w:r>
-        <w:lastRenderedPageBreak/>
-        <w:t>koşu üzerinden hesaplandı. Tekrarlanabilirlik için aynı girdinin tekrar koşularında aynı sonucu üretip üretmediğine de b</w:t>
+        <w:t>şmasında farklı makinelerin sonuçlarını karşılaştırmanın yanıltıcı olduğu görüldüğü için CPU ve GPU hızlanması aynı makinede alınan iki koşu üzerinden hesaplandı. Tekrarlanabilirlik için aynı girdinin tekrar koşularında aynı sonucu üretip üretmediğine de b</w:t>
       </w:r>
       <w:r>
         <w:t>akıldı.</w:t>
@@ -3779,7 +3795,7 @@
       <w:pPr>
         <w:pStyle w:val="Balk2"/>
       </w:pPr>
-      <w:bookmarkStart w:id="4" w:name="_Toc238549436"/>
+      <w:bookmarkStart w:id="4" w:name="_Toc238555614"/>
       <w:r>
         <w:t>2.2 Kullanılan veri setleri</w:t>
       </w:r>
@@ -4489,7 +4505,11 @@
         <w:t>OpenDataLoader benchmark, üçüncü tarafın hazırladığı 200 İngilizce PDF, doğru kabul edilen referans çıktılar ve değerlendirme kodundan oluşuyor. Her PDF tek sayfa. Bu durum okuma sırası, tablo ve başlı</w:t>
       </w:r>
       <w:r>
-        <w:t>k yapısı için standart bir karşılaştırma sağlıyor; ancak sayfaların yeniden birleştirilmesi, sayfa sınırında bölünen cümleler veya uzun belgelerde tekrarlanan üstbilgiler gibi sorunları ölçmüyor.</w:t>
+        <w:t xml:space="preserve">k yapısı için standart bir karşılaştırma sağlıyor; ancak sayfaların yeniden birleştirilmesi, </w:t>
+      </w:r>
+      <w:r>
+        <w:lastRenderedPageBreak/>
+        <w:t>sayfa sınırında bölünen cümleler veya uzun belgelerde tekrarlanan üstbilgiler gibi sorunları ölçmüyor.</w:t>
       </w:r>
     </w:p>
     <w:p>
@@ -4515,7 +4535,6 @@
         </w:rPr>
       </w:pPr>
       <w:r>
-        <w:lastRenderedPageBreak/>
         <w:t>DocLayNet'in ICDAR alt kümesi ile OmniDocBench de incelendi. İndirilen içeriklerde üretim hattına verilebilecek PD</w:t>
       </w:r>
       <w:r>
@@ -4526,7 +4545,7 @@
       <w:pPr>
         <w:pStyle w:val="Balk2"/>
       </w:pPr>
-      <w:bookmarkStart w:id="5" w:name="_Toc238549437"/>
+      <w:bookmarkStart w:id="5" w:name="_Toc238555615"/>
       <w:r>
         <w:t>2.3 Karşılaştırmanın ortak zemini</w:t>
       </w:r>
@@ -4571,7 +4590,7 @@
           <w:bottom w:val="single" w:sz="8" w:space="5" w:color="207B79"/>
         </w:pBdr>
       </w:pPr>
-      <w:bookmarkStart w:id="6" w:name="_Toc238549438"/>
+      <w:bookmarkStart w:id="6" w:name="_Toc238555616"/>
       <w:r>
         <w:t>3. Hazır Parser'ların Karşılaştırılması</w:t>
       </w:r>
@@ -4581,7 +4600,7 @@
       <w:pPr>
         <w:pStyle w:val="Balk2"/>
       </w:pPr>
-      <w:bookmarkStart w:id="7" w:name="_Toc238549439"/>
+      <w:bookmarkStart w:id="7" w:name="_Toc238555617"/>
       <w:r>
         <w:t>3.1 Karşılaştırılan araçlar</w:t>
       </w:r>
@@ -4680,21 +4699,46 @@
         <w:t>MinerU</w:t>
       </w:r>
       <w:r>
-        <w:t xml:space="preserve"> da OCR ve belge yapısında zengin çıktı üretebiliyor. Pipeline ve GPU/VLM modlarının maliyet ile kalite dengesi birbirinden farklı olduğu için bu raporda ilk parser karşıl</w:t>
-      </w:r>
-      <w:r>
-        <w:t>aştırması ile daha güçlü GPU modu ayrı bağlamlarda ele alındı.</w:t>
+        <w:t xml:space="preserve"> da OCR ve belge yapısında zengin çıktı üretebiliyor. Pipeline ve GPU/VLM modlarının maliyet ile kalite dengesi birbirinden farklı olduğu için bu raporda ilk parser karşılaştırması ile daha güçlü GPU modu ayrı bağlamlarda ele alındı.</w:t>
       </w:r>
     </w:p>
     <w:p>
       <w:pPr>
         <w:pStyle w:val="Balk2"/>
       </w:pPr>
-      <w:bookmarkStart w:id="8" w:name="_Toc238549440"/>
-      <w:r>
-        <w:t>3.2 OpenDataLoader benchmark sonuçları</w:t>
+      <w:bookmarkStart w:id="8" w:name="_Toc238555618"/>
+      <w:r>
+        <w:t>3.2 OpenDataLoader ben</w:t>
+      </w:r>
+      <w:r>
+        <w:t>chmark sonuçları</w:t>
       </w:r>
       <w:bookmarkEnd w:id="8"/>
+    </w:p>
+    <w:p>
+      <w:pPr>
+        <w:rPr>
+          <w:rFonts w:hint="eastAsia"/>
+        </w:rPr>
+      </w:pPr>
+      <w:r>
+        <w:t xml:space="preserve">Benchmark veri seti, değerlendirme kodu ve yeniden üretim adımları </w:t>
+      </w:r>
+      <w:hyperlink r:id="rId8">
+        <w:r>
+          <w:rPr>
+            <w:color w:val="207B79"/>
+            <w:u w:val="single"/>
+          </w:rPr>
+          <w:t>OpenDataLoader Benchmark GitHub deposunda</w:t>
+        </w:r>
+      </w:hyperlink>
+      <w:r>
+        <w:t xml:space="preserve"> yayımlanıyor. Aşağıdaki değerler deponun güncel </w:t>
+      </w:r>
+      <w:r>
+        <w:t>web tablosunu değil, bu çalışma sırasında yerel olarak kullanılan benchmark sürümü ve aynı 200 belge üzerinde alınan sonuçları gösteriyor.</w:t>
+      </w:r>
     </w:p>
     <w:p>
       <w:pPr>
@@ -4751,6 +4795,7 @@
                 <w:color w:val="FFFFFF"/>
                 <w:sz w:val="18"/>
               </w:rPr>
+              <w:lastRenderedPageBreak/>
               <w:t>Motor</w:t>
             </w:r>
           </w:p>
@@ -5734,11 +5779,10 @@
         </w:rPr>
       </w:pPr>
       <w:r>
-        <w:lastRenderedPageBreak/>
-        <w:t>Docling ve MinerU satırları yerel ek benchmark çıktısından, diğer satırlar birleştirilmiş araştırma alanındaki sonuç dosyasından doğrulandı. Bu iki satırın kaynak ayrımı önemlidir; eski README, Docling ve MinerU ölçümü tamamlanmadan önce yazıldığı için yal</w:t>
-      </w:r>
-      <w:r>
-        <w:t>nız dört motoru içeriyor.</w:t>
+        <w:t xml:space="preserve">Docling ve MinerU satırları yerel ek benchmark çıktısından, diğer satırlar birleştirilmiş araştırma alanındaki sonuç dosyasından doğrulandı. Bu iki satırın kaynak ayrımı önemlidir; eski README, Docling ve MinerU ölçümü </w:t>
+      </w:r>
+      <w:r>
+        <w:t>tamamlanmadan önce yazıldığı için yalnız dört motoru içeriyor.</w:t>
       </w:r>
     </w:p>
     <w:p>
@@ -5754,7 +5798,7 @@
           <w:noProof/>
         </w:rPr>
         <w:drawing>
-          <wp:inline distT="0" distB="0" distL="0" distR="0" wp14:anchorId="718477AC" wp14:editId="01EFEC09">
+          <wp:inline distT="0" distB="0" distL="0" distR="0" wp14:anchorId="47E732B0" wp14:editId="0B905F5C">
             <wp:extent cx="5940000" cy="2994207"/>
             <wp:effectExtent l="0" t="0" r="0" b="0"/>
             <wp:docPr id="1" name="Picture 1"/>
@@ -5769,7 +5813,7 @@
                     <pic:cNvPicPr/>
                   </pic:nvPicPr>
                   <pic:blipFill>
-                    <a:blip r:embed="rId8"/>
+                    <a:blip r:embed="rId9"/>
                     <a:stretch>
                       <a:fillRect/>
                     </a:stretch>
@@ -5798,7 +5842,10 @@
         </w:rPr>
       </w:pPr>
       <w:r>
-        <w:t>Şekil 1. Altı parser'ın OpenDataLoader benchmark genel skorları. Tek bir motor bütün kalite boyutlarında üstün değildir; Docling yapı doğruluğunda, pdf-inspector ise okuma sırasında öne çıkmaktadır.</w:t>
+        <w:t xml:space="preserve">Şekil 1. Altı parser'ın OpenDataLoader benchmark genel skorları. Tek bir motor bütün kalite boyutlarında üstün değildir; Docling yapı doğruluğunda, pdf-inspector ise okuma sırasında öne </w:t>
+      </w:r>
+      <w:r>
+        <w:t>çıkmaktadır.</w:t>
       </w:r>
     </w:p>
     <w:p>
@@ -5808,13 +5855,10 @@
         </w:rPr>
       </w:pPr>
       <w:r>
-        <w:t xml:space="preserve">Genel skorda Docling ilk </w:t>
-      </w:r>
-      <w:r>
-        <w:t>sırada. Tablo ve başlık sonuçları da bu seçimi destekliyor. pdf-inspector'ın genel skoru çok yakın ve okuma sırası puanı bütün motorlardan yüksek. Bu sonuç hızlı ve ağır motor ayrımı için önemliydi: pdf-inspector düşük maliyetli ilk çıktı için yeterince gü</w:t>
-      </w:r>
-      <w:r>
-        <w:t>çlü bir adayken Docling karmaşık yapı bulunan sayfalarda daha yüksek kalite sağlayabiliyor.</w:t>
+        <w:t>Genel skorda Docling ilk sırada. Tablo ve başlık sonuçları da bu seçimi destekliyor. pdf-inspector'ın genel skoru çok yakın ve okuma sırası puanı bütün motorlardan yüksek. Bu sonuç hızlı ve ağır motor ayrımı için önemliydi: pdf-inspector düşük</w:t>
+      </w:r>
+      <w:r>
+        <w:t xml:space="preserve"> maliyetli ilk çıktı için yeterince güçlü bir adayken Docling karmaşık yapı bulunan sayfalarda daha yüksek kalite sağlayabiliyor.</w:t>
       </w:r>
     </w:p>
     <w:p>
@@ -5824,10 +5868,10 @@
         </w:rPr>
       </w:pPr>
       <w:r>
-        <w:t>PyMuPDF4LLM okuma sırası ve yapı puanlarında güçlü görünse de işlem süresi hızlı yol için yüksek kaldı. MinerU tablo puanında Docling'e yakın sonuç verdi, ancak gen</w:t>
-      </w:r>
-      <w:r>
-        <w:t>el skor ve maliyet dengesi varsayılan kullanım için uygun değildi. OpenDataLoader motorunun okuma sırası yüksekken tablo puanı belirgin biçimde düşük kaldı.</w:t>
+        <w:t xml:space="preserve">PyMuPDF4LLM okuma sırası ve yapı puanlarında güçlü görünse de işlem süresi hızlı yol için yüksek kaldı. MinerU tablo puanında </w:t>
+      </w:r>
+      <w:r>
+        <w:t>Docling'e yakın sonuç verdi, ancak genel skor ve maliyet dengesi varsayılan kullanım için uygun değildi. OpenDataLoader motorunun okuma sırası yüksekken tablo puanı belirgin biçimde düşük kaldı.</w:t>
       </w:r>
     </w:p>
     <w:p>
@@ -5845,17 +5889,20 @@
         <w:t>pypdf</w:t>
       </w:r>
       <w:r>
-        <w:t xml:space="preserve"> okuma sırası metrikinde tamamen başarısız değil; 0,8696 ile temel metnin önemli bölümünü doğru sırada çıkarabiliyor. Ancak benchmark'ta tablo ve başlık yapısı üretemediği için bu iki alanda sıfır aldı. Buradaki sonuç, aracın her PDF için kullanılamaz oldu</w:t>
-      </w:r>
-      <w:r>
-        <w:t>ğu değil, araştırma platformunun ihtiyaç duyduğu yapısal bilgiyi tek başına sağlayamadığıdır.</w:t>
+        <w:t xml:space="preserve"> okuma sırası metrikinde tamamen başarısız değil; 0,8696</w:t>
+      </w:r>
+      <w:r>
+        <w:t xml:space="preserve"> ile temel metnin önemli bölümünü doğru sırada çıkarabiliyor. Ancak benchmark'ta tablo ve başlık yapısı üretemediği için bu iki alanda sıfır aldı. Buradaki sonuç, aracın her PDF için kullanılamaz olduğu değil, araştırma platformunun ihtiyaç duyduğu yapısal</w:t>
+      </w:r>
+      <w:r>
+        <w:t xml:space="preserve"> bilgiyi tek başına sağlayamadığıdır.</w:t>
       </w:r>
     </w:p>
     <w:p>
       <w:pPr>
         <w:pStyle w:val="Balk2"/>
       </w:pPr>
-      <w:bookmarkStart w:id="9" w:name="_Toc238549441"/>
+      <w:bookmarkStart w:id="9" w:name="_Toc238555619"/>
       <w:r>
         <w:t>3.3 Gözle incelemede görülen sorunlar</w:t>
       </w:r>
@@ -5868,13 +5915,14 @@
         </w:rPr>
       </w:pPr>
       <w:r>
-        <w:t xml:space="preserve">Sayısal skorlar motorların genel sırasını gösterse de hatanın biçimini açıklamak için sayfa örneklerine bakmak gerekti. İki </w:t>
-      </w:r>
-      <w:r>
-        <w:t>sütunlu makalelerde en sık karşılaşılan sorunlardan biri, sol sütun tamamlanmadan sağ sütuna geçilmesi veya iki sütunun cümle parçalarının aynı satırda birleşmesiydi. Bu tür bir çıktı karakter sayısını büyük ölçüde koruyabilir, fakat metnin anlamını ve alı</w:t>
-      </w:r>
-      <w:r>
-        <w:t>ntılanabilirliğini bozar.</w:t>
+        <w:t>Sayısal skorlar motorların genel sırasını gösterse de hatanın biçimini açıklamak için sayfa örneklerine bakmak gerekti. İki sütunlu makalelerde en sık karşılaşılan sorunlardan biri</w:t>
+      </w:r>
+      <w:r>
+        <w:t xml:space="preserve">, sol sütun tamamlanmadan sağ sütuna geçilmesi veya iki sütunun cümle parçalarının aynı satırda </w:t>
+      </w:r>
+      <w:r>
+        <w:lastRenderedPageBreak/>
+        <w:t>birleşmesiydi. Bu tür bir çıktı karakter sayısını büyük ölçüde koruyabilir, fakat metnin anlamını ve alıntılanabilirliğini bozar.</w:t>
       </w:r>
     </w:p>
     <w:p>
@@ -5884,10 +5932,13 @@
         </w:rPr>
       </w:pPr>
       <w:r>
-        <w:t>İkinci sorun sayfa üstbilgisi, altbilgisi ve dergi bilgilerinin gövdeye karışmasıydı. Tekrarlanan telif satırı bazen cümlenin ortasına giriyor, bazen de her sayfada yeni bir başlık gibi algılanıyordu. Uzun belgelerde aynı hata onl</w:t>
-      </w:r>
-      <w:r>
-        <w:t>arca kez tekrarlandığı için arama sonuçlarını ve pasaj bölüm yolunu etkileyebiliyor.</w:t>
+        <w:t>İkinci sorun sayfa üstbilgisi,</w:t>
+      </w:r>
+      <w:r>
+        <w:t xml:space="preserve"> altbilgisi ve dergi bilgilerinin gövdeye karışmasıydı. Tekrarlanan telif satırı bazen cümlenin ortasına giriyor, bazen de her sayfada yeni bir başlık gibi algılanıyordu. Uzun belgelerde aynı hata onlarca kez tekrarlandığı için arama sonuçlarını ve pasaj b</w:t>
+      </w:r>
+      <w:r>
+        <w:t>ölüm yolunu etkileyebiliyor.</w:t>
       </w:r>
     </w:p>
     <w:p>
@@ -5919,10 +5970,10 @@
         <w:t>ation</w:t>
       </w:r>
       <w:r>
-        <w:t xml:space="preserve"> parçalarını doğru birleştirirken diğeri araya boşluk koyabiliyor ve</w:t>
-      </w:r>
-      <w:r>
-        <w:t>ya tireyi bütünüyle koruyabiliyordu. Türkçe belgelerde bu sorun eklerin ayrılması ve arama eşleşmelerinin azalması biçiminde görülüyordu.</w:t>
+        <w:t xml:space="preserve"> parçalarını doğru birleştirirken diğeri araya boşluk koyabiliyor veya tireyi bütünüyle koruyabiliyordu. Türkçe belgelerde b</w:t>
+      </w:r>
+      <w:r>
+        <w:t>u sorun eklerin ayrılması ve arama eşleşmelerinin azalması biçiminde görülüyordu.</w:t>
       </w:r>
     </w:p>
     <w:p>
@@ -5932,11 +5983,10 @@
         </w:rPr>
       </w:pPr>
       <w:r>
-        <w:lastRenderedPageBreak/>
-        <w:t>Tablo ve şekil ayrımı ayrı bir güçlük oluşturdu. Vektörel diyagramlardaki çok sayıda kutu ve bağlantı çizgisi geometri</w:t>
-      </w:r>
-      <w:r>
-        <w:t>k olarak tablo ızgarasına benzeyebiliyor. Bu nedenle yalnız çizgi yoğunluğuna bakan basit bir kural, ağ mimarisi gibi bir diyagramı yanlışlıkla tablo olarak işaretleyebiliyor.</w:t>
+        <w:t>Tablo ve şekil ayrımı ayrı bir güçlük oluşturdu. Vektörel diyagramlardaki çok sayıda kutu ve bağlantı çizgisi geometrik olarak tablo ızgarasına benzeyebiliyor. Bu nedenle yal</w:t>
+      </w:r>
+      <w:r>
+        <w:t>nız çizgi yoğunluğuna bakan basit bir kural, ağ mimarisi gibi bir diyagramı yanlışlıkla tablo olarak işaretleyebiliyor.</w:t>
       </w:r>
     </w:p>
     <w:p>
@@ -5946,13 +5996,13 @@
         </w:rPr>
       </w:pPr>
       <w:r>
-        <w:t>Bu karşılaştırmaların ortak sonucu, tek bir motorun bütün belgeyi her durumda en</w:t>
-      </w:r>
-      <w:r>
-        <w:t xml:space="preserve"> iyi biçimde çıkaramayacağıydı. Hızlı motorun temiz sayfalarda korunması, OCR veya karmaşık yapı bulunan sayfaların ise daha güçlü bir motora gönderilmesi hem kalite hem maliyet açısından daha uygun görünüyordu. Çalışmanın bir sonraki aşaması bu seçimin be</w:t>
-      </w:r>
-      <w:r>
-        <w:t>lge başında tek seferde değil, sayfa sayfa yapılması üzerine kuruldu.</w:t>
+        <w:t>Bu karşılaştırmaların ortak sonucu, tek bir motorun bütün belgeyi her durumda en iyi biçimde çıkaramayacağıydı. Hızlı motorun temiz sayf</w:t>
+      </w:r>
+      <w:r>
+        <w:t>alarda korunması, OCR veya karmaşık yapı bulunan sayfaların ise daha güçlü bir motora gönderilmesi hem kalite hem maliyet açısından daha uygun görünüyordu. Çalışmanın bir sonraki aşaması bu seçimin belge başında tek seferde değil, sayfa sayfa yapılması üze</w:t>
+      </w:r>
+      <w:r>
+        <w:t>rine kuruldu.</w:t>
       </w:r>
     </w:p>
     <w:p>
@@ -5962,7 +6012,7 @@
           <w:bottom w:val="single" w:sz="8" w:space="5" w:color="207B79"/>
         </w:pBdr>
       </w:pPr>
-      <w:bookmarkStart w:id="10" w:name="_Toc238549442"/>
+      <w:bookmarkStart w:id="10" w:name="_Toc238555620"/>
       <w:r>
         <w:t>4. Sayfa Düzeyinde Yönlendirme Yaklaşımının Gelişimi</w:t>
       </w:r>
@@ -5972,7 +6022,7 @@
       <w:pPr>
         <w:pStyle w:val="Balk2"/>
       </w:pPr>
-      <w:bookmarkStart w:id="11" w:name="_Toc238549443"/>
+      <w:bookmarkStart w:id="11" w:name="_Toc238555621"/>
       <w:r>
         <w:t>4.1 İlk prototipteki yanlış varsayım</w:t>
       </w:r>
@@ -5985,13 +6035,13 @@
         </w:rPr>
       </w:pPr>
       <w:r>
-        <w:t>İlk yönlendirme prototipinde karar bileşeni gerçek hızlı motor çıktısını kullanmıyordu. Yer tutu</w:t>
-      </w:r>
-      <w:r>
-        <w:t>cu olarak PyMuPDF'in ham düz metni verilmişti. Bu metinde fiziksel satırlar ayrı satırlar halinde kaldığı için kalite denetimi sayfaları olduğundan daha parçalı ve bozuk değerlendiriyordu. Aynı dokuz belgeyle yapılan karşılaştırmada geçici girdi kullanıldı</w:t>
-      </w:r>
-      <w:r>
-        <w:t>ğında belgelerin hiçbiri hızlı yolu kullanamazken gerçek hızlı çıkarım bağlandığında üç belge hızlı yolda kalabildi.</w:t>
+        <w:t>İlk yönlendirme prototipinde karar bileşeni gerçek hızlı motor çıktısını kullanmıyordu. Yer tutucu olarak PyMuPDF'in ham düz metni verilmişti. Bu metind</w:t>
+      </w:r>
+      <w:r>
+        <w:t>e fiziksel satırlar ayrı satırlar halinde kaldığı için kalite denetimi sayfaları olduğundan daha parçalı ve bozuk değerlendiriyordu. Aynı dokuz belgeyle yapılan karşılaştırmada geçici girdi kullanıldığında belgelerin hiçbiri hızlı yolu kullanamazken gerçek</w:t>
+      </w:r>
+      <w:r>
+        <w:t xml:space="preserve"> hızlı çıkarım bağlandığında üç belge hızlı yolda kalabildi.</w:t>
       </w:r>
     </w:p>
     <w:p>
@@ -6001,17 +6051,17 @@
         </w:rPr>
       </w:pPr>
       <w:r>
-        <w:t>Buradaki sorun eşikten çok ölçüm girdisiydi. Gerçek davranışı temsil etmeyen bir ara çıktı üzerinde eşik ayarlamak, sistemi yanlış bir hede</w:t>
-      </w:r>
-      <w:r>
-        <w:t>fe göre iyileştirmek anlamına geliyordu. Bu nedenle sonraki ölçümlerde karar bileşeninin üretimde çağıracağı gerçek fonksiyonların kullanılması temel kural haline geldi.</w:t>
+        <w:t>Buradaki sorun eşikten çok ölçüm girdisiydi. Gerçek davranışı temsil etmeyen bir ara çıktı üzerinde eşik ayarlamak, sistemi yanlış bir hedefe göre iyileştirmek anlamına geliyordu. Bu nedenle sonr</w:t>
+      </w:r>
+      <w:r>
+        <w:t>aki ölçümlerde karar bileşeninin üretimde çağıracağı gerçek fonksiyonların kullanılması temel kural haline geldi.</w:t>
       </w:r>
     </w:p>
     <w:p>
       <w:pPr>
         <w:pStyle w:val="Balk2"/>
       </w:pPr>
-      <w:bookmarkStart w:id="12" w:name="_Toc238549444"/>
+      <w:bookmarkStart w:id="12" w:name="_Toc238555622"/>
       <w:r>
         <w:t>4.2 Belge yerine sayfa düzeyinde karar</w:t>
       </w:r>
@@ -6024,13 +6074,10 @@
         </w:rPr>
       </w:pPr>
       <w:r>
-        <w:t>Belge düzeyinde tek karar vermek ilk bakışta da</w:t>
-      </w:r>
-      <w:r>
-        <w:t>ha basit. Ancak uzun bir makalenin büyük bölümü düz metinden oluşurken yalnız birkaç sayfasında karmaşık tablo veya taranmış ek bulunabiliyor. Bu durumda bütün belgeyi Docling'e göndermek, birkaç sayfalık ihtiyaç için yüzlerce sayfanın ağır motorda işlenme</w:t>
-      </w:r>
-      <w:r>
-        <w:t>sine yol açıyor.</w:t>
+        <w:t>Belge düzeyinde tek karar vermek ilk bakışta daha basit. Ancak uzun bir makalenin büyük bölümü düz meti</w:t>
+      </w:r>
+      <w:r>
+        <w:t>nden oluşurken yalnız birkaç sayfasında karmaşık tablo veya taranmış ek bulunabiliyor. Bu durumda bütün belgeyi Docling'e göndermek, birkaç sayfalık ihtiyaç için yüzlerce sayfanın ağır motorda işlenmesine yol açıyor.</w:t>
       </w:r>
     </w:p>
     <w:p>
@@ -6040,22 +6087,22 @@
         </w:rPr>
       </w:pPr>
       <w:r>
-        <w:t>Sayfa düzeyine geçildiğinde hızlı motor bütün sayfalar için bir kez çalıştırılıyor. Ardından her sayfanın sinyalleri ayrı değerlendiriliyor. Böylece temiz sayfalarda oluşmuş iyi çıktı korunuyor, yalnız gerekli sayfalar ağır motora gidiyor.</w:t>
-      </w:r>
-      <w:r>
-        <w:t xml:space="preserve"> Bu değişiklik aynı zamanda eski belge eşiğinin sayfa puanlarına doğrudan taşınamayacağını gösterdi. Sayfa skorlarının dağılımı belge skorlarından farklı olduğu için kalibrasyonun da sayfa düzeyinde yeniden yapılması gerekti.</w:t>
+        <w:t>Sayfa düzeyine geçildiğinde hızlı motor</w:t>
+      </w:r>
+      <w:r>
+        <w:t xml:space="preserve"> bütün sayfalar için bir kez çalıştırılıyor. Ardından her sayfanın sinyalleri ayrı değerlendiriliyor. Böylece temiz sayfalarda oluşmuş iyi çıktı korunuyor, yalnız gerekli sayfalar ağır motora gidiyor. Bu değişiklik aynı zamanda eski belge eşiğinin sayfa pu</w:t>
+      </w:r>
+      <w:r>
+        <w:t>anlarına doğrudan taşınamayacağını gösterdi. Sayfa skorlarının dağılımı belge skorlarından farklı olduğu için kalibrasyonun da sayfa düzeyinde yeniden yapılması gerekti.</w:t>
       </w:r>
     </w:p>
     <w:p>
       <w:pPr>
         <w:pStyle w:val="Balk2"/>
       </w:pPr>
-      <w:bookmarkStart w:id="13" w:name="_Toc238549445"/>
-      <w:r>
-        <w:t>4.3 Önce hızlı çıkar, sonra se</w:t>
-      </w:r>
-      <w:r>
-        <w:t>ç</w:t>
+      <w:bookmarkStart w:id="13" w:name="_Toc238555623"/>
+      <w:r>
+        <w:t>4.3 Önce hızlı çıkar, sonra seç</w:t>
       </w:r>
       <w:bookmarkEnd w:id="13"/>
     </w:p>
@@ -6066,10 +6113,17 @@
         </w:rPr>
       </w:pPr>
       <w:r>
-        <w:t>Yönlendirmede iki olası yaklaşım vardı. Birincisi PDF'nin giriş özelliklerine bakıp daha içerik çıkarılmadan motor seçmekti. İkincisi, düşük maliyetli motoru önce çalıştırıp kararın gerçek çıktı üzerinden verilmesiydi. İkinci yaklaşım benimsendi. Bu saye</w:t>
-      </w:r>
-      <w:r>
-        <w:t>de kalite denetimi varsayılan bir tahmine değil, gerçekten indekslenecek metne bakabildi.</w:t>
+        <w:t>Yönlendirmede iki olası yaklaşım vardı. Birincisi PDF'</w:t>
+      </w:r>
+      <w:r>
+        <w:t xml:space="preserve">nin giriş özelliklerine bakıp daha içerik çıkarılmadan motor seçmekti. İkincisi, düşük maliyetli motoru önce çalıştırıp kararın gerçek çıktı </w:t>
+      </w:r>
+      <w:r>
+        <w:lastRenderedPageBreak/>
+        <w:t>üzerinden verilmesiydi. İkinci yaklaşım benimsendi. Bu sayede kalite denetimi varsayılan bir tahmine değil, gerçekt</w:t>
+      </w:r>
+      <w:r>
+        <w:t>en indekslenecek metne bakabildi.</w:t>
       </w:r>
     </w:p>
     <w:p>
@@ -6079,22 +6133,22 @@
         </w:rPr>
       </w:pPr>
       <w:r>
-        <w:t>Erken sürümde pdf-inspector hem karar aşamasında hem nihai çıktı üretiminde iki kez çağrılıyordu. Karar değişmediği halde çoğu belgede kapı maliyeti yüzde 27 ile 37 a</w:t>
-      </w:r>
-      <w:r>
-        <w:t>rasında artıyordu. İlk çağrının sonucunu yeniden kullanmak bu maliyeti ortadan kaldırdı. Bu ayrıntı küçük bir performans düzenlemesi gibi görünse de yönlendirme yaklaşımının temel ilkesini netleştirdi: hızlı çıktı önce üretiliyor ve sistemin geri kalanında</w:t>
-      </w:r>
-      <w:r>
-        <w:t xml:space="preserve"> aynı çıktı korunuyor.</w:t>
+        <w:t>Erken sürümde pdf-inspector hem karar aşamasında hem nihai çıktı üretiminde iki kez çağrılıyordu. Karar değişmediği halde çoğu belgede kapı maliyeti yüzde 27 ile 37 arasında artıyordu. İlk çağrının sonucunu yeniden kullanm</w:t>
+      </w:r>
+      <w:r>
+        <w:t>ak bu maliyeti ortadan kaldırdı. Bu ayrıntı küçük bir performans düzenlemesi gibi görünse de yönlendirme yaklaşımının temel ilkesini netleştirdi: hızlı çıktı önce üretiliyor ve sistemin geri kalanında aynı çıktı korunuyor.</w:t>
       </w:r>
     </w:p>
     <w:p>
       <w:pPr>
         <w:pStyle w:val="Balk2"/>
       </w:pPr>
-      <w:bookmarkStart w:id="14" w:name="_Toc238549446"/>
-      <w:r>
-        <w:t>4.4 Tek kalite puanından ayrı sinyallere geçiş</w:t>
+      <w:bookmarkStart w:id="14" w:name="_Toc238555624"/>
+      <w:r>
+        <w:t>4.4 Tek kalite puanından ayrı sin</w:t>
+      </w:r>
+      <w:r>
+        <w:t>yallere geçiş</w:t>
       </w:r>
       <w:bookmarkEnd w:id="14"/>
     </w:p>
@@ -6105,18 +6159,138 @@
         </w:rPr>
       </w:pPr>
       <w:r>
-        <w:t>İlk tasarımlardan biri, 17 farklı özelliği tek bir 0-100 kalite puanında birleştirmekti. Böyle bir puan sıralama ve raporlama açısından kullanışlı görünüyordu, fakat ölçümde birkaç özell</w:t>
-      </w:r>
-      <w:r>
-        <w:t xml:space="preserve">iğin toplam sonucu aşırı etkilediği görüldü. Çizim sayısı, hizalama düzensizliği ve belge uzunluğu gibi özellikler </w:t>
-      </w:r>
+        <w:t>İlk tasarımlardan biri, 17 farklı özelliği tek bir 0-100 kalite puanında birleştirmekti. Böyle bir puan sıralama ve raporlama açısından kullanışlı görünüyordu, fakat ölçümde birkaç özelliğin toplam sonucu aşırı etkilediği görüldü. Çizim sayıs</w:t>
+      </w:r>
+      <w:r>
+        <w:t>ı, hizalama düzensizliği ve belge uzunluğu gibi özellikler farklı ihtiyaçları aynı sayıda topluyordu. OCR'a açıkça ihtiyaç duyan sentetik taranmış belge bile birleşik puanda beklenen biçimde öne çıkmadı.</w:t>
+      </w:r>
+    </w:p>
+    <w:p>
+      <w:pPr>
+        <w:rPr>
+          <w:rFonts w:hint="eastAsia"/>
+        </w:rPr>
+      </w:pPr>
+      <w:r>
+        <w:t>Puanı oluşturan ceza kalemleri, çıkarılan metinde gö</w:t>
+      </w:r>
+      <w:r>
+        <w:t>zle görülebilecek bozulma türlerini sayıyor: hızlı çıktıda beklenenden az karakter kalması, anlamsız veya bozuk karakter dizileri, yarım kalmış ve devamı gelmeyen cümleler, cümle ortasında kırılan satırlar, satır sonu tirelerinin birleştirilememesi, bağlam</w:t>
+      </w:r>
+      <w:r>
+        <w:t>ından kopmuş tek başına kalan satırlar, çıktıya sızan biçimlendirme artıkları, tablo satırlarının hücre sayısının tutmaması ve başlık seviyelerinin tutarsız olması. Her kalemin kendi ağırlığı ve üst sınırı var; toplam ceza yüz üzerinden düşülerek sayfa pua</w:t>
+      </w:r>
+      <w:r>
+        <w:t>nı elde ediliyor.</w:t>
+      </w:r>
+    </w:p>
+    <w:p>
+      <w:pPr>
+        <w:rPr>
+          <w:rFonts w:hint="eastAsia"/>
+        </w:rPr>
+      </w:pPr>
+      <w:r>
+        <w:t>Kalite puanının ağır motorun fayda sağlayıp sağlamayacağını öngörme gücü ölçüldüğünde sonuç rastgele seçim seviyesinde kaldı. Bunun nedeni puanın hızlı metnin kendi içindeki bozulmayı ölçmesi, Docling'in daha iyi sonuç verip vermeyeceğini</w:t>
+      </w:r>
+      <w:r>
+        <w:t xml:space="preserve"> ölçmemesiydi. Tablo, OCR ve düzen ihtiyacı ayrı sinyaller gerektirdiği için yalnız puan eşiğini değiştirmek temel sorunu çözmedi.</w:t>
+      </w:r>
+    </w:p>
+    <w:p>
+      <w:pPr>
+        <w:rPr>
+          <w:rFonts w:hint="eastAsia"/>
+        </w:rPr>
+      </w:pPr>
+      <w:r>
+        <w:t>İkinci bir ölçüm aynı yöne işaret etti. Yerel korpusta yalnız düşük kalite gerekçesiyle ağır motora giden 26 sayfa tek tek in</w:t>
+      </w:r>
+      <w:r>
+        <w:t>celendiğinde, 26'sının da aynı cezayı taşıdığı, 25'inde ise bunun tek ceza olduğu görüldü: yarım kalan cümle sayımı. Üstelik 17 sayfa tam olarak aynı puanda toplanmıştı, çünkü bu cezanın üst sınırı doluyordu. Yani tek bir sinyal kararı sürüklüyor ve puanla</w:t>
+      </w:r>
+      <w:r>
+        <w:t>r kademeli bir dağılım yerine tek bir noktada yığılıyordu.</w:t>
+      </w:r>
+    </w:p>
+    <w:p>
+      <w:pPr>
+        <w:rPr>
+          <w:rFonts w:hint="eastAsia"/>
+        </w:rPr>
+      </w:pPr>
+      <w:r>
+        <w:t>Bu nedenle karar, birbirinden bağımsız sorulara ayrıldı. Sayfada metin katmanı var mı, tablo işareti var mı, şekil veya grafik bulunuyor mu ve hızlı metinde belirgin bozulma görülüyor mu? OCR gerek</w:t>
+      </w:r>
+      <w:r>
+        <w:t>sinimi kesin bir kurala bağlandı. Tablo ve şekil sinyalleri ayrı tutuldu. Birleşik kalite puanı tamamen atılmadı, fakat ana kapı olmaktan çıkarılıp ikincil önceliklendirme ve çıktı denetimi görevine indirildi.</w:t>
+      </w:r>
+    </w:p>
+    <w:p>
+      <w:pPr>
+        <w:pStyle w:val="Balk2"/>
+      </w:pPr>
+      <w:bookmarkStart w:id="15" w:name="_Toc238555625"/>
+      <w:r>
+        <w:t>4.5 OCR kararı</w:t>
+      </w:r>
+      <w:bookmarkEnd w:id="15"/>
+    </w:p>
+    <w:p>
+      <w:pPr>
+        <w:rPr>
+          <w:rFonts w:hint="eastAsia"/>
+        </w:rPr>
+      </w:pPr>
+      <w:r>
+        <w:t xml:space="preserve">Metin katmanı </w:t>
+      </w:r>
+      <w:r>
+        <w:t>bulunmayan sayfalar puana bakılmadan ağır yola alınıyor. Bu ayrım önemlidir; boş veya birkaç karakterlik hızlı çıktı, düşük puanlı normal metinle aynı sorun değildir. OCR gereksinimi belirli olduğunda eşik taramak yerine doğrudan kural kullanmak daha güven</w:t>
+      </w:r>
+      <w:r>
+        <w:t>ilir sonuç verdi.</w:t>
+      </w:r>
+    </w:p>
+    <w:p>
+      <w:pPr>
+        <w:rPr>
+          <w:rFonts w:hint="eastAsia"/>
+        </w:rPr>
+      </w:pPr>
+      <w:r>
+        <w:t>Yerel korpustaki OCR örneği sentetik olduğu için bu bulgu gerçek saha taramalarının tamamına genellenemez. Ayrıca OCRTurk belgelerinin tamamı tek sayfa. Dolayısıyla taranmış çok sayfalı belgelerde sayfa birleştirme, devam eden cümleler ve</w:t>
+      </w:r>
+      <w:r>
+        <w:t xml:space="preserve"> tekrarlanan üstbilgiler hâlâ bağımsız bir referans kümesiyle sınanmış değil.</w:t>
+      </w:r>
+    </w:p>
+    <w:p>
+      <w:pPr>
+        <w:rPr>
+          <w:rFonts w:hint="eastAsia"/>
+        </w:rPr>
+      </w:pPr>
+      <w:r>
+        <w:t>Bu noktada PyMuPDF kütüphanesi ayrı bir rol üstleniyor. PyMuPDF raporun başındaki parser karşılaştırmasına aday olarak girmedi; metin çıkarma kalitesi için değil, sayfanın geomet</w:t>
+      </w:r>
+      <w:r>
+        <w:t>risini okumak için kullanılıyor. Sayfadaki çizgileri, dolu dikdörtgenleri, vektörel çizim kümelerini ve gömülü görselleri hızlıca sayabiliyor. Kapının tablo ve şekil sorularını cevaplamasını sağlayan ölçümler bu kütüphaneden geliyor ve maliyeti sayfa başın</w:t>
+      </w:r>
+      <w:r>
+        <w:t>a milisaniye düzeyinde kalıyor.</w:t>
+      </w:r>
+    </w:p>
+    <w:p>
+      <w:pPr>
+        <w:pStyle w:val="Balk2"/>
+      </w:pPr>
+      <w:bookmarkStart w:id="16" w:name="_Toc238555626"/>
       <w:r>
         <w:lastRenderedPageBreak/>
-        <w:t>farklı ihtiyaçları aynı sayıda topluyordu. OCR'a açıkça ihtiyaç duyan sentetik taranmış belge bile birleşik puanda beklenen biçimde öne çıkma</w:t>
-      </w:r>
-      <w:r>
-        <w:t>dı.</w:t>
-      </w:r>
+        <w:t>4.6 Tablo sinyalinin geliştirilmesi</w:t>
+      </w:r>
+      <w:bookmarkEnd w:id="16"/>
     </w:p>
     <w:p>
       <w:pPr>
@@ -6125,13 +6299,13 @@
         </w:rPr>
       </w:pPr>
       <w:r>
-        <w:t>Puanı oluşturan ceza kalemleri, çıkarılan metinde gözle görülebilecek bozulma türlerini sayıyor: hızlı çıktıda beklenenden az karakter kalması, anlamsız veya bozuk karakter dizileri, yarım kalmış ve devamı gelmeyen cümleler, cümle ortasında kırılan sat</w:t>
-      </w:r>
-      <w:r>
-        <w:t>ırlar, satır sonu tirelerinin birleştirilememesi, bağlamından kopmuş tek başına kalan satırlar, çıktıya sızan biçimlendirme artıkları, tablo satırlarının hücre sayısının tutmaması ve başlık seviyelerinin tutarsız olması. Her kalemin kendi ağırlığı ve üst s</w:t>
-      </w:r>
-      <w:r>
-        <w:t>ınırı var; toplam ceza yüz üzerinden düşülerek sayfa puanı elde ediliyor.</w:t>
+        <w:t>Tablo tespiti, ağır motor kararını en doğrudan etkileyen sinyallerden biri oldu. İlk hibrit yaklaşım, pdf-inspector'ın tablo tahmini ile PyMuPDF üzerinden çıkarılan çizgi, kutu ve ızgara i</w:t>
+      </w:r>
+      <w:r>
+        <w:t>şaretlerini OR kuralıyla birleştirdi. Düzeltme öncesinde yerel korpusta isabet 0,551, yakalama 0,929; 200 sayfalık benchmark'ta isabet 0,506, yakalama 0,976 idi. Başka bir deyişle gerçek tabloların büyük bölümü yakalanıyor, fakat tablo olmayan birçok sayfa</w:t>
+      </w:r>
+      <w:r>
+        <w:t xml:space="preserve"> da ağır yola gidiyordu.</w:t>
       </w:r>
     </w:p>
     <w:p>
@@ -6141,10 +6315,10 @@
         </w:rPr>
       </w:pPr>
       <w:r>
-        <w:t>Kalite puanının ağır motorun fayda sağlayıp sağlamayacağını öngörme gücü ölçüldüğünde sonuç rastgele seçim seviyesinde kaldı. Bunun nedeni puanın hızlı metnin kendi içindeki bozulmay</w:t>
-      </w:r>
-      <w:r>
-        <w:t>ı ölçmesi, Docling'in daha iyi sonuç verip vermeyeceğini ölçmemesiydi. Tablo, OCR ve düzen ihtiyacı ayrı sinyaller gerektirdiği için yalnız puan eşiğini değiştirmek temel sorunu çözmedi.</w:t>
+        <w:t>Yanlış pozitifler incelendiğinde büyük grafik ve diyagramların önemli bir kaynak olduğu görüldü. Özellikle çok panelli şekillerde ortogonal çizgi sayısı binlere çıkabiliyordu. Basit kural bu yoğunluğu tablo ızgarası sanıyordu. Büyü</w:t>
+      </w:r>
+      <w:r>
+        <w:t>k şekil alanlarında ortogonal çizgi sinyali bastırıldı ve dolu dikdörtgen eşiği güncellendi. Düzeltme sonrasında yerel korpusta isabet 0,637'ye yükselirken yakalama 0,929'da kaldı. Benchmark tarafında isabet 0,556'ya yükseldi, yakalama 0,952'ye geriledi.</w:t>
       </w:r>
     </w:p>
     <w:p>
@@ -6154,13 +6328,10 @@
         </w:rPr>
       </w:pPr>
       <w:r>
-        <w:t>İkinci bir ölçüm aynı yöne işaret etti. Yerel korpusta yalnız düşük k</w:t>
-      </w:r>
-      <w:r>
-        <w:t>alite gerekçesiyle ağır motora giden 26 sayfa tek tek incelendiğinde, 26'sının da aynı cezayı taşıdığı, 25'inde ise bunun tek ceza olduğu görüldü: yarım kalan cümle sayımı. Üstelik 17 sayfa tam olarak aynı puanda toplanmıştı, çünkü bu cezanın üst sınırı do</w:t>
-      </w:r>
-      <w:r>
-        <w:t>luyordu. Yani tek bir sinyal kararı sürüklüyor ve puanlar kademeli bir dağılım yerine tek bir noktada yığılıyordu.</w:t>
+        <w:t>T</w:t>
+      </w:r>
+      <w:r>
+        <w:t>am şekil vetosu isabeti biraz artırdı, fakat benchmark'ta iki gerçek tabloyu kaçırdı. Yalnız pdf-inspector ve geometrik kuralın aynı anda tablo dediği yüksek güvenli seçenek de daha temiz sonuç üretirken yakalamayı belirgin biçimde düşürdü.</w:t>
       </w:r>
     </w:p>
     <w:p>
@@ -6170,24 +6341,11 @@
         </w:rPr>
       </w:pPr>
       <w:r>
-        <w:t>Bu nedenle karar, birbirinden bağımsız sorulara ayrıldı. Sayfada metin katmanı var mı, tablo işareti var mı, şekil veya grafik bulunuyor mu v</w:t>
-      </w:r>
-      <w:r>
-        <w:t>e hızlı metinde belirgin bozulma görülüyor mu? OCR gereksinimi kesin bir kurala bağlandı. Tablo ve şekil sinyalleri ayrı tutuldu. Birleşik kalite puanı tamamen atılmadı, fakat ana kapı olmaktan çıkarılıp ikincil önceliklendirme ve çıktı denetimi görevine i</w:t>
-      </w:r>
-      <w:r>
-        <w:t>ndirildi.</w:t>
-      </w:r>
-    </w:p>
-    <w:p>
-      <w:pPr>
-        <w:pStyle w:val="Balk2"/>
-      </w:pPr>
-      <w:bookmarkStart w:id="15" w:name="_Toc238549447"/>
-      <w:r>
-        <w:t>4.5 OCR kararı</w:t>
-      </w:r>
-      <w:bookmarkEnd w:id="15"/>
+        <w:t>Bir tabloyu büt</w:t>
+      </w:r>
+      <w:r>
+        <w:t>ünüyle kaçırmak, tablo olmayan bir sayfayı gereksiz yere Docling'e göndermekten daha riskli kabul edildi. Bu nedenle yüksek yakalamayı koruyan hibrit kural sürdürüldü. Bu tercih teknik bir zorunluluktan çok sistem davranışına ilişkin bir önceliktir.</w:t>
+      </w:r>
     </w:p>
     <w:p>
       <w:pPr>
@@ -6196,10 +6354,10 @@
         </w:rPr>
       </w:pPr>
       <w:r>
-        <w:t xml:space="preserve">Metin katmanı bulunmayan sayfalar puana bakılmadan ağır yola alınıyor. Bu ayrım önemlidir; boş veya birkaç karakterlik hızlı çıktı, düşük puanlı normal metinle aynı sorun değildir. OCR gereksinimi belirli olduğunda eşik </w:t>
-      </w:r>
-      <w:r>
-        <w:t>taramak yerine doğrudan kural kullanmak daha güvenilir sonuç verdi.</w:t>
+        <w:t xml:space="preserve">Şekil </w:t>
+      </w:r>
+      <w:r>
+        <w:t>sinyalinde vektörel çizim kümeleri ile gömülü raster görseller birlikte değerlendirildi. Yakalama yerel korpusta 0,63'ten, benchmark'ta 0,76'dan 0,99'a çıktı. Bunun karşılığında isabet sırasıyla 0,92'den 0,69'a ve 0,82'den 0,62'ye düştü.</w:t>
       </w:r>
     </w:p>
     <w:p>
@@ -6209,121 +6367,10 @@
         </w:rPr>
       </w:pPr>
       <w:r>
-        <w:t>Yerel korpustaki OCR örneği sentetik olduğu için bu bulgu gerçek saha taramalarının tamamına genellenemez. Ayrıca OCRTurk belgelerinin tamamı tek sayfa. Dolayısıyla taranmış çok sayfalı be</w:t>
-      </w:r>
-      <w:r>
-        <w:t>lgelerde sayfa birleştirme, devam eden cümleler ve tekrarlanan üstbilgiler hâlâ bağımsız bir referans kümesiyle sınanmış değil.</w:t>
-      </w:r>
-    </w:p>
-    <w:p>
-      <w:pPr>
-        <w:rPr>
-          <w:rFonts w:hint="eastAsia"/>
-        </w:rPr>
-      </w:pPr>
-      <w:r>
-        <w:t xml:space="preserve">Bu noktada PyMuPDF kütüphanesi ayrı bir rol üstleniyor. PyMuPDF raporun başındaki parser karşılaştırmasına aday olarak girmedi; </w:t>
-      </w:r>
-      <w:r>
-        <w:t>metin çıkarma kalitesi için değil, sayfanın geometrisini okumak için kullanılıyor. Sayfadaki çizgileri, dolu dikdörtgenleri, vektörel çizim kümelerini ve gömülü görselleri hızlıca sayabiliyor. Kapının tablo ve şekil sorularını cevaplamasını sağlayan ölçüml</w:t>
-      </w:r>
-      <w:r>
-        <w:t>er bu kütüphaneden geliyor ve maliyeti sayfa başına milisaniye düzeyinde kalıyor.</w:t>
-      </w:r>
-    </w:p>
-    <w:p>
-      <w:pPr>
-        <w:pStyle w:val="Balk2"/>
-      </w:pPr>
-      <w:bookmarkStart w:id="16" w:name="_Toc238549448"/>
-      <w:r>
-        <w:t>4.6 Tablo sinyalinin geliştirilmesi</w:t>
-      </w:r>
-      <w:bookmarkEnd w:id="16"/>
-    </w:p>
-    <w:p>
-      <w:pPr>
-        <w:rPr>
-          <w:rFonts w:hint="eastAsia"/>
-        </w:rPr>
-      </w:pPr>
-      <w:r>
-        <w:t>Tablo tespiti, ağır motor kararını en doğrudan etkileyen sinyallerden biri oldu. İlk hibrit yaklaşım, pdf-inspector'ın tablo tahmini ile P</w:t>
-      </w:r>
-      <w:r>
-        <w:t>yMuPDF üzerinden çıkarılan çizgi, kutu ve ızgara işaretlerini OR kuralıyla birleştirdi. Düzeltme öncesinde yerel korpusta isabet 0,551, yakalama 0,929; 200 sayfalık benchmark'ta isabet 0,506, yakalama 0,976 idi. Başka bir deyişle gerçek tabloların büyük bö</w:t>
-      </w:r>
-      <w:r>
-        <w:t>lümü yakalanıyor, fakat tablo olmayan birçok sayfa da ağır yola gidiyordu.</w:t>
-      </w:r>
-    </w:p>
-    <w:p>
-      <w:pPr>
-        <w:rPr>
-          <w:rFonts w:hint="eastAsia"/>
-        </w:rPr>
-      </w:pPr>
-      <w:r>
-        <w:t>Yanlış pozitifler incelendiğinde büyük grafik ve diyagramların önemli bir kaynak olduğu görüldü. Özellikle çok panelli şekillerde ortogonal çizgi sayısı binlere çıkabiliyordu. Basit</w:t>
-      </w:r>
-      <w:r>
-        <w:t xml:space="preserve"> kural bu yoğunluğu tablo ızgarası sanıyordu. Büyük şekil alanlarında ortogonal çizgi sinyali bastırıldı ve dolu dikdörtgen eşiği güncellendi. Düzeltme sonrasında yerel korpusta isabet 0,637'ye yükselirken yakalama 0,929'da kaldı. Benchmark tarafında isabe</w:t>
-      </w:r>
-      <w:r>
-        <w:t>t 0,556'ya yükseldi, yakalama 0,952'ye geriledi.</w:t>
-      </w:r>
-    </w:p>
-    <w:p>
-      <w:pPr>
-        <w:rPr>
-          <w:rFonts w:hint="eastAsia"/>
-        </w:rPr>
-      </w:pPr>
-      <w:r>
-        <w:lastRenderedPageBreak/>
-        <w:t>Tam şekil vetosu isabeti biraz artırdı, fakat benchmark'ta iki gerçek tabloyu kaçırdı. Yalnız pdf-inspector ve geometrik kuralın aynı anda tablo dediği yüksek güvenli seçenek de daha temiz sonuç üretirken ya</w:t>
-      </w:r>
-      <w:r>
-        <w:t>kalamayı belirgin biçimde düşürdü.</w:t>
-      </w:r>
-    </w:p>
-    <w:p>
-      <w:pPr>
-        <w:rPr>
-          <w:rFonts w:hint="eastAsia"/>
-        </w:rPr>
-      </w:pPr>
-      <w:r>
-        <w:t>Bir tabloyu bütünüyle kaçırmak, tablo olmayan bir sayfayı gereksiz yere Docling'e göndermekten daha riskli kabul edildi. Bu nedenle yüksek yakalamayı koruyan hibrit kural sürdürüldü. Bu tercih teknik bir zorunluluktan çok</w:t>
-      </w:r>
-      <w:r>
-        <w:t xml:space="preserve"> sistem davranışına ilişkin bir önceliktir.</w:t>
-      </w:r>
-    </w:p>
-    <w:p>
-      <w:pPr>
-        <w:rPr>
-          <w:rFonts w:hint="eastAsia"/>
-        </w:rPr>
-      </w:pPr>
-      <w:r>
-        <w:t>Şekil sinyalinde vektörel çizim kümeleri ile gömülü raster görseller birlikte değerlendirildi. Yakalama yerel korpusta 0,63'ten, benchmark'ta 0,76'dan 0,99'a çıktı. Bunun karşılığında isabet sırasıyla 0,92'den 0,</w:t>
-      </w:r>
-      <w:r>
-        <w:t>69'a ve 0,82'den 0,62'ye düştü.</w:t>
-      </w:r>
-    </w:p>
-    <w:p>
-      <w:pPr>
-        <w:rPr>
-          <w:rFonts w:hint="eastAsia"/>
-        </w:rPr>
-      </w:pPr>
-      <w:r>
-        <w:t>Yeni kural şekilli sayfaların neredeyse tamamını buluyor, ancak bazı şekilsiz sayfaları da işaretliyor. Yalnız şekil sinyaline dayanan denemede sayfaların çok büyük bölümü ağır yola düştüğü için bu sinyal tek başına yönlendi</w:t>
-      </w:r>
-      <w:r>
-        <w:t>rme gerekçesi yapılmadı.</w:t>
+        <w:t>Yeni kural şekilli</w:t>
+      </w:r>
+      <w:r>
+        <w:t xml:space="preserve"> sayfaların neredeyse tamamını buluyor, ancak bazı şekilsiz sayfaları da işaretliyor. Yalnız şekil sinyaline dayanan denemede sayfaların çok büyük bölümü ağır yola düştüğü için bu sinyal tek başına yönlendirme gerekçesi yapılmadı.</w:t>
       </w:r>
     </w:p>
     <w:p>
@@ -6355,10 +6402,10 @@
         <w:t>pypdfium2</w:t>
       </w:r>
       <w:r>
-        <w:t xml:space="preserve"> şekil işaretleri üretse de tabloyu güvenilir biçimde bulamadı. Metinde “Table 2” veya “F</w:t>
-      </w:r>
-      <w:r>
-        <w:t>igure 3” gibi başlıklar aramak yardımcı oldu, ancak başlıksız nesneleri yakalayamadı.</w:t>
+        <w:t xml:space="preserve"> şekil işaretleri üretse de tabloyu güvenilir biçimde bulamadı. Metinde “Table 2” veya “Figure 3” gibi başlıklar a</w:t>
+      </w:r>
+      <w:r>
+        <w:t>ramak yardımcı oldu, ancak başlıksız nesneleri yakalayamadı.</w:t>
       </w:r>
     </w:p>
     <w:p>
@@ -6368,17 +6415,17 @@
         </w:rPr>
       </w:pPr>
       <w:r>
-        <w:t xml:space="preserve">Sayfanın tamamını görüntüye çevirerek nesne tespiti yapmak hızlı kapının maliyet avantajını azaltıyordu. Bulut tabanlı seçenekler ise belgenin dış sisteme gönderilmesini </w:t>
-      </w:r>
-      <w:r>
-        <w:t>gerektirdiği için uygulanmadı.</w:t>
+        <w:t>Sayfanın tamamını görüntüye çevirerek nesne tespiti yapmak hızlı kapının maliyet avantajını azaltıyordu. Bulut tabanlı seçenekler ise belgenin dış sisteme gönderilmesini gerektirdiği için uygulan</w:t>
+      </w:r>
+      <w:r>
+        <w:t>madı.</w:t>
       </w:r>
     </w:p>
     <w:p>
       <w:pPr>
         <w:pStyle w:val="Balk2"/>
       </w:pPr>
-      <w:bookmarkStart w:id="17" w:name="_Toc238549449"/>
+      <w:bookmarkStart w:id="17" w:name="_Toc238555627"/>
       <w:r>
         <w:t>4.7 Hazır tablo tespit modelleri</w:t>
       </w:r>
@@ -6391,10 +6438,10 @@
         </w:rPr>
       </w:pPr>
       <w:r>
-        <w:t>Kural tabanlı yöntemin düşük isabeti, hazır nesne tespit modellerinin ikinci bir seçenek olarak değerlendirilmesine yol açtı. YOLOv8s, Table Transformer ve PicoDet aynı veri ailelerinde karşıl</w:t>
-      </w:r>
-      <w:r>
-        <w:t>aştırıldı. Sonuçlar yalnız doğruluğun değil, lisans, hız ve korpuslar arası tutarlılığın da seçimde önemli olduğunu gösterdi.</w:t>
+        <w:t>Kural tabanlı yöntemin düşük isabeti, hazır nesne tespit modellerinin ikinci bir seçenek olarak değerlendirilmesine yol açtı. YOLOv8s, Table Transformer ve PicoDet aynı veri ailelerinde karşılaştırıldı. Sonuçlar yalnı</w:t>
+      </w:r>
+      <w:r>
+        <w:t>z doğruluğun değil, lisans, hız ve korpuslar arası tutarlılığın da seçimde önemli olduğunu gösterdi.</w:t>
       </w:r>
     </w:p>
     <w:p>
@@ -6404,10 +6451,10 @@
         </w:rPr>
       </w:pPr>
       <w:r>
-        <w:t>Bu üç modelin hiçbiri bugünkü yönlendirme hattında çalışmıyor. Ölçümler ayrı bir değerlendirme koşusu olarak yapıldı ve sonuçlar k</w:t>
-      </w:r>
-      <w:r>
-        <w:t>arşılaştırma amacıyla kaydedildi; üretim koduna eklenen bir model yok. Tablo sinyali bugün hâlâ kural tabanlı hibrit yöntemle üretiliyor.</w:t>
+        <w:t>Bu üç modelin hiçbiri bugünkü yönlendirme hattında çalışmıyor. Ölçümler ayrı bir değerlendirme koşusu olarak yapıldı ve sonuçlar karşılaştırma amacıyla kay</w:t>
+      </w:r>
+      <w:r>
+        <w:t>dedildi; üretim koduna eklenen bir model yok. Tablo sinyali bugün hâlâ kural tabanlı hibrit yöntemle üretiliyor.</w:t>
       </w:r>
     </w:p>
     <w:p>
@@ -6522,7 +6569,15 @@
                 <w:color w:val="FFFFFF"/>
                 <w:sz w:val="18"/>
               </w:rPr>
-              <w:t>Ortalama süre</w:t>
+              <w:t xml:space="preserve">Ortalama </w:t>
+            </w:r>
+            <w:r>
+              <w:rPr>
+                <w:b/>
+                <w:color w:val="FFFFFF"/>
+                <w:sz w:val="18"/>
+              </w:rPr>
+              <w:t>süre</w:t>
             </w:r>
           </w:p>
         </w:tc>
@@ -6698,6 +6753,7 @@
               <w:rPr>
                 <w:sz w:val="18"/>
               </w:rPr>
+              <w:lastRenderedPageBreak/>
               <w:t>Table Transformer</w:t>
             </w:r>
           </w:p>
@@ -6779,13 +6835,13 @@
               <w:rPr>
                 <w:sz w:val="18"/>
               </w:rPr>
-              <w:t xml:space="preserve">Açık </w:t>
+              <w:t xml:space="preserve">Açık lisanslı; belirsiz </w:t>
             </w:r>
             <w:r>
               <w:rPr>
                 <w:sz w:val="18"/>
               </w:rPr>
-              <w:t>lisanslı; belirsiz sayfalarda ikinci görüş adayı</w:t>
+              <w:t>sayfalarda ikinci görüş adayı</w:t>
             </w:r>
           </w:p>
         </w:tc>
@@ -7013,7 +7069,13 @@
               <w:rPr>
                 <w:sz w:val="18"/>
               </w:rPr>
-              <w:t>Varsayılan hızlı sinyal olarak korundu</w:t>
+              <w:t xml:space="preserve">Varsayılan hızlı sinyal </w:t>
+            </w:r>
+            <w:r>
+              <w:rPr>
+                <w:sz w:val="18"/>
+              </w:rPr>
+              <w:t>olarak korundu</w:t>
             </w:r>
           </w:p>
         </w:tc>
@@ -7034,10 +7096,10 @@
         </w:rPr>
       </w:pPr>
       <w:r>
-        <w:t xml:space="preserve">Model eşikleri aynı değerlendirme kümelerinde incelendiği için sonuçlar bağımsız üretim kanıtı sayılmadı. Tablo ve Şekil 2'de Table Transformer için aynı 0,995 eşiği kullanıldı. YOLO en yüksek F1 değerini </w:t>
-      </w:r>
-      <w:r>
-        <w:t>verdi, ancak kullanılan ağırlığın lisansı ve Ultralytics kullanım koşulları ayrıca değerlendirme gerektirdiği için doğrudan üretim adayı yapılmadı.</w:t>
+        <w:t xml:space="preserve">Model eşikleri aynı değerlendirme kümelerinde incelendiği için sonuçlar bağımsız üretim kanıtı sayılmadı. Tablo ve Şekil 2'de Table Transformer için aynı 0,995 eşiği kullanıldı. YOLO en yüksek F1 değerini verdi, ancak kullanılan </w:t>
+      </w:r>
+      <w:r>
+        <w:t>ağırlığın lisansı ve Ultralytics kullanım koşulları ayrıca değerlendirme gerektirdiği için doğrudan üretim adayı yapılmadı.</w:t>
       </w:r>
     </w:p>
     <w:p>
@@ -7047,13 +7109,12 @@
         </w:rPr>
       </w:pPr>
       <w:r>
-        <w:lastRenderedPageBreak/>
-        <w:t>Table Transformer daha yavaş olmasına rağmen açık lisansı ve korpuslar arası daha tutarlı sonucu nedeniyle b</w:t>
-      </w:r>
-      <w:r>
-        <w:t xml:space="preserve">elirsiz sayfalarda ikinci görüş için daha uygulanabilir bulundu. PicoDet'in hız avantajı ise yerel korpustaki kalite kaybını karşılamadı. Kaynak kod depoları: </w:t>
-      </w:r>
-      <w:hyperlink r:id="rId9">
+        <w:t>Table Transformer daha yavaş olmasına rağmen açık lisansı ve korpuslar arası daha tutarlı sonucu nedeniyle belirsiz sayfalarda ikinc</w:t>
+      </w:r>
+      <w:r>
+        <w:t xml:space="preserve">i görüş için daha uygulanabilir bulundu. PicoDet'in hız avantajı ise yerel korpustaki kalite kaybını karşılamadı. Kaynak kod depoları: </w:t>
+      </w:r>
+      <w:hyperlink r:id="rId10">
         <w:r>
           <w:rPr>
             <w:color w:val="207B79"/>
@@ -7063,12 +7124,9 @@
         </w:r>
       </w:hyperlink>
       <w:r>
-        <w:t xml:space="preserve"> ve </w:t>
-      </w:r>
-      <w:r>
-        <w:t xml:space="preserve">denemede kullanılan </w:t>
-      </w:r>
-      <w:hyperlink r:id="rId10">
+        <w:t xml:space="preserve"> ve denemede kullanılan </w:t>
+      </w:r>
+      <w:hyperlink r:id="rId11">
         <w:r>
           <w:rPr>
             <w:color w:val="207B79"/>
@@ -7094,7 +7152,7 @@
           <w:noProof/>
         </w:rPr>
         <w:drawing>
-          <wp:inline distT="0" distB="0" distL="0" distR="0" wp14:anchorId="6C3ED422" wp14:editId="415D0567">
+          <wp:inline distT="0" distB="0" distL="0" distR="0" wp14:anchorId="3CA70298" wp14:editId="6E1B6791">
             <wp:extent cx="5940000" cy="2915423"/>
             <wp:effectExtent l="0" t="0" r="0" b="0"/>
             <wp:docPr id="2" name="Picture 2"/>
@@ -7109,7 +7167,7 @@
                     <pic:cNvPicPr/>
                   </pic:nvPicPr>
                   <pic:blipFill>
-                    <a:blip r:embed="rId11"/>
+                    <a:blip r:embed="rId12"/>
                     <a:stretch>
                       <a:fillRect/>
                     </a:stretch>
@@ -7138,17 +7196,17 @@
         </w:rPr>
       </w:pPr>
       <w:r>
-        <w:t>Şekil 2. Table Transformer ile mevcut hibrit kuralın üç veri grubundaki isabet ve yakalama karşılaştırması. Table Transformer için 0,995 eşiğ</w:t>
-      </w:r>
-      <w:r>
-        <w:t>i kullanılmıştır. Model daha yüksek isabet, mevcut kural ise daha yüksek yakalama sağlamaktadır.</w:t>
+        <w:t xml:space="preserve">Şekil 2. Table Transformer ile mevcut hibrit kuralın üç veri grubundaki isabet ve yakalama karşılaştırması. Table Transformer için 0,995 eşiği kullanılmıştır. Model </w:t>
+      </w:r>
+      <w:r>
+        <w:t>daha yüksek isabet, mevcut kural ise daha yüksek yakalama sağlamaktadır.</w:t>
       </w:r>
     </w:p>
     <w:p>
       <w:pPr>
         <w:pStyle w:val="Balk2"/>
       </w:pPr>
-      <w:bookmarkStart w:id="18" w:name="_Toc238549450"/>
+      <w:bookmarkStart w:id="18" w:name="_Toc238555628"/>
       <w:r>
         <w:t>4.8 Ağır çıktıyı denetleme</w:t>
       </w:r>
@@ -7161,10 +7219,10 @@
         </w:rPr>
       </w:pPr>
       <w:r>
-        <w:t>Bir sayfanın ağır motora gönderilmesi, ağır çıktının mutlaka daha iyi olduğu anlamına gelmiyor. Bazı sayfalarda Docling tablo yapısı</w:t>
-      </w:r>
-      <w:r>
-        <w:t>nı düzeltiyor, bazılarında ise metnin bir bölümünü kaybedebiliyor veya okuma sırasını bozabiliyor. Bu nedenle hızlı ve ağır çıktı için bozulma sinyalleri hesaplanıyor. Ağır sonuç belirgin biçimde daha kötü görünüyorsa hızlı çıktı korunuyor.</w:t>
+        <w:t xml:space="preserve">Bir sayfanın ağır motora gönderilmesi, ağır çıktının mutlaka daha iyi olduğu anlamına gelmiyor. Bazı sayfalarda Docling tablo yapısını </w:t>
+      </w:r>
+      <w:r>
+        <w:t>düzeltiyor, bazılarında ise metnin bir bölümünü kaybedebiliyor veya okuma sırasını bozabiliyor. Bu nedenle hızlı ve ağır çıktı için bozulma sinyalleri hesaplanıyor. Ağır sonuç belirgin biçimde daha kötü görünüyorsa hızlı çıktı korunuyor.</w:t>
       </w:r>
     </w:p>
     <w:p>
@@ -7174,13 +7232,13 @@
         </w:rPr>
       </w:pPr>
       <w:r>
-        <w:t>Denetimin nasıl</w:t>
-      </w:r>
-      <w:r>
-        <w:t xml:space="preserve"> çalıştığını anlamak, neden sınırlı olduğunu da açıklıyor. Üretimde referans metin yok; sistemin elinde yalnız iki aday çıktı bulunuyor. Bu yüzden karar, iki metnin birbirine göre daha doğru olup olmadığına değil, her birinin kendi içinde ne kadar bozuk gö</w:t>
-      </w:r>
-      <w:r>
-        <w:t>ründüğüne bakarak veriliyor. Ölçülen şey esas olarak anlamsız karakter dizileri ve olağandışı sembol yoğunluğu. Ağır çıktının bozulma skoru hızlı çıktınınkinden belirgin biçimde kötüyse sayfa reddediliyor ve hızlı metin korunuyor.</w:t>
+        <w:t>Denetimin nasıl ça</w:t>
+      </w:r>
+      <w:r>
+        <w:t>lıştığını anlamak, neden sınırlı olduğunu da açıklıyor. Üretimde referans metin yok; sistemin elinde yalnız iki aday çıktı bulunuyor. Bu yüzden karar, iki metnin birbirine göre daha doğru olup olmadığına değil, her birinin kendi içinde ne kadar bozuk görün</w:t>
+      </w:r>
+      <w:r>
+        <w:t>düğüne bakarak veriliyor. Ölçülen şey esas olarak anlamsız karakter dizileri ve olağandışı sembol yoğunluğu. Ağır çıktının bozulma skoru hızlı çıktınınkinden belirgin biçimde kötüyse sayfa reddediliyor ve hızlı metin korunuyor.</w:t>
       </w:r>
     </w:p>
     <w:p>
@@ -7190,10 +7248,11 @@
         </w:rPr>
       </w:pPr>
       <w:r>
-        <w:t>Bu yaklaşımın bir kör nok</w:t>
-      </w:r>
-      <w:r>
-        <w:t>tası var: Docling tabloyu düzgün çıkarıp metnin yarısını atarsa kalan bölüm temiz görünebilir ve bozulma skoru sorunu fark etmeyebilir. Bu nedenle karşılaştırmaya iki kritik red kuralı eklendi.</w:t>
+        <w:lastRenderedPageBreak/>
+        <w:t>Bu yaklaşımın bir kör noktas</w:t>
+      </w:r>
+      <w:r>
+        <w:t>ı var: Docling tabloyu düzgün çıkarıp metnin yarısını atarsa kalan bölüm temiz görünebilir ve bozulma skoru sorunu fark etmeyebilir. Bu nedenle karşılaştırmaya iki kritik red kuralı eklendi.</w:t>
       </w:r>
     </w:p>
     <w:p>
@@ -7203,10 +7262,10 @@
         </w:rPr>
       </w:pPr>
       <w:r>
-        <w:t>İlk kural Docling bir formülü çözemeyip yerine işaret bıraktığ</w:t>
-      </w:r>
-      <w:r>
-        <w:t>ında, ikincisi ağır çıktı hızlı çıktıya göre belirgin biçimde kısaldığında devreye giriyor. Uzunluk kuralı, içeriğin yaklaşık yarısı kaybolduğu halde temiz görünen bir çıktının kabul edildiği gerçek vakadan sonra eklendi.</w:t>
+        <w:t>İlk kural Docling bir formülü çözemeyip yerine işaret bıraktığınd</w:t>
+      </w:r>
+      <w:r>
+        <w:t>a, ikincisi ağır çıktı hızlı çıktıya göre belirgin biçimde kısaldığında devreye giriyor. Uzunluk kuralı, içeriğin yaklaşık yarısı kaybolduğu halde temiz görünen bir çıktının kabul edildiği gerçek vakadan sonra eklendi.</w:t>
       </w:r>
     </w:p>
     <w:p>
@@ -7216,10 +7275,10 @@
         </w:rPr>
       </w:pPr>
       <w:r>
-        <w:t>Ölçüm sırasında bulunan bir yan et</w:t>
-      </w:r>
-      <w:r>
-        <w:t>ki de düzeltildi: bozulma sayacı matematik sembollerini anlamsız karakter sayıyordu. Formül içeren sayfalar bu yüzden haksız yere cezalandırılıyordu. Sayaç, matematik sembollerini meşru kabul edecek biçimde genişletildi.</w:t>
+        <w:t xml:space="preserve">Ölçüm sırasında bulunan bir yan etki </w:t>
+      </w:r>
+      <w:r>
+        <w:t>de düzeltildi: bozulma sayacı matematik sembollerini anlamsız karakter sayıyordu. Formül içeren sayfalar bu yüzden haksız yere cezalandırılıyordu. Sayaç, matematik sembollerini meşru kabul edecek biçimde genişletildi.</w:t>
       </w:r>
     </w:p>
     <w:p>
@@ -7229,22 +7288,21 @@
         </w:rPr>
       </w:pPr>
       <w:r>
-        <w:t>Bütün bu düzeltmelere rağmen deneti</w:t>
-      </w:r>
-      <w:r>
-        <w:t>m gerçek faydayı doğrudan ölçmüyor. Kalibrasyon sırasında skorun referansa göre gerçek fayda ile zayıf ilişkili olduğu görüldü. Dolayısıyla red denetimi bugün gerekli bir koruma sağlıyor, fakat nihai çözüm değil. Beşinci bölüm bu sınıra ve ölçülen sonuçlar</w:t>
-      </w:r>
-      <w:r>
-        <w:t>a ayrılıyor.</w:t>
+        <w:t>Bütün bu düzeltmelere rağmen denetim g</w:t>
+      </w:r>
+      <w:r>
+        <w:t>erçek faydayı doğrudan ölçmüyor. Kalibrasyon sırasında skorun referansa göre gerçek fayda ile zayıf ilişkili olduğu görüldü. Dolayısıyla red denetimi bugün gerekli bir koruma sağlıyor, fakat nihai çözüm değil. Beşinci bölüm bu sınıra ve ölçülen sonuçlara a</w:t>
+      </w:r>
+      <w:r>
+        <w:t>yrılıyor.</w:t>
       </w:r>
     </w:p>
     <w:p>
       <w:pPr>
         <w:pStyle w:val="Balk2"/>
       </w:pPr>
-      <w:bookmarkStart w:id="19" w:name="_Toc238549451"/>
-      <w:r>
-        <w:lastRenderedPageBreak/>
+      <w:bookmarkStart w:id="19" w:name="_Toc238555629"/>
+      <w:r>
         <w:t>4.9 Kaynakla doğrulanan ligatür düzeltmesi</w:t>
       </w:r>
       <w:bookmarkEnd w:id="19"/>
@@ -7278,10 +7336,10 @@
         <w:t>fl</w:t>
       </w:r>
       <w:r>
-        <w:t xml:space="preserve"> birleşimleri tek bir ligatür karakteri olarak saklanıyor. İncelenen sorunlu bir makalede hem hızlı hem ağır motor bu karakterlerin bir bölümünü eksik harf olarak çıkardı. Sorun HTML gösteriminden değil, parser çıktısının kendisinden kaynaklandığı için yal</w:t>
-      </w:r>
-      <w:r>
-        <w:t>nız arayüzü düzeltmek yeterli değildi.</w:t>
+        <w:t xml:space="preserve"> birleşimleri tek bir ligatür karakteri olarak saklanıyor. İncelenen sorunlu bir makalede hem hızlı hem ağır motor bu karakterlerin bir bölümünü eksik harf olarak çıka</w:t>
+      </w:r>
+      <w:r>
+        <w:t>rdı. Sorun HTML gösteriminden değil, parser çıktısının kendisinden kaynaklandığı için yalnız arayüzü düzeltmek yeterli değildi.</w:t>
       </w:r>
     </w:p>
     <w:p>
@@ -7291,7 +7349,10 @@
         </w:rPr>
       </w:pPr>
       <w:r>
-        <w:t xml:space="preserve">Birleştirmeden sonra çalışan düşük maliyetli bir koruma katmanı eklendi. Sistem olası kaybı kaynak PDF'deki sözcüklerle karşılaştırıyor; yalnız tek ve açık bir karşılık bulunduğunda </w:t>
+        <w:t>Birleştirmeden sonra çalışan düşük maliyetli bir koruma katmanı eklendi. Sistem olası kaybı kaynak PDF'deki sözcüklerle karşılaş</w:t>
+      </w:r>
+      <w:r>
+        <w:t xml:space="preserve">tırıyor; yalnız tek ve açık bir karşılık bulunduğunda </w:t>
       </w:r>
       <w:r>
         <w:rPr>
@@ -7313,10 +7374,7 @@
         <w:t>fl</w:t>
       </w:r>
       <w:r>
-        <w:t xml:space="preserve"> onarımı yapıyor. Belirsi</w:t>
-      </w:r>
-      <w:r>
-        <w:t>z durumda tahmin yürütmüyor.</w:t>
+        <w:t xml:space="preserve"> onarımı yapıyor. Belirsiz durumda tahmin yürütmüyor.</w:t>
       </w:r>
     </w:p>
     <w:p>
@@ -7326,17 +7384,17 @@
         </w:rPr>
       </w:pPr>
       <w:r>
-        <w:t>Sorunlu 43 sayfalık makalede 39 sayfadaki 344 kayıp düzeltildi ve belirsiz eşleşme oluşmadı. Ana 261 sayfalık korpusta ligatür kaybı görülmedi; dolayısıyla sorun bütün PDF'lere genellenmedi. Ek maliyet sorunlu makalede yaklaşık</w:t>
-      </w:r>
-      <w:r>
-        <w:t xml:space="preserve"> 1,78 ms/sayfa düzeyinde kaldı.</w:t>
+        <w:t>Sorunlu 43 sayfalık makalede 39 sayfadaki 344 kayıp düzeltildi ve belirsiz eşleşme oluşmadı. Ana 261 sayfalık korpusta ligatür kaybı görül</w:t>
+      </w:r>
+      <w:r>
+        <w:t>medi; dolayısıyla sorun bütün PDF'lere genellenmedi. Ek maliyet sorunlu makalede yaklaşık 1,78 ms/sayfa düzeyinde kaldı.</w:t>
       </w:r>
     </w:p>
     <w:p>
       <w:pPr>
         <w:pStyle w:val="Balk2"/>
       </w:pPr>
-      <w:bookmarkStart w:id="20" w:name="_Toc238549452"/>
+      <w:bookmarkStart w:id="20" w:name="_Toc238555630"/>
       <w:r>
         <w:t>4.10 Güncel sistem akışı</w:t>
       </w:r>
@@ -7355,7 +7413,7 @@
           <w:noProof/>
         </w:rPr>
         <w:drawing>
-          <wp:inline distT="0" distB="0" distL="0" distR="0" wp14:anchorId="28A5244D" wp14:editId="626E5651">
+          <wp:inline distT="0" distB="0" distL="0" distR="0" wp14:anchorId="2C612A86" wp14:editId="26A93278">
             <wp:extent cx="5940000" cy="3225301"/>
             <wp:effectExtent l="0" t="0" r="0" b="0"/>
             <wp:docPr id="3" name="Picture 3"/>
@@ -7370,7 +7428,7 @@
                     <pic:cNvPicPr/>
                   </pic:nvPicPr>
                   <pic:blipFill>
-                    <a:blip r:embed="rId12"/>
+                    <a:blip r:embed="rId13"/>
                     <a:stretch>
                       <a:fillRect/>
                     </a:stretch>
@@ -7399,10 +7457,10 @@
         </w:rPr>
       </w:pPr>
       <w:r>
-        <w:t>Şekil 3. Güncel sayfa düzeyi karar akışı. Hızlı çıktı bir kez üretilir; yalnız işaretli sayfalar ağır motora gider, ağır çıktı denetlenir, sonuçlar birleştirilir ve kaynakla doğrulanan ligatür düze</w:t>
-      </w:r>
-      <w:r>
-        <w:t>ltmesinden sonra nihai belge oluşturulur.</w:t>
+        <w:t>Şekil 3. Güncel sayfa düzeyi karar akışı. Hızlı çıktı bir kez üretilir; yalnız işaretli sayfalar ağır motora</w:t>
+      </w:r>
+      <w:r>
+        <w:t xml:space="preserve"> gider, ağır çıktı denetlenir, sonuçlar birleştirilir ve kaynakla doğrulanan ligatür düzeltmesinden sonra nihai belge oluşturulur.</w:t>
       </w:r>
     </w:p>
     <w:p>
@@ -7412,10 +7470,11 @@
         </w:rPr>
       </w:pPr>
       <w:r>
-        <w:t>Güncel akışta PDF önce pdf-inspector ile sayfa sayfa çıkarılıyor. Her sayfa için OCR gereksinimi, tablo, şekil ve metin kalitesi sinyalleri üretiliyor. OCR gereken sayfalar kesin biçimde ağır yola alınıyor. Diğer s</w:t>
-      </w:r>
-      <w:r>
-        <w:t>inyaller Docling'e gönderilecek aday sayfaları belirliyor. Birbirine bitişik ağır sayfalar mümkün olduğunda aynı işlem grubunda ele alınıyor.</w:t>
+        <w:lastRenderedPageBreak/>
+        <w:t>Güncel akışta PDF önce pdf-inspector ile sayfa sayfa çıkarılıyor. Her sayfa için OCR gereksinimi, tablo, şekil ve metin kalit</w:t>
+      </w:r>
+      <w:r>
+        <w:t>esi sinyalleri üretiliyor. OCR gereken sayfalar kesin biçimde ağır yola alınıyor. Diğer sinyaller Docling'e gönderilecek aday sayfaları belirliyor. Birbirine bitişik ağır sayfalar mümkün olduğunda aynı işlem grubunda ele alınıyor.</w:t>
       </w:r>
     </w:p>
     <w:p>
@@ -7425,10 +7484,10 @@
         </w:rPr>
       </w:pPr>
       <w:r>
-        <w:t>Docling sonucu hızlı sonuçla karşılaştırılıyor. Ağır çıktı belirgin biçimde bozulmuşsa hızlı metin korunuyor. Sayf</w:t>
-      </w:r>
-      <w:r>
-        <w:t xml:space="preserve">alar birleştirildikten sonra seçilen metin kaynak PDF ile karşılaştırılarak yalnız doğrulanabilen </w:t>
+        <w:t>Docling sonucu hızlı sonu</w:t>
+      </w:r>
+      <w:r>
+        <w:t xml:space="preserve">çla karşılaştırılıyor. Ağır çıktı belirgin biçimde bozulmuşsa hızlı metin korunuyor. Sayfalar birleştirildikten sonra seçilen metin kaynak PDF ile karşılaştırılarak yalnız doğrulanabilen </w:t>
       </w:r>
       <w:r>
         <w:rPr>
@@ -7439,10 +7498,13 @@
         <w:t>fi/fl</w:t>
       </w:r>
       <w:r>
-        <w:t xml:space="preserve"> kayıpları onarılıyor; ardından sayfa başlıkları eklenerek nihai belge oluşturuluyor. Sayfa numarası, kullanılan motor, karar nedeni, ağır motor çalışmad</w:t>
-      </w:r>
-      <w:r>
-        <w:t>ığında kullanılan yedek dönüş, eşik sürümü ve işlem cihazı sonuçla birlikte taşınıyor. Platformun diğer parçaları bu ayrıntıları bilmek zorunda değil; Smart Router dışarıya tek parser arayüzü sunuyor.</w:t>
+        <w:t xml:space="preserve"> kayıpları onarılıyor; ardından sayfa başlıkları eklenerek nihai</w:t>
+      </w:r>
+      <w:r>
+        <w:t xml:space="preserve"> belge oluşturuluyor. Sayfa numarası, kullanılan motor, karar nedeni, ağır motor çalışmadığında kullanılan yedek dönüş, eşik sürümü ve işlem cihazı sonuçla birlikte taşınıyor. Platformun diğer parçaları bu ayrıntıları bilmek zorunda değil; Smart Router dış</w:t>
+      </w:r>
+      <w:r>
+        <w:t>arıya tek parser arayüzü sunuyor.</w:t>
       </w:r>
     </w:p>
     <w:p>
@@ -7452,10 +7514,7 @@
         </w:rPr>
       </w:pPr>
       <w:r>
-        <w:t>Güncel yerel ölçümde 261 sayfanın 146'sı hızlı yolda ka</w:t>
-      </w:r>
-      <w:r>
-        <w:t xml:space="preserve">ldı, 107'si Docling'e ve 8'i OCR yoluna seçildi. Bu dağılım daha eski </w:t>
+        <w:t xml:space="preserve">Güncel yerel ölçümde 261 sayfanın 146'sı hızlı yolda kaldı, 107'si Docling'e ve 8'i OCR yoluna seçildi. Bu dağılım daha eski </w:t>
       </w:r>
       <w:r>
         <w:rPr>
@@ -7466,7 +7525,10 @@
         <w:t>114 hızlı, 139 ağır, 8 OCR</w:t>
       </w:r>
       <w:r>
-        <w:t xml:space="preserve"> ölçümüyle aynı yapılandırmaya ait değil. Eski değer, ilk sayfa yönlendirme aşamasının tarihsel fotoğrafıdır; güncel sistemin sonucu olarak kullanılmamalıdır.</w:t>
+        <w:t xml:space="preserve"> ölçümüyle aynı yapılandırmaya ait değil. Eski değer, ilk sayfa yönlend</w:t>
+      </w:r>
+      <w:r>
+        <w:t>irme aşamasının tarihsel fotoğrafıdır; güncel sistemin sonucu olarak kullanılmamalıdır.</w:t>
       </w:r>
     </w:p>
     <w:p>
@@ -7476,17 +7538,10 @@
         </w:rPr>
       </w:pPr>
       <w:r>
-        <w:t>M</w:t>
-      </w:r>
-      <w:r>
-        <w:t xml:space="preserve">aliyet farkı bu tasarımın gerekçesini özetliyor: sayfa başına karar verme maliyeti milisaniye düzeyinde kalırken Docling'in bir sayfayı işlemesi CPU üzerinde saniye düzeyinde sürüyor. Cihaza </w:t>
-      </w:r>
-      <w:r>
-        <w:lastRenderedPageBreak/>
-        <w:t>göre yönlendirme kararının maliyeti, ağır motor maliyetinin yakla</w:t>
-      </w:r>
-      <w:r>
-        <w:t>şık 60 ile 285'te biri arasında kalıyor. Bu farkın donanıma göre nasıl değiştiği ve üç senaryonun toplam maliyeti Bölüm 6.3'te veriliyor.</w:t>
+        <w:t>Maliyet farkı bu tasarımın gerekçesini özetliyor: sayfa başına karar verme maliyeti milisaniye düzeyinde kalırken Docling'in bir sayfayı işlemesi CPU üzerinde saniye dü</w:t>
+      </w:r>
+      <w:r>
+        <w:t>zeyinde sürüyor. Cihaza göre yönlendirme kararının maliyeti, ağır motor maliyetinin yaklaşık 60 ile 285'te biri arasında kalıyor. Bu farkın donanıma göre nasıl değiştiği ve üç senaryonun toplam maliyeti Bölüm 6.3'te veriliyor.</w:t>
       </w:r>
     </w:p>
     <w:p>
@@ -7496,9 +7551,12 @@
           <w:bottom w:val="single" w:sz="8" w:space="5" w:color="207B79"/>
         </w:pBdr>
       </w:pPr>
-      <w:bookmarkStart w:id="21" w:name="_Toc238549453"/>
-      <w:r>
-        <w:t>5. Kalite Doğrulaması ve Güncel Yönlendirme Karnesi</w:t>
+      <w:bookmarkStart w:id="21" w:name="_Toc238555631"/>
+      <w:r>
+        <w:t>5. Kalite Doğrulaması ve Günc</w:t>
+      </w:r>
+      <w:r>
+        <w:t>el Yönlendirme Karnesi</w:t>
       </w:r>
       <w:bookmarkEnd w:id="21"/>
     </w:p>
@@ -7506,7 +7564,7 @@
       <w:pPr>
         <w:pStyle w:val="Balk2"/>
       </w:pPr>
-      <w:bookmarkStart w:id="22" w:name="_Toc238549454"/>
+      <w:bookmarkStart w:id="22" w:name="_Toc238555632"/>
       <w:r>
         <w:t>5.1 Yönlendirme kararını referansa göre ölçmek</w:t>
       </w:r>
@@ -7519,13 +7577,10 @@
         </w:rPr>
       </w:pPr>
       <w:r>
-        <w:t xml:space="preserve">Kapının tablo veya </w:t>
-      </w:r>
-      <w:r>
-        <w:t xml:space="preserve">şekli doğru bulması yalnız ara bir başarıdır. Asıl amaç, Docling'e gönderilen sayfada ağır çıktının hızlı çıktıdan daha yararlı olmasıdır. Bu nedenle C1 çalışmasında her belge için üç ayrı Markdown üretildi: pdf-inspector'ın hızlı çıktısı, Docling'in ağır </w:t>
-      </w:r>
-      <w:r>
-        <w:t>çıktısı ve router'ın seçtiği yönlendirilmiş çıktı. Üçü de referans Markdown ile aynı metrik üzerinden karşılaştırıldı.</w:t>
+        <w:t>Kapının tablo veya şekli doğru bulması yalnız ara bir başarıdır. Asıl amaç, Docling'e gönderilen sayfada ağır çıktının hızlı çıktıdan daha yararlı olmasıdır. Bu nedenle C1 çalışmasında h</w:t>
+      </w:r>
+      <w:r>
+        <w:t>er belge için üç ayrı Markdown üretildi: pdf-inspector'ın hızlı çıktısı, Docling'in ağır çıktısı ve router'ın seçtiği yönlendirilmiş çıktı. Üçü de referans Markdown ile aynı metrik üzerinden karşılaştırıldı.</w:t>
       </w:r>
     </w:p>
     <w:p>
@@ -7535,10 +7590,13 @@
         </w:rPr>
       </w:pPr>
       <w:r>
-        <w:t xml:space="preserve">İlk C1 kalite koşusu 180 OCRTurk ve 50 seçilmiş OpenDataLoader belgesini kapsadı. Daha sonraki eşik ve bileşen tekrarları, ağır </w:t>
-      </w:r>
-      <w:r>
-        <w:t>motor önbelleği bulunan 201 geçerli belgeli kalibrasyon alt kümesinde yapıldı. GPU koşusuyla önbellek tamamlandıktan sonra nihai politika 380 belgelik birleşik korpusun tamamında ölçüldü.</w:t>
+        <w:t xml:space="preserve">İlk C1 kalite koşusu 180 OCRTurk ve 50 </w:t>
+      </w:r>
+      <w:r>
+        <w:t>seçilmiş OpenDataLoader belgesini kapsadı. Daha sonraki eşik ve bileşen tekrarları, ağır motor önbelleği bulunan 201 geçerli belgeli kalibrasyon alt kümesinde yapıldı. GPU koşusuyla önbellek tamamlandıktan sonra nihai politika 380 belgelik birleşik korpusu</w:t>
+      </w:r>
+      <w:r>
+        <w:t>n tamamında ölçüldü.</w:t>
       </w:r>
     </w:p>
     <w:p>
@@ -7548,20 +7606,17 @@
         </w:rPr>
       </w:pPr>
       <w:r>
-        <w:t>Birleşik fayda puanı karakter benzerliği, kelime eşleşmesi ve yapısa</w:t>
-      </w:r>
-      <w:r>
-        <w:t>l benzerliği bir araya getiriyor. Hızlı veya ağır çıktının referansa daha yakın olduğunu sayısal olarak karşılaştırmaya yarıyor. Ancak anlamsal doğruluk yerine yüzey ve yapı benzerliğini ölçüyor. Özellikle formüller, karmaşık tablolar ve bağlama bağlı alın</w:t>
-      </w:r>
-      <w:r>
-        <w:t>tılar için nitel inceleme gereksinimi devam ediyor.</w:t>
+        <w:t>Birleşik fayda puanı karakter benzerliği, kelime eşleşmesi ve yapısal benzerliği bir araya getiriyor. Hızlı veya ağır çıktının referansa daha yakın olduğunu sayısal olarak karşılaştırmaya yarıyor. Ancak anlamsal doğruluk yerine yüzey v</w:t>
+      </w:r>
+      <w:r>
+        <w:t>e yapı benzerliğini ölçüyor. Özellikle formüller, karmaşık tablolar ve bağlama bağlı alıntılar için nitel inceleme gereksinimi devam ediyor.</w:t>
       </w:r>
     </w:p>
     <w:p>
       <w:pPr>
         <w:pStyle w:val="Balk2"/>
       </w:pPr>
-      <w:bookmarkStart w:id="23" w:name="_Toc238549455"/>
+      <w:bookmarkStart w:id="23" w:name="_Toc238555633"/>
       <w:r>
         <w:t>5.2 Veri ailelerine göre güncel sonuç</w:t>
       </w:r>
@@ -7574,10 +7629,10 @@
         </w:rPr>
       </w:pPr>
       <w:r>
-        <w:t>Docling önbelleğinin tamamlanmasıyla kalite koşusu 380 belgelik C1 korpusunun tamamına genişletildi. Güncel politika iki veri ailesinde farklı davrandı: OCRTurk taraf</w:t>
-      </w:r>
-      <w:r>
-        <w:t>ında pozitif net fayda üretirken OpenDataLoader örneklerinde toplam etki negatif kaldı.</w:t>
+        <w:t>Docling önbelleğinin tamamlanmasıyla kalite koşusu 380 belgelik C1 korpusunun</w:t>
+      </w:r>
+      <w:r>
+        <w:t xml:space="preserve"> tamamına genişletildi. Güncel politika iki veri ailesinde farklı davrandı: OCRTurk tarafında pozitif net fayda üretirken OpenDataLoader örneklerinde toplam etki negatif kaldı.</w:t>
       </w:r>
     </w:p>
     <w:p>
@@ -7592,8 +7647,9 @@
         <w:rPr>
           <w:noProof/>
         </w:rPr>
+        <w:lastRenderedPageBreak/>
         <w:drawing>
-          <wp:inline distT="0" distB="0" distL="0" distR="0" wp14:anchorId="3DF2520B" wp14:editId="14424A10">
+          <wp:inline distT="0" distB="0" distL="0" distR="0" wp14:anchorId="4401ECA0" wp14:editId="18DF9776">
             <wp:extent cx="5940000" cy="2912492"/>
             <wp:effectExtent l="0" t="0" r="0" b="0"/>
             <wp:docPr id="4" name="Picture 4"/>
@@ -7608,7 +7664,7 @@
                     <pic:cNvPicPr/>
                   </pic:nvPicPr>
                   <pic:blipFill>
-                    <a:blip r:embed="rId13"/>
+                    <a:blip r:embed="rId14"/>
                     <a:stretch>
                       <a:fillRect/>
                     </a:stretch>
@@ -7637,10 +7693,10 @@
         </w:rPr>
       </w:pPr>
       <w:r>
-        <w:t>Şekil 4. Güncel yönlendirme politikasının 380 belgelik tam örneklemde veri ailesi bazındaki sonucu. OCRTurk kümesinde pozitif net fayda görülürken OpenDataLoader örne</w:t>
-      </w:r>
-      <w:r>
-        <w:t>klerinde toplam etki negatiftir.</w:t>
+        <w:t>Şekil 4. Güncel yönlendirme politikasının 380 belgelik tam örneklemde veri ai</w:t>
+      </w:r>
+      <w:r>
+        <w:t>lesi bazındaki sonucu. OCRTurk kümesinde pozitif net fayda görülürken OpenDataLoader örneklerinde toplam etki negatiftir.</w:t>
       </w:r>
     </w:p>
     <w:p>
@@ -7784,7 +7840,15 @@
                 <w:color w:val="FFFFFF"/>
                 <w:sz w:val="18"/>
               </w:rPr>
-              <w:t>Toplam (380)</w:t>
+              <w:t>To</w:t>
+            </w:r>
+            <w:r>
+              <w:rPr>
+                <w:b/>
+                <w:color w:val="FFFFFF"/>
+                <w:sz w:val="18"/>
+              </w:rPr>
+              <w:t>plam (380)</w:t>
             </w:r>
           </w:p>
         </w:tc>
@@ -7931,7 +7995,6 @@
               <w:rPr>
                 <w:sz w:val="18"/>
               </w:rPr>
-              <w:lastRenderedPageBreak/>
               <w:t>Yönlendirme isabeti</w:t>
             </w:r>
           </w:p>
@@ -8376,20 +8439,20 @@
         </w:rPr>
       </w:pPr>
       <w:r>
-        <w:t xml:space="preserve">Bu farkı yalnız dile bağlamak doğru olmaz. OCRTurk akademik metin, tez, sunum ve akademik olmayan belgelerden dengeli </w:t>
-      </w:r>
-      <w:r>
-        <w:t>biçimde oluşturulmuş bir küme. OpenDataLoader örnekleri ise tek sayfalı, metin katmanı sağlam kıyaslama sayfaları ve hızlı yol bu belgelerde zaten güçlü. Sonuç, ortak eşiklerin farklı belge ailelerinde aynı davranmadığını gösteriyor; farkın ne kadarının di</w:t>
-      </w:r>
-      <w:r>
-        <w:t>l, belge türü veya referans biçiminden kaynaklandığını ayırmak için yeni bir deney gerekiyor.</w:t>
+        <w:t xml:space="preserve">Bu farkı yalnız dile bağlamak doğru </w:t>
+      </w:r>
+      <w:r>
+        <w:t>olmaz. OCRTurk akademik metin, tez, sunum ve akademik olmayan belgelerden dengeli biçimde oluşturulmuş bir küme. OpenDataLoader örnekleri ise tek sayfalı, metin katmanı sağlam kıyaslama sayfaları ve hızlı yol bu belgelerde zaten güçlü. Sonuç, ortak eşikler</w:t>
+      </w:r>
+      <w:r>
+        <w:t>in farklı belge ailelerinde aynı davranmadığını gösteriyor; farkın ne kadarının dil, belge türü veya referans biçiminden kaynaklandığını ayırmak için yeni bir deney gerekiyor.</w:t>
       </w:r>
     </w:p>
     <w:p>
       <w:pPr>
         <w:pStyle w:val="Balk2"/>
       </w:pPr>
-      <w:bookmarkStart w:id="24" w:name="_Toc238549456"/>
+      <w:bookmarkStart w:id="24" w:name="_Toc238555634"/>
       <w:r>
         <w:t>5.3 Kalibrasyonda kullanılan 201 belgeli alt küme</w:t>
       </w:r>
@@ -8402,7 +8465,10 @@
         </w:rPr>
       </w:pPr>
       <w:r>
-        <w:t>Tablo 5. Güncel politikanın geliştirilmesinde kullanılan 201 belgeli tekrar koşusu.</w:t>
+        <w:t>Tablo 5. Güncel politikanın ge</w:t>
+      </w:r>
+      <w:r>
+        <w:t>liştirilmesinde kullanılan 201 belgeli tekrar koşusu.</w:t>
       </w:r>
     </w:p>
     <w:tbl>
@@ -8509,13 +8575,7 @@
               <w:rPr>
                 <w:sz w:val="18"/>
               </w:rPr>
-              <w:t>Ge</w:t>
-            </w:r>
-            <w:r>
-              <w:rPr>
-                <w:sz w:val="18"/>
-              </w:rPr>
-              <w:t>çerli belge</w:t>
+              <w:t>Geçerli belge</w:t>
             </w:r>
           </w:p>
         </w:tc>
@@ -8995,6 +9055,7 @@
               <w:rPr>
                 <w:sz w:val="18"/>
               </w:rPr>
+              <w:lastRenderedPageBreak/>
               <w:t>OCRTurk isabeti</w:t>
             </w:r>
           </w:p>
@@ -9103,10 +9164,10 @@
         </w:rPr>
       </w:pPr>
       <w:r>
-        <w:t xml:space="preserve">İsabet, ağır motora gönderilen 87 belgenin 41'inde ağır çıktının hızlı çıktıdan en az 0,02 puan daha iyi olmasını ifade ediyor. Yakalama oranı ise ağır çıktının gerçekten faydalı olduğu 63 belgenin 41'inin </w:t>
-      </w:r>
-      <w:r>
-        <w:t xml:space="preserve">router tarafından seçilebildiğini gösteriyor. Bu nedenle </w:t>
+        <w:t>İsabet, ağır motora gönderilen 87 belgenin 41'inde ağır çıktının hızlı çıktıdan en az 0,02 puan daha iyi olmasını ifade ediyor. Yakalama oranı ise ağır çıktının gerçekten faydalı olduğu 63 belgenin 41'inin router tarafından seçilebildiğini gösteriyor. Bu n</w:t>
+      </w:r>
+      <w:r>
+        <w:t xml:space="preserve">edenle </w:t>
       </w:r>
       <w:r>
         <w:rPr>
@@ -9127,10 +9188,10 @@
         </w:rPr>
       </w:pPr>
       <w:r>
-        <w:t xml:space="preserve">Bu tablo nihai karne değil, eşik ve bileşen seçiminde kullanılan kalibrasyon görünümüdür. </w:t>
-      </w:r>
-      <w:r>
-        <w:t>Korpusun tamamındaki güncel sonuç Tablo 4'te veriliyor. İki koşu arasındaki fark, eklenen belgelerin büyük bölümünün hızlı yolun zaten güçlü olduğu OpenDataLoader ailesinden gelmesiyle ilişkilidir.</w:t>
+        <w:t xml:space="preserve">Bu tablo nihai karne değil, eşik ve bileşen seçiminde kullanılan kalibrasyon görünümüdür. Korpusun tamamındaki güncel sonuç Tablo 4'te veriliyor. İki </w:t>
+      </w:r>
+      <w:r>
+        <w:t>koşu arasındaki fark, eklenen belgelerin büyük bölümünün hızlı yolun zaten güçlü olduğu OpenDataLoader ailesinden gelmesiyle ilişkilidir.</w:t>
       </w:r>
     </w:p>
     <w:p>
@@ -9140,13 +9201,13 @@
         </w:rPr>
       </w:pPr>
       <w:r>
-        <w:t>Yönlendirme kararının donanımdan bağımsız olduğu ayrıca do</w:t>
-      </w:r>
-      <w:r>
-        <w:t>ğrulandı. Aynı 201 belge hem CPU hem GPU çıktısıyla yeniden değerlendirildiğinde hiçbir belgede yol kararı değişmedi, hızlı yol çıktısı birebir aynı kaldı, isabet ve yakalama oranları değişmedi. Aynı makinede yapılan 60 belgelik kontrol koşusunda da dört ö</w:t>
-      </w:r>
-      <w:r>
-        <w:t>lçütün dördünde fark sıfır çıktı. Kapı sinyalleri pdf-inspector ve PyMuPDF'ten geldiği ve bu bileşenler GPU kullanmadığı için bu sonuç beklenen davranışın doğrulanmasıdır.</w:t>
+        <w:t xml:space="preserve">Yönlendirme kararının donanımdan bağımsız olduğu ayrıca doğrulandı. Aynı 201 belge hem CPU hem GPU çıktısıyla yeniden </w:t>
+      </w:r>
+      <w:r>
+        <w:t>değerlendirildiğinde hiçbir belgede yol kararı değişmedi, hızlı yol çıktısı birebir aynı kaldı, isabet ve yakalama oranları değişmedi. Aynı makinede yapılan 60 belgelik kontrol koşusunda da dört ölçütün dördünde fark sıfır çıktı. Kapı sinyalleri pdf-inspec</w:t>
+      </w:r>
+      <w:r>
+        <w:t>tor ve PyMuPDF'ten geldiği ve bu bileşenler GPU kullanmadığı için bu sonuç beklenen davranışın doğrulanmasıdır.</w:t>
       </w:r>
     </w:p>
     <w:p>
@@ -9156,23 +9217,22 @@
         </w:rPr>
       </w:pPr>
       <w:r>
-        <w:t>Kabul için belirlenen hedefler aynı anda yüksek isabet, yüksek yakalama ve yeterli h</w:t>
-      </w:r>
-      <w:r>
-        <w:t xml:space="preserve">ızlı yol oranı istiyordu. Güncel yapı OCRTurk tarafında ilk kez 0,60 isabet eşiğine ulaştı, ancak genel yakalama 0,90 hedefinin altında kaldı ve İngilizce OpenDataLoader tarafı belirgin biçimde zayıftı. Bu nedenle sonuç, bütün veri aileleri için eşiklerin </w:t>
-      </w:r>
-      <w:r>
-        <w:t>kesinleştiği anlamına gelmiyor.</w:t>
+        <w:t xml:space="preserve">Kabul için belirlenen hedefler aynı anda yüksek isabet, yüksek yakalama ve yeterli hızlı yol oranı istiyordu. Güncel yapı OCRTurk </w:t>
+      </w:r>
+      <w:r>
+        <w:t>tarafında ilk kez 0,60 isabet eşiğine ulaştı, ancak genel yakalama 0,90 hedefinin altında kaldı ve İngilizce OpenDataLoader tarafı belirgin biçimde zayıftı. Bu nedenle sonuç, bütün veri aileleri için eşiklerin kesinleştiği anlamına gelmiyor.</w:t>
       </w:r>
     </w:p>
     <w:p>
       <w:pPr>
         <w:pStyle w:val="Balk2"/>
       </w:pPr>
-      <w:bookmarkStart w:id="25" w:name="_Toc238549457"/>
-      <w:r>
-        <w:lastRenderedPageBreak/>
-        <w:t>5.4 Kalibrasyonda seçilen önemli düzeltmeler</w:t>
+      <w:bookmarkStart w:id="25" w:name="_Toc238555635"/>
+      <w:r>
+        <w:t>5.4 Kalibrasyo</w:t>
+      </w:r>
+      <w:r>
+        <w:t>nda seçilen önemli düzeltmeler</w:t>
       </w:r>
       <w:bookmarkEnd w:id="25"/>
     </w:p>
@@ -9193,16 +9253,13 @@
         </w:rPr>
       </w:pPr>
       <w:r>
-        <w:t>İlk bulgu, ağ</w:t>
-      </w:r>
-      <w:r>
-        <w:t>ır çıktıyı reddetme denetiminin küçük skor farklarında fazla hassas olmasıydı. Başlangıçta tolerans 0,1 düzeyindeyken çok sayıda neredeyse eşit çıktı reddedilebiliyordu. Tolerans 5,0'a çıkarıldığında gereksiz redler azaldı. Güncel 87 ağır çıktıda yalnız bi</w:t>
-      </w:r>
-      <w:r>
-        <w:t>r red oluştu ve bu red referans faydasına göre yanlıştı. Red skorunun gerçek faydayla korelasyonu yaklaşık -0,0637; sayfaların yaklaşık yüzde 79'unda ayırt edici bir fark üretmiyor. Ayar değişikliği zararın kapsamını daralttı, fakat kullanılan sinyalin zay</w:t>
-      </w:r>
-      <w:r>
-        <w:t>ıflığını çözmedi.</w:t>
+        <w:t>İlk bulgu, ağır çıktıyı reddetme denetiminin küçük skor far</w:t>
+      </w:r>
+      <w:r>
+        <w:t>klarında fazla hassas olmasıydı. Başlangıçta tolerans 0,1 düzeyindeyken çok sayıda neredeyse eşit çıktı reddedilebiliyordu. Tolerans 5,0'a çıkarıldığında gereksiz redler azaldı. Güncel 87 ağır çıktıda yalnız bir red oluştu ve bu red referans faydasına göre</w:t>
+      </w:r>
+      <w:r>
+        <w:t xml:space="preserve"> yanlıştı. Red skorunun gerçek faydayla korelasyonu yaklaşık -0,0637; sayfaların yaklaşık yüzde 79'unda ayırt edici bir fark üretmiyor. Ayar değişikliği zararın kapsamını daralttı, fakat kullanılan sinyalin zayıflığını çözmedi.</w:t>
       </w:r>
     </w:p>
     <w:p>
@@ -9212,10 +9269,13 @@
         </w:rPr>
       </w:pPr>
       <w:r>
-        <w:t xml:space="preserve">İkinci bulgu, bölünmüş veya asılı cümle cezasının bazı veri ailelerinde kararı aşırı etkilemesiydi. Bu cezanın kaldırılması ya da ağırlığının değiştirilmesi OCRTurk ile OpenDataLoader tarafında aynı yönde sonuç vermedi. Birleşik toplamda </w:t>
-      </w:r>
-      <w:r>
-        <w:t>küçük iyileşme görünen bir ayar, veri ailelerinden birine zarar verebiliyordu. Bu durum yalnız genel ortalamaya bakarak eşik seçmenin riskini gösterdi.</w:t>
+        <w:t xml:space="preserve">İkinci bulgu, bölünmüş veya </w:t>
+      </w:r>
+      <w:r>
+        <w:t>asılı cümle cezasının bazı veri ailelerinde kararı aşırı etkilemesiydi. Bu cezanın kaldırılması ya da ağırlığının değiştirilmesi OCRTurk ile OpenDataLoader tarafında aynı yönde sonuç vermedi. Birleşik toplamda küçük iyileşme görünen bir ayar, veri aileleri</w:t>
+      </w:r>
+      <w:r>
+        <w:t>nden birine zarar verebiliyordu. Bu durum yalnız genel ortalamaya bakarak eşik seçmenin riskini gösterdi.</w:t>
       </w:r>
     </w:p>
     <w:p>
@@ -9225,13 +9285,16 @@
         </w:rPr>
       </w:pPr>
       <w:r>
-        <w:t>Üçüncü bulgu, yalnız düşük kalite gerekçesiyle ağır yola giden ve sayfada hiç çizim bulunmayan örneklerd</w:t>
-      </w:r>
-      <w:r>
-        <w:t xml:space="preserve">i. Bu dar grupta ağır motorun faydasız olduğu görüldü. “Çizimsiz düşük kalite vetosu” açıldığında toplam ağır çağrı 101'den 87'ye, isabet 0,4059'dan 0,4713'e çıktı; yakalama 0,6508'de kaldı. Toplam net fayda +3,0919'dan +3,4198'e yükseldi. OCRTurk isabeti </w:t>
-      </w:r>
-      <w:r>
-        <w:t>0,5690'dan 0,6000'a ulaştı.</w:t>
+        <w:t>Üçüncü bulgu, yalnız düşük kalite gerekçesiyle ağır yola giden ve sayfada hiç çizim bulunmayan örneklerdi. Bu dar grupta ağır motorun çoğunlukla fayda</w:t>
+      </w:r>
+      <w:r>
+        <w:t>sız olduğu görüldü. Bu nedenle bir geri çekme kuralı eklendi: Sayfada OCR ihtiyacı, tablo sinyali veya kritik metin kaybı yoksa ve sayfa yalnız düşük kalite nedeniyle seçilmişse, vektörel çizim de bulunmadığında Docling çağrısı iptal ediliyor. Kural tablo,</w:t>
+      </w:r>
+      <w:r>
+        <w:t xml:space="preserve"> OCR veya kritik hata gerekçesiyle seçilen sayfalara dokunmuyor. Bu değişiklikle toplam ağır çağrı 101'den 87'ye, isabet 0,4059'dan 0,4713'e çıktı; yakalama 0,6508'de kaldı. Toplam net fayda +3,0919'dan +3,4198'e yükseldi. OCRTurk isabeti 0,5690'dan 0,6000</w:t>
+      </w:r>
+      <w:r>
+        <w:t>'a ulaştı.</w:t>
       </w:r>
     </w:p>
     <w:p>
@@ -9241,7 +9304,7 @@
         </w:rPr>
       </w:pPr>
       <w:r>
-        <w:t>Tablo 6. Çizimsiz düşük kalite vetosunun 201 belgelik ölçümdeki etkisi.</w:t>
+        <w:t>Tablo 6. Çizimsiz düşük kalite geri çekme kuralının 201 belgelik ölçümdeki etkisi.</w:t>
       </w:r>
     </w:p>
     <w:tbl>
@@ -9316,7 +9379,7 @@
                 <w:color w:val="FFFFFF"/>
                 <w:sz w:val="18"/>
               </w:rPr>
-              <w:t>Veto öncesi</w:t>
+              <w:t>Kural öncesi</w:t>
             </w:r>
           </w:p>
         </w:tc>
@@ -9345,7 +9408,7 @@
                 <w:color w:val="FFFFFF"/>
                 <w:sz w:val="18"/>
               </w:rPr>
-              <w:t>Veto sonrası</w:t>
+              <w:t>Kural sonrası</w:t>
             </w:r>
           </w:p>
         </w:tc>
@@ -9552,6 +9615,7 @@
               <w:rPr>
                 <w:sz w:val="18"/>
               </w:rPr>
+              <w:lastRenderedPageBreak/>
               <w:t>Yakalama</w:t>
             </w:r>
           </w:p>
@@ -9726,13 +9790,7 @@
               <w:rPr>
                 <w:sz w:val="18"/>
               </w:rPr>
-              <w:t xml:space="preserve">OCRTurk </w:t>
-            </w:r>
-            <w:r>
-              <w:rPr>
-                <w:sz w:val="18"/>
-              </w:rPr>
-              <w:t>isabeti</w:t>
+              <w:t>OCRTurk isabeti</w:t>
             </w:r>
           </w:p>
         </w:tc>
@@ -9807,17 +9865,17 @@
         </w:rPr>
       </w:pPr>
       <w:r>
-        <w:t>Yerel korpusta aynı değişiklik ağır çağrıyı 137'den 115'e, gereksiz ağır çağrıyı 28'den 10'a indirdi. Buna karşılık kaçırılan gerekli ağır çağrı 3'ten 4'e çıktı. Değişiklik maliyet ve isabet tarafında belirgin fayda sağladı, fakat s</w:t>
-      </w:r>
-      <w:r>
-        <w:t>ıfır kayıplı bir iyileştirme değildi.</w:t>
+        <w:t>Yerel korpusta aynı değişiklik ağır çağrıyı 137'den 115'e, gereksiz ağır çağrıyı 28'den 10'a indirdi. Buna karşılık kaçırılan gerekli ağır çağrı 3'ten 4'e çıktı. Değişiklik maliyet ve isabet tarafında belirgin fayda sağladı, fakat sıfır kay</w:t>
+      </w:r>
+      <w:r>
+        <w:t>ıplı bir iyileştirme değildi.</w:t>
       </w:r>
     </w:p>
     <w:p>
       <w:pPr>
         <w:pStyle w:val="Balk2"/>
       </w:pPr>
-      <w:bookmarkStart w:id="26" w:name="_Toc238549458"/>
+      <w:bookmarkStart w:id="26" w:name="_Toc238555636"/>
       <w:r>
         <w:t>5.5 Ölçüm sırasında bulunan sessiz hatalar</w:t>
       </w:r>
@@ -9830,13 +9888,13 @@
         </w:rPr>
       </w:pPr>
       <w:r>
-        <w:t>Ölçümlerin birkaç kez yeniden alınmasının nedeni yalnız eşik aramak değildi. Bazı yardımcı bileşenler hata vermeden yanlış sonuç üretebiliyordu. Bir araç sayfa numarasını 0'da</w:t>
-      </w:r>
-      <w:r>
-        <w:t>n, diğeri 1'den başlattığı için yanlış sayfanın metni karşılaştırılabiliyordu. OCRTurk kaynak dosyalarının bir bölümündeki UTF-8 BOM, alan adlarının sessizce boş okunmasına yol açıyordu. Bir sayaç üretim kodunun yazdığı etiket yerine eski etiketi aradığı i</w:t>
-      </w:r>
-      <w:r>
-        <w:t>çin “kaçırılan tablo” sayısı her koşuda sıfır görünüyordu.</w:t>
+        <w:t>Ölçümlerin birkaç kez yeniden alınmasının nedeni yalnız eşik aramak değildi. Bazı yardımcı bileşenler hata vermeden yanlış sonuç üretebiliyordu. Bir araç sayfa numarasını 0'dan, diğer</w:t>
+      </w:r>
+      <w:r>
+        <w:t>i 1'den başlattığı için yanlış sayfanın metni karşılaştırılabiliyordu. OCRTurk kaynak dosyalarının bir bölümündeki UTF-8 BOM, alan adlarının sessizce boş okunmasına yol açıyordu. Bir sayaç üretim kodunun yazdığı etiket yerine eski etiketi aradığı için “kaç</w:t>
+      </w:r>
+      <w:r>
+        <w:t>ırılan tablo” sayısı her koşuda sıfır görünüyordu.</w:t>
       </w:r>
     </w:p>
     <w:p>
@@ -9857,10 +9915,10 @@
         <w:t>rapidfuzz</w:t>
       </w:r>
       <w:r>
-        <w:t xml:space="preserve"> kütüphanesi bulunmadığında karakter benzerliği hesabı sessizce farklı bir algoritmaya düştü. Parser çıktıları birebir aynı olmasına rağmen 201 belgenin büyük bölümünde fa</w:t>
-      </w:r>
-      <w:r>
-        <w:t>yda puanları değişti. Koşu ortamı eşitlenip tekrarlandığında fark ortadan kalktı. Bu deney, ölçüm sürümünün yalnız formülü değil kullanılan algoritmayı ve bağımlılığı da görünür kılması gerektiğini gösterdi.</w:t>
+        <w:t xml:space="preserve"> kütüphanesi bulunmadığında karakter benzerliği hesabı sessizce farklı bir algoritmaya düştü. Parser çıktıları birebir aynı olmasına rağmen 201 belgenin büyük bölümünde fayda puan</w:t>
+      </w:r>
+      <w:r>
+        <w:t>ları değişti. Koşu ortamı eşitlenip tekrarlandığında fark ortadan kalktı. Bu deney, ölçüm sürümünün yalnız formülü değil kullanılan algoritmayı ve bağımlılığı da görünür kılması gerektiğini gösterdi.</w:t>
       </w:r>
     </w:p>
     <w:p>
@@ -9870,10 +9928,10 @@
         </w:rPr>
       </w:pPr>
       <w:r>
-        <w:t>Bu hatalar sistemin ana fikrini değiştirmedi, fa</w:t>
-      </w:r>
-      <w:r>
-        <w:t xml:space="preserve">kat sayıların hangi koşuda üretildiğini kaydetmenin önemini ortaya koydu. Kalibrasyon sonuçları bu düzeltmelerden sonra, </w:t>
+        <w:t>Bu hatalar sistemin ana fikrini değiştirmedi, fakat sayı</w:t>
+      </w:r>
+      <w:r>
+        <w:t xml:space="preserve">ların hangi koşuda üretildiğini kaydetmenin önemini ortaya koydu. Kalibrasyon sonuçları bu düzeltmelerden sonra, </w:t>
       </w:r>
       <w:r>
         <w:rPr>
@@ -9891,13 +9949,9 @@
       <w:pPr>
         <w:pStyle w:val="Balk2"/>
       </w:pPr>
-      <w:bookmarkStart w:id="27" w:name="_Toc238549459"/>
-      <w:r>
-        <w:lastRenderedPageBreak/>
-        <w:t xml:space="preserve">5.6 Doğrulamanın </w:t>
-      </w:r>
-      <w:r>
-        <w:t>sınırı</w:t>
+      <w:bookmarkStart w:id="27" w:name="_Toc238555637"/>
+      <w:r>
+        <w:t>5.6 Doğrulamanın sınırı</w:t>
       </w:r>
       <w:bookmarkEnd w:id="27"/>
     </w:p>
@@ -9908,10 +9962,13 @@
         </w:rPr>
       </w:pPr>
       <w:r>
-        <w:t xml:space="preserve">Güncel politika, eşik ayarlamasında hiç kullanılmamış bağımsız bir doğrulama kümesi üzerinde sınanmış değil. Aday kural C1 üzerinde arandı, yerel korpusla kontrol edildi; fakat yerel korpus sonucu da nihai aday seçimine etki etti. Bu nedenle mevcut </w:t>
-      </w:r>
-      <w:r>
-        <w:t>doğrulama yarı bağımsız nitelikte. Yeni ve dokunulmamış belge aileleri toplanmadan bütün PDF türleri için üretim eşiği ilan etmek doğru olmaz.</w:t>
+        <w:t xml:space="preserve">Güncel </w:t>
+      </w:r>
+      <w:r>
+        <w:t>politika, eşik ayarlamasında hiç kullanılmamış bağımsız bir doğrulama kümesi üzerinde sınanmış değil. Aday kural C1 üzerinde arandı, yerel korpusla kontrol edildi; fakat yerel korpus sonucu da nihai aday seçimine etki etti. Bu nedenle mevcut doğrulama yarı</w:t>
+      </w:r>
+      <w:r>
+        <w:t xml:space="preserve"> bağımsız nitelikte. Yeni ve dokunulmamış belge aileleri toplanmadan bütün PDF türleri için üretim eşiği ilan etmek doğru olmaz.</w:t>
       </w:r>
     </w:p>
     <w:p>
@@ -9921,10 +9978,10 @@
         </w:rPr>
       </w:pPr>
       <w:r>
-        <w:t>Özellikle İngilizce OpenDataLoader örneklerindeki negatif etki, yeni eşik aramaktan önce hata türlerinin ayrılmas</w:t>
-      </w:r>
-      <w:r>
-        <w:t>ını gerektiriyor. Docling bu belgelerde gerçekten daha mı zayıf, referans biçimi belirli yapıları mı cezalandırıyor, yoksa router yanlış sayfaları mı seçiyor? Sonraki çalışma bu soruları ayrı deneylerle ele almalı.</w:t>
+        <w:t>Özellikle İngilizce OpenDataLoader örneklerindeki negatif etki, yeni eşik aramaktan önce hata türlerinin ayrılmasını gerektiriy</w:t>
+      </w:r>
+      <w:r>
+        <w:t>or. Docling bu belgelerde gerçekten daha mı zayıf, referans biçimi belirli yapıları mı cezalandırıyor, yoksa router yanlış sayfaları mı seçiyor? Sonraki çalışma bu soruları ayrı deneylerle ele almalı.</w:t>
       </w:r>
     </w:p>
     <w:p>
@@ -9934,12 +9991,9 @@
           <w:bottom w:val="single" w:sz="8" w:space="5" w:color="207B79"/>
         </w:pBdr>
       </w:pPr>
-      <w:bookmarkStart w:id="28" w:name="_Toc238549460"/>
-      <w:r>
-        <w:t>6. Performans ve İlgili Alternatif Deneme</w:t>
-      </w:r>
-      <w:r>
-        <w:t>ler</w:t>
+      <w:bookmarkStart w:id="28" w:name="_Toc238555638"/>
+      <w:r>
+        <w:t>6. Performans ve İlgili Alternatif Denemeler</w:t>
       </w:r>
       <w:bookmarkEnd w:id="28"/>
     </w:p>
@@ -9947,9 +10001,12 @@
       <w:pPr>
         <w:pStyle w:val="Balk2"/>
       </w:pPr>
-      <w:bookmarkStart w:id="29" w:name="_Toc238549461"/>
-      <w:r>
-        <w:t>6.1 Docling'in GPU kazancı</w:t>
+      <w:bookmarkStart w:id="29" w:name="_Toc238555639"/>
+      <w:r>
+        <w:t>6.1 Doclin</w:t>
+      </w:r>
+      <w:r>
+        <w:t>g'in GPU kazancı</w:t>
       </w:r>
       <w:bookmarkEnd w:id="29"/>
     </w:p>
@@ -9960,10 +10017,10 @@
         </w:rPr>
       </w:pPr>
       <w:r>
-        <w:t>Ağır motorun maliyeti yönlendirme yaklaşımının temel gerekçelerinden biri. İlk karşılaştırmada farklı makinelerdeki sonuçlar kullanıldığı için GPU yaklaşık 6,83 kat hızlı görünüyordu. Ancak yeni makinenin işlemcisi de daha hı</w:t>
-      </w:r>
-      <w:r>
-        <w:t>zlıydı; bu nedenle gerçek GPU katkısını görmek için CPU ve GPU'nun aynı makinede karşılaştırılması gerekti.</w:t>
+        <w:t>Ağır motorun maliyeti yönlendirme yaklaşımının temel gerekçelerinden biri. İlk karşılaştırmada farklı makinelerdeki sonuçlar kullanıldığı için GPU yaklaşık 6,83 kat hızlı görünüyordu. Ancak yeni makinenin işlemcisi de daha hızlıydı; bu ned</w:t>
+      </w:r>
+      <w:r>
+        <w:t>enle gerçek GPU katkısını görmek için CPU ve GPU'nun aynı makinede karşılaştırılması gerekti.</w:t>
       </w:r>
     </w:p>
     <w:p>
@@ -9973,10 +10030,14 @@
         </w:rPr>
       </w:pPr>
       <w:r>
-        <w:t xml:space="preserve">Aynı makinedeki ölçümlerde Docling CPU'da ortalama 1.622 ms/sayfa, GPU'da 530 ms/sayfa sürdü ve 3,06 kat hızlanma sağladı. İkinci çalışma ortamında </w:t>
-      </w:r>
-      <w:r>
-        <w:t>hızlanma 2,78 ile 3,40 kat arasında ölçüldü. Koşular arasındaki değişkenlik ve gözlenen termal kısılma nedeniyle tek sayı yerine bu aralık kullanıldı.</w:t>
+        <w:t xml:space="preserve">Aynı makinedeki ölçümlerde Docling CPU'da ortalama 1.622 ms/sayfa, GPU'da 530 ms/sayfa sürdü ve 3,06 kat hızlanma sağladı. İkinci çalışma ortamında hızlanma 2,78 </w:t>
+      </w:r>
+      <w:r>
+        <w:t xml:space="preserve">ile 3,40 kat arasında ölçüldü. </w:t>
+      </w:r>
+      <w:r>
+        <w:lastRenderedPageBreak/>
+        <w:t>Koşular arasındaki değişkenlik ve gözlenen termal kısılma nedeniyle tek sayı yerine bu aralık kullanıldı.</w:t>
       </w:r>
     </w:p>
     <w:p>
@@ -9986,13 +10047,10 @@
         </w:rPr>
       </w:pPr>
       <w:r>
-        <w:t>Tekrarlanan GPU koşularında aynı girdiler aynı çıktıyı üretti. Daha kapsamlı sunucu kontrolünde 261 sayfa</w:t>
-      </w:r>
-      <w:r>
-        <w:t>lık yerel korpus ve ek kalite örneklerinde CPU ile GPU çıktıları arasında fark bulunmadı. İlk ortamda görülen yedi sayfalık farkın biri önemli bir tablo kaybıydı, ancak GPU mimarisiyle birlikte Docling sürümü de değiştiği için neden kesin olarak ayrılamadı</w:t>
-      </w:r>
-      <w:r>
-        <w:t>.</w:t>
+        <w:t>Tekrarlanan GPU koşularında aynı girdiler aynı çıktıyı üretti. Daha kapsamlı sunucu kontrolünde 261 sayfalık yerel korp</w:t>
+      </w:r>
+      <w:r>
+        <w:t>us ve ek kalite örneklerinde CPU ile GPU çıktıları arasında fark bulunmadı. İlk ortamda görülen yedi sayfalık farkın biri önemli bir tablo kaybıydı, ancak GPU mimarisiyle birlikte Docling sürümü de değiştiği için neden kesin olarak ayrılamadı.</w:t>
       </w:r>
     </w:p>
     <w:p>
@@ -10002,17 +10060,20 @@
         </w:rPr>
       </w:pPr>
       <w:r>
-        <w:t>Genel sonuç, GPU'nun Docling'i yaklaşık üç kat hızlandırdığı ve aynı çalışma ortamında kararlı çıktı verdiğidir. Buna karşılık farklı makineler arasında küçük çıktı farkları oluşabildiği için yalnız CPU/GPU bilgisi değil, Docling sürümü ve çalışma ortamı</w:t>
-      </w:r>
-      <w:r>
-        <w:t xml:space="preserve"> da işlem kaydında tutulmalıdır.</w:t>
+        <w:t>Genel sonuç,</w:t>
+      </w:r>
+      <w:r>
+        <w:t xml:space="preserve"> GPU'nun Docling'i yaklaşık üç kat hızlandırdığı ve aynı çalışma ortamında kararlı çıktı verdiğidir. Buna karşılık farklı makineler arasında küçük çıktı farkları oluşabildiği için yalnız CPU/GPU bilgisi değil, Docling sürümü ve çalışma ortamı da işlem kayd</w:t>
+      </w:r>
+      <w:r>
+        <w:t>ında tutulmalıdır.</w:t>
       </w:r>
     </w:p>
     <w:p>
       <w:pPr>
         <w:pStyle w:val="Balk2"/>
       </w:pPr>
-      <w:bookmarkStart w:id="30" w:name="_Toc238549462"/>
+      <w:bookmarkStart w:id="30" w:name="_Toc238555640"/>
       <w:r>
         <w:t>6.2 GPU ortamındaki ağır motor ve doğrulama koşuları</w:t>
       </w:r>
@@ -10025,13 +10086,10 @@
         </w:rPr>
       </w:pPr>
       <w:r>
-        <w:t>GPU çalışması iki ayrı amaç taşıdı. İlk olarak 261 sayfalık yerel korpusun tamamı Docling ile işlenerek ağır motorun ham CPU ve GPU maliyeti ölçüldü. İkinci olarak C1 kor</w:t>
-      </w:r>
-      <w:r>
-        <w:t>pusundaki eksik ağır motor önbelleği tamamlandı ve yönlendirme kalitesi 380 belgenin tamamında hesaplandı. Önbellek üzerinden yürütülen kalite tekrarı canlı Docling çağrısını içermediği için bu sonuçlar bütün sistemin doğrudan uçtan uca süresi olarak yorum</w:t>
-      </w:r>
-      <w:r>
-        <w:t>lanmadı.</w:t>
+        <w:t>GPU çalışması iki ayrı amaç taşıdı. İlk olarak 261 sayfalık yerel korpusun tamamı Docling ile işlenerek ağır motorun ham CPU ve GPU maliyeti ölçüldü. İkinci olarak C1 korpusundaki eksi</w:t>
+      </w:r>
+      <w:r>
+        <w:t>k ağır motor önbelleği tamamlandı ve yönlendirme kalitesi 380 belgenin tamamında hesaplandı. Önbellek üzerinden yürütülen kalite tekrarı canlı Docling çağrısını içermediği için bu sonuçlar bütün sistemin doğrudan uçtan uca süresi olarak yorumlanmadı.</w:t>
       </w:r>
     </w:p>
     <w:p>
@@ -10041,7 +10099,10 @@
         </w:rPr>
       </w:pPr>
       <w:r>
-        <w:t>Tablo 7. GPU ortamındaki ağır motor, kalite ve cihaz doğrulama ölçümleri.</w:t>
+        <w:t>Tablo</w:t>
+      </w:r>
+      <w:r>
+        <w:t xml:space="preserve"> 7. GPU ortamındaki ağır motor, kalite ve cihaz doğrulama ölçümleri.</w:t>
       </w:r>
     </w:p>
     <w:tbl>
@@ -10235,13 +10296,13 @@
               <w:rPr>
                 <w:sz w:val="18"/>
               </w:rPr>
-              <w:t xml:space="preserve">Ham </w:t>
+              <w:t xml:space="preserve">Ham Docling </w:t>
             </w:r>
             <w:r>
               <w:rPr>
                 <w:sz w:val="18"/>
               </w:rPr>
-              <w:t>Docling performansı: 9 belge ve 261 sayfa; kalite değerlendirmesi: 380 belge</w:t>
+              <w:t>performansı: 9 belge ve 261 sayfa; kalite değerlendirmesi: 380 belge</w:t>
             </w:r>
           </w:p>
         </w:tc>
@@ -10361,13 +10422,13 @@
               <w:rPr>
                 <w:sz w:val="18"/>
               </w:rPr>
-              <w:t xml:space="preserve">261 sayfanın tamamı için </w:t>
+              <w:t>261 sayfanın tamamı için GPU'da 134,8 i</w:t>
             </w:r>
             <w:r>
               <w:rPr>
                 <w:sz w:val="18"/>
               </w:rPr>
-              <w:t>GPU'da 134,8 ile 231,6 sn; aynı makinede CPU'da 458,6 ile 643,1 sn</w:t>
+              <w:t>le 231,6 sn; aynı makinede CPU'da 458,6 ile 643,1 sn</w:t>
             </w:r>
           </w:p>
         </w:tc>
@@ -10400,7 +10461,6 @@
               <w:rPr>
                 <w:sz w:val="18"/>
               </w:rPr>
-              <w:lastRenderedPageBreak/>
               <w:t>Ham Docling ortalama süresi</w:t>
             </w:r>
           </w:p>
@@ -10488,13 +10548,7 @@
               <w:rPr>
                 <w:sz w:val="18"/>
               </w:rPr>
-              <w:t xml:space="preserve">146 sayfa hızlı yolda kaldı, 107 sayfa Docling'e, 8 sayfa OCR'a </w:t>
-            </w:r>
-            <w:r>
-              <w:rPr>
-                <w:sz w:val="18"/>
-              </w:rPr>
-              <w:t>gitti</w:t>
+              <w:t>146 sayfa hızlı yolda kaldı, 107 sayfa Docling'e, 8 sayfa OCR'a gitti</w:t>
             </w:r>
           </w:p>
         </w:tc>
@@ -10527,7 +10581,13 @@
               <w:rPr>
                 <w:sz w:val="18"/>
               </w:rPr>
-              <w:t>Aynı makinedeki CPU tabanına göre hızlanma</w:t>
+              <w:t xml:space="preserve">Aynı </w:t>
+            </w:r>
+            <w:r>
+              <w:rPr>
+                <w:sz w:val="18"/>
+              </w:rPr>
+              <w:t>makinedeki CPU tabanına göre hızlanma</w:t>
             </w:r>
           </w:p>
         </w:tc>
@@ -10674,13 +10734,13 @@
               <w:rPr>
                 <w:sz w:val="18"/>
               </w:rPr>
-              <w:t>380 belgenin ağır motor önbelleği tamamlandı; kalite tekrarında hata 0, karantin</w:t>
+              <w:t>380 belgenin ağır motor önbelleği tamamlandı; kalite tekrarında hata 0, karantina 3 sayfa, f</w:t>
             </w:r>
             <w:r>
               <w:rPr>
                 <w:sz w:val="18"/>
               </w:rPr>
-              <w:t>a 3 sayfa, fallback 0</w:t>
+              <w:t>allback 0</w:t>
             </w:r>
           </w:p>
         </w:tc>
@@ -10701,10 +10761,10 @@
         </w:rPr>
       </w:pPr>
       <w:r>
-        <w:t xml:space="preserve">Kalite koşusunda belge başına Docling süresi GPU'da ortalama 987,5 ms, ortanca 830,5 ms ölçüldü. Aynı makinede CPU'da bu değerler 4.005,0 ms ve 2.814,0 ms oldu. Çalıştırılan cihaz varsayılmadı; her önbellek kaydına Docling'in kendi </w:t>
-      </w:r>
-      <w:r>
-        <w:t>bildirdiği cihaz adı yazıldı ve GPU koşusunun 380 kaydının 380'i, CPU koşusunun 60 kaydının 60'ı beklenen cihazı gösterdi.</w:t>
+        <w:t>Kalite koşusunda belge başına Docling süresi GPU'da ortalama 987,5 ms, ortanca 830,5 ms ölçüldü. Aynı makinede CPU'da bu değerler 4.005,0 ms ve 2.814,0 ms oldu. Çalıştırılan cihaz varsayılmadı; her önbellek kaydına Docling'in kendi bildirdiği c</w:t>
+      </w:r>
+      <w:r>
+        <w:t>ihaz adı yazıldı ve GPU koşusunun 380 kaydının 380'i, CPU koşusunun 60 kaydının 60'ı beklenen cihazı gösterdi.</w:t>
       </w:r>
     </w:p>
     <w:p>
@@ -10714,21 +10774,22 @@
         </w:rPr>
       </w:pPr>
       <w:r>
-        <w:t xml:space="preserve">Bu koşunun en önemli sonuçlarından biri kapsam oldu. Docling önbelleği CPU üzerinde tamamlanamadığı için kalite ölçümü daha önce </w:t>
-      </w:r>
-      <w:r>
-        <w:t>201 belgeli alt kümeyle sınırlıydı. GPU'da ağır motor çıktıları tamamlanınca güncel yönlendirme politikası 380 belgenin tamamında yeniden hesaplandı. Canlı yönlendirilmiş sistemin toplam maliyeti ise aşağıdaki bölümde, ölçülen birim süreler ve güncel sayfa</w:t>
-      </w:r>
-      <w:r>
-        <w:t xml:space="preserve"> dağılımı kullanılarak hesaplandı.</w:t>
+        <w:t xml:space="preserve">Bu koşunun en önemli sonuçlarından biri kapsam oldu. Docling önbelleği CPU üzerinde tamamlanamadığı için kalite ölçümü daha önce 201 </w:t>
+      </w:r>
+      <w:r>
+        <w:t>belgeli alt kümeyle sınırlıydı. GPU'da ağır motor çıktıları tamamlanınca güncel yönlendirme politikası 380 belgenin tamamında yeniden hesaplandı. Canlı yönlendirilmiş sistemin toplam maliyeti ise aşağıdaki bölümde, ölçülen birim süreler ve güncel sayfa dağ</w:t>
+      </w:r>
+      <w:r>
+        <w:t>ılımı kullanılarak hesaplandı.</w:t>
       </w:r>
     </w:p>
     <w:p>
       <w:pPr>
         <w:pStyle w:val="Balk2"/>
       </w:pPr>
-      <w:bookmarkStart w:id="31" w:name="_Toc238549463"/>
-      <w:r>
+      <w:bookmarkStart w:id="31" w:name="_Toc238555641"/>
+      <w:r>
+        <w:lastRenderedPageBreak/>
         <w:t>6.3 Yönlendirmenin maliyeti</w:t>
       </w:r>
       <w:bookmarkEnd w:id="31"/>
@@ -10740,13 +10801,13 @@
         </w:rPr>
       </w:pPr>
       <w:r>
-        <w:t>Yönlendirmenin ne kazandırdığı kadar neye mal olduğu da hesaplanabilir. Aynı 261 sayfalık korpus için üç senaryo, ölçülmüş birim süreler ve güncel sayfa dağılımı kullanılarak oluşturuldu. Bunla</w:t>
-      </w:r>
-      <w:r>
-        <w:t>r canlı uçtan uca kronometre sonuçları değil, ölçümlere dayalı toplam maliyet hesaplarıdır. Birinci senaryoda ağır motor hiç çağrılmıyor ve metin yalnız pdf-inspector ile çıkarılıyor. İkinci senaryo güncel yönlendirmeyi temsil ediyor; kapı, kalite değerlen</w:t>
-      </w:r>
-      <w:r>
-        <w:t>dirmesi ve birleştirme çalışıyor, sayfaların yüzde 44,1'i ağır yola gidiyor. Üçüncü senaryoda her sayfa ağır motora gidiyor.</w:t>
+        <w:t>Yönlendirmenin ne kazandırdığı kadar neye mal olduğu da hesaplanabilir. Aynı 261 sayfalık korpus için üç senaryo, ölçülmüş birim süreler ve güncel sayfa dağılımı kullanılarak oluşturuldu. Bunlar ca</w:t>
+      </w:r>
+      <w:r>
+        <w:t>nlı uçtan uca kronometre sonuçları değil, ölçümlere dayalı toplam maliyet hesaplarıdır. Birinci senaryoda ağır motor hiç çağrılmıyor ve metin yalnız pdf-inspector ile çıkarılıyor. İkinci senaryo güncel yönlendirmeyi temsil ediyor; kapı, kalite değerlendirm</w:t>
+      </w:r>
+      <w:r>
+        <w:t>esi ve birleştirme çalışıyor, sayfaların yüzde 44,1'i ağır yola gidiyor. Üçüncü senaryoda her sayfa ağır motora gidiyor.</w:t>
       </w:r>
     </w:p>
     <w:p>
@@ -10890,7 +10951,7 @@
                 <w:color w:val="FFFFFF"/>
                 <w:sz w:val="18"/>
               </w:rPr>
-              <w:t>Tamamen a</w:t>
+              <w:t xml:space="preserve">Tamamen ağır </w:t>
             </w:r>
             <w:r>
               <w:rPr>
@@ -10898,7 +10959,7 @@
                 <w:color w:val="FFFFFF"/>
                 <w:sz w:val="18"/>
               </w:rPr>
-              <w:t>ğır yol</w:t>
+              <w:t>yol</w:t>
             </w:r>
           </w:p>
         </w:tc>
@@ -11266,9 +11327,8 @@
         <w:rPr>
           <w:noProof/>
         </w:rPr>
-        <w:lastRenderedPageBreak/>
         <w:drawing>
-          <wp:inline distT="0" distB="0" distL="0" distR="0" wp14:anchorId="4E200807" wp14:editId="3DE0C192">
+          <wp:inline distT="0" distB="0" distL="0" distR="0" wp14:anchorId="54C23B78" wp14:editId="3A704DE0">
             <wp:extent cx="5760000" cy="3046612"/>
             <wp:effectExtent l="0" t="0" r="0" b="0"/>
             <wp:docPr id="5" name="Picture 5"/>
@@ -11283,7 +11343,7 @@
                     <pic:cNvPicPr/>
                   </pic:nvPicPr>
                   <pic:blipFill>
-                    <a:blip r:embed="rId14"/>
+                    <a:blip r:embed="rId15"/>
                     <a:stretch>
                       <a:fillRect/>
                     </a:stretch>
@@ -11338,10 +11398,10 @@
         </w:rPr>
       </w:pPr>
       <w:r>
-        <w:t>Ligatür düzeltmesi GPU koşularından</w:t>
-      </w:r>
-      <w:r>
-        <w:t xml:space="preserve"> sonra eklendiği için Tablo 8'in hesabına dahil değildir. Sorunlu makalede ölçülen yaklaşık 1,78 ms/sayfa ek maliyet, ağır motor süresinin yanında küçük kalıyor; yine de güncel kodun doğrudan uçtan uca performans ölçümünde ayrıca izlenmelidir.</w:t>
+        <w:t xml:space="preserve">Ligatür düzeltmesi GPU </w:t>
+      </w:r>
+      <w:r>
+        <w:t>koşularından sonra eklendiği için Tablo 8'in hesabına dahil değildir. Sorunlu makalede ölçülen yaklaşık 1,78 ms/sayfa ek maliyet, ağır motor süresinin yanında küçük kalıyor; yine de güncel kodun doğrudan uçtan uca performans ölçümünde ayrıca izlenmelidir.</w:t>
       </w:r>
     </w:p>
     <w:p>
@@ -11351,21 +11411,19 @@
         </w:rPr>
       </w:pPr>
       <w:r>
-        <w:t>Tablo iki şe</w:t>
-      </w:r>
-      <w:r>
-        <w:t>yi birden gösteriyor. Sayfa seçmek ağır motor maliyetini yarıdan fazla düşürüyor. Üçüncü senaryodan ikinciye geçiş bütün donanım seçeneklerinde 2,2 ile 2,3 kat kazanç veriyor ve bu oran GPU'da da korunuyor. Birinci sütun ise bir alternatif değil, bir ölçek</w:t>
-      </w:r>
-      <w:r>
-        <w:t xml:space="preserve"> göstergesidir. Hızlı yol tabloyu yapısal olarak çıkaramaz, taranmış belgeyi okuyamaz ve OCR yapamaz. O sütunun ucuzluğu, ağır motorun neyin karşılığında ödendiğini gösteriyor: hız değil, yapı ve kapsam.</w:t>
+        <w:t>Tablo iki şeyi birden gösteriyor. Sayfa seçmek ağır motor maliyetini yarıdan fazla düşürüyor. Üçüncü senaryodan ikinciye geçiş bütün donanım seçeneklerinde 2,2 ile 2,3 kat kazanç veriyor ve bu oran GPU'da da korunuyor. Birinci sütun ise bir alternatif deği</w:t>
+      </w:r>
+      <w:r>
+        <w:t>l, bir ölçek göstergesidir. Hızlı yol tabloyu yapısal olarak çıkaramaz, taranmış belgeyi okuyamaz ve OCR yapamaz. O sütunun ucuzluğu, ağır motorun neyin karşılığında ödendiğini gösteriyor: hız değil, yapı ve kapsam.</w:t>
       </w:r>
     </w:p>
     <w:p>
       <w:pPr>
         <w:pStyle w:val="Balk2"/>
       </w:pPr>
-      <w:bookmarkStart w:id="32" w:name="_Toc238549464"/>
-      <w:r>
+      <w:bookmarkStart w:id="32" w:name="_Toc238555642"/>
+      <w:r>
+        <w:lastRenderedPageBreak/>
         <w:t>6.4 MinerU GPU/VLM modu</w:t>
       </w:r>
       <w:bookmarkEnd w:id="32"/>
@@ -11377,13 +11435,13 @@
         </w:rPr>
       </w:pPr>
       <w:r>
-        <w:t>Docling dışında daha güçlü b</w:t>
-      </w:r>
-      <w:r>
-        <w:t>ir ağır motor seçeneği olarak MinerU'nun GPU/VLM modu değerlendirildi. Bu mod, pipeline sürümünden farklı olarak sayfa görüntüsü ve görsel-dil modeli üzerinden daha zengin belge yapısı çıkarabiliyor. Birleşik hücreli tabloları koruma ve grafik ile normal r</w:t>
-      </w:r>
-      <w:r>
-        <w:t>esmi ayırma konusunda Docling'den daha ayrıntılı sonuç verdiği örnekler görüldü.</w:t>
+        <w:t xml:space="preserve">Docling dışında </w:t>
+      </w:r>
+      <w:r>
+        <w:t xml:space="preserve">daha güçlü bir ağır motor seçeneği olarak MinerU'nun GPU/VLM modu değerlendirildi. Bu mod, pipeline sürümünden farklı olarak sayfa görüntüsü ve görsel-dil modeli üzerinden daha zengin belge yapısı çıkarabiliyor. Birleşik hücreli tabloları koruma ve grafik </w:t>
+      </w:r>
+      <w:r>
+        <w:t>ile normal resmi ayırma konusunda Docling'den daha ayrıntılı sonuç verdiği örnekler görüldü.</w:t>
       </w:r>
     </w:p>
     <w:p>
@@ -11393,10 +11451,10 @@
         </w:rPr>
       </w:pPr>
       <w:r>
-        <w:t>MinerU 261 sayfada 119 tablo bloğu işaretledi ve tablo gövdelerini birleşik hücre bilgisini koruyan HTML biçiminde verdi. Docling'in düz Markdown çıktısında bu bilgi kaybolabi</w:t>
-      </w:r>
-      <w:r>
-        <w:t>liyordu; Türkçe makaledeki bir tabloda fark doğrudan gözlendi.</w:t>
+        <w:t>MinerU 261 sayfada 119 tablo bloğu işaretledi ve tablo gövdelerini birleşik hücre bilgisini koruyan HTML biçiminde verdi. Docling'in düz Markdown çıktısında bu bil</w:t>
+      </w:r>
+      <w:r>
+        <w:t>gi kaybolabiliyordu; Türkçe makaledeki bir tabloda fark doğrudan gözlendi.</w:t>
       </w:r>
     </w:p>
     <w:p>
@@ -11406,10 +11464,10 @@
         </w:rPr>
       </w:pPr>
       <w:r>
-        <w:t>MinerU ayrıca 123 şekil bloğunun 73'ünü grafik, 50'sini resim olarak ayırdı ve her şekil için kırpılmış görüntü ile konum bilgisi üretti. Docling grafik ve normal resmi aynı yer tutucuyla göste</w:t>
-      </w:r>
-      <w:r>
-        <w:t>rdiği için MinerU'nun çıktısı bu açıdan daha zengindi.</w:t>
+        <w:t>MinerU ayrıca 123 şekil bloğunun 73'ünü grafik, 50'sini resim olarak ayırdı ve her şekil için kırpılmış görüntü ile konum bilgisi üretti. Docling grafik ve normal resmi aynı yer tut</w:t>
+      </w:r>
+      <w:r>
+        <w:t>ucuyla gösterdiği için MinerU'nun çıktısı bu açıdan daha zengindi.</w:t>
       </w:r>
     </w:p>
     <w:p>
@@ -11419,10 +11477,10 @@
         </w:rPr>
       </w:pPr>
       <w:r>
-        <w:t>Bunun bedeli işlem süresiydi. Aynı çalışma bağlamında MinerU GPU/VLM, Docling GPU modundan yaklaşık 18,5 kat yavaş ölçüldü. Bu hızla bütün ağır sayfalarda varsayılan motor olarak kullanılması, sayfa se</w:t>
-      </w:r>
-      <w:r>
-        <w:t>çerek maliyet azaltma amacını büyük ölçüde ortadan kaldırır.</w:t>
+        <w:t>Bunun bedeli işlem süresiydi. Aynı çalışma bağlamında MinerU GPU/VLM, Docling GPU modundan yaklaşık 18,5 kat yavaş ölçüldü. Bu hızla bütün ağır sayfalarda varsayılan motor olarak kullanılma</w:t>
+      </w:r>
+      <w:r>
+        <w:t>sı, sayfa seçerek maliyet azaltma amacını büyük ölçüde ortadan kaldırır.</w:t>
       </w:r>
     </w:p>
     <w:p>
@@ -11432,11 +11490,10 @@
         </w:rPr>
       </w:pPr>
       <w:r>
-        <w:lastRenderedPageBreak/>
-        <w:t>Aynı PDF üç kez işlendiğinde çıktıların bayt düzeyinde aynı olması tekrarlanabilirlik açısından olumlu. Lisans tarafında da engel görünmüyor: MinerU Apache-2.0 ile dağıtılıyor ve ek şart olarak ç</w:t>
-      </w:r>
-      <w:r>
-        <w:t>evrimiçi hizmette atıf istiyor; bu çalışmanın ölçeğinde kısıtlayıcı değil.</w:t>
+        <w:t>Aynı PDF üç kez işlendiğinde çıktıların bayt düzeyinde aynı olması tekrarlanabilirlik açısından olumlu. Lisans tarafında da engel görünmüyor: MinerU Apache-2.0 ile dağıtılıyor ve ek ş</w:t>
+      </w:r>
+      <w:r>
+        <w:t>art olarak çevrimiçi hizmette atıf istiyor; bu çalışmanın ölçeğinde kısıtlayıcı değil.</w:t>
       </w:r>
     </w:p>
     <w:p>
@@ -11446,10 +11503,10 @@
         </w:rPr>
       </w:pPr>
       <w:r>
-        <w:t>Buradaki en önemli sınır şu: ölçülen şey yapının zenginliğiydi, doğruluğu değil. MinerU çıktısı referans metinlere karşı puanlanmadı. Yani daha fazla yapı ürettiği gösterildi, ürett</w:t>
-      </w:r>
-      <w:r>
-        <w:t>iği yapının daha doğru olduğu gösterilmedi. Karşılaştırmalı bir doğruluk ölçümü yapılmadan bu motorun Docling'den daha iyi sonuç vereceği söylenemez.</w:t>
+        <w:t>Buradaki en önemli sınır şu: ölçülen şey yapının zenginliğiydi, doğruluğu değil. MinerU çıktısı referans metinlere karşı puanlanmadı. Yani daha fazla yapı ürettiği göste</w:t>
+      </w:r>
+      <w:r>
+        <w:t>rildi, ürettiği yapının daha doğru olduğu gösterilmedi. Karşılaştırmalı bir doğruluk ölçümü yapılmadan bu motorun Docling'den daha iyi sonuç vereceği söylenemez.</w:t>
       </w:r>
     </w:p>
     <w:p>
@@ -11469,7 +11526,7 @@
       <w:pPr>
         <w:pStyle w:val="Balk2"/>
       </w:pPr>
-      <w:bookmarkStart w:id="33" w:name="_Toc238549465"/>
+      <w:bookmarkStart w:id="33" w:name="_Toc238555643"/>
       <w:r>
         <w:t>6.5 Şekilleri ot</w:t>
       </w:r>
@@ -11527,7 +11584,7 @@
           <w:bottom w:val="single" w:sz="8" w:space="5" w:color="207B79"/>
         </w:pBdr>
       </w:pPr>
-      <w:bookmarkStart w:id="34" w:name="_Toc238549466"/>
+      <w:bookmarkStart w:id="34" w:name="_Toc238555644"/>
       <w:r>
         <w:t>7. Uygulama Tercihleri ve Proje Haritası</w:t>
       </w:r>
@@ -11537,7 +11594,7 @@
       <w:pPr>
         <w:pStyle w:val="Balk2"/>
       </w:pPr>
-      <w:bookmarkStart w:id="35" w:name="_Toc238549467"/>
+      <w:bookmarkStart w:id="35" w:name="_Toc238555645"/>
       <w:r>
         <w:t>7.1 Platformla kurulan sınır</w:t>
       </w:r>
@@ -11564,7 +11621,11 @@
         <w:t xml:space="preserve"> arayüzü sunuyor</w:t>
       </w:r>
       <w:r>
-        <w:t>. Sayfa düzeyinde karar, Docling çağrısı, red denetimi, birleştirme ve kaynakla doğrulanan ligatür düzeltmesi bu sınırın içinde kalıyor. Böylece kaynak toplama, pasaj üretme ve arama katmanlarının her motorun ayrıntısını bilmesi gerekmiyor.</w:t>
+        <w:t xml:space="preserve">. Sayfa düzeyinde karar, Docling çağrısı, red denetimi, birleştirme ve kaynakla doğrulanan ligatür </w:t>
+      </w:r>
+      <w:r>
+        <w:lastRenderedPageBreak/>
+        <w:t>düzeltmesi bu sınırın içinde kalıyor. Böylece kaynak toplama, pasaj üretme ve arama katmanlarının her motorun ayrıntısını bilmesi gerekmiyor.</w:t>
       </w:r>
     </w:p>
     <w:p>
@@ -11611,9 +11672,8 @@
       <w:pPr>
         <w:pStyle w:val="Balk2"/>
       </w:pPr>
-      <w:bookmarkStart w:id="36" w:name="_Toc238549468"/>
-      <w:r>
-        <w:lastRenderedPageBreak/>
+      <w:bookmarkStart w:id="36" w:name="_Toc238555646"/>
+      <w:r>
         <w:t>7.2 Proje yapısı ve ölçümlerin izle</w:t>
       </w:r>
       <w:r>
@@ -11660,7 +11720,7 @@
           <w:noProof/>
         </w:rPr>
         <w:drawing>
-          <wp:inline distT="0" distB="0" distL="0" distR="0" wp14:anchorId="726ECD63" wp14:editId="1FCA3685">
+          <wp:inline distT="0" distB="0" distL="0" distR="0" wp14:anchorId="016857B5" wp14:editId="1AF95941">
             <wp:extent cx="5940000" cy="3271586"/>
             <wp:effectExtent l="0" t="0" r="0" b="0"/>
             <wp:docPr id="6" name="Picture 6"/>
@@ -11675,7 +11735,7 @@
                     <pic:cNvPicPr/>
                   </pic:nvPicPr>
                   <pic:blipFill>
-                    <a:blip r:embed="rId15"/>
+                    <a:blip r:embed="rId16"/>
                     <a:stretch>
                       <a:fillRect/>
                     </a:stretch>
@@ -11791,6 +11851,7 @@
                 <w:color w:val="FFFFFF"/>
                 <w:sz w:val="18"/>
               </w:rPr>
+              <w:lastRenderedPageBreak/>
               <w:t>Amaç</w:t>
             </w:r>
           </w:p>
@@ -12261,7 +12322,6 @@
         </w:rPr>
       </w:pPr>
       <w:r>
-        <w:lastRenderedPageBreak/>
         <w:t>Çalışma boyunca birkaç inceleme arayüzü geliştirildi. Bunlar aynı PDF sayfasını farklı parser çıktılarıyla yan yana gösteriyor; sayfa bazındaki yönlendirme gerekçesini ve red denetimini listeliyor; tablo ve şekil kutularını orijinal sayfa üzerine çiziyor.</w:t>
       </w:r>
     </w:p>
@@ -12308,7 +12368,7 @@
       <w:pPr>
         <w:pStyle w:val="Balk2"/>
       </w:pPr>
-      <w:bookmarkStart w:id="37" w:name="_Toc238549469"/>
+      <w:bookmarkStart w:id="37" w:name="_Toc238555647"/>
       <w:r>
         <w:t>7.3 Doğrulanan ve kapsam dışında kalan davranışlar</w:t>
       </w:r>
@@ -12337,13 +12397,13 @@
         </w:rPr>
       </w:pPr>
       <w:r>
-        <w:t xml:space="preserve">Buna karşılık bütün platformun kuyruk, veritabanı, arama ve uzun </w:t>
-      </w:r>
-      <w:r>
-        <w:t>süreli ağır motor işçileriyle canlı ortamda uçtan uca performans testi bu çalışmada tamamlanmadı. Parser bileşeninin çalışması, bütün platformun üretim yükünde aynı davranacağı anlamına gelmiyor. Kalıcı ağır motor işçisi, kuyruk kapasitesi ve uzun belgeler</w:t>
-      </w:r>
-      <w:r>
-        <w:t>de kaynak tüketimi ayrı sistem testleri gerektiriyor.</w:t>
+        <w:t>Buna karşılık bütün platformun kuyruk, veritabanı, arama ve uzun süreli ağı</w:t>
+      </w:r>
+      <w:r>
+        <w:t xml:space="preserve">r motor işçileriyle canlı ortamda uçtan uca performans testi bu çalışmada tamamlanmadı. Parser bileşeninin çalışması, bütün platformun üretim yükünde aynı davranacağı anlamına gelmiyor. Kalıcı ağır motor işçisi, kuyruk kapasitesi ve uzun belgelerde kaynak </w:t>
+      </w:r>
+      <w:r>
+        <w:t>tüketimi ayrı sistem testleri gerektiriyor.</w:t>
       </w:r>
     </w:p>
     <w:p>
@@ -12353,7 +12413,7 @@
           <w:bottom w:val="single" w:sz="8" w:space="5" w:color="207B79"/>
         </w:pBdr>
       </w:pPr>
-      <w:bookmarkStart w:id="38" w:name="_Toc238549470"/>
+      <w:bookmarkStart w:id="38" w:name="_Toc238555648"/>
       <w:r>
         <w:t>8. Genel Değerlendirme ve Açık Konular</w:t>
       </w:r>
@@ -12363,7 +12423,7 @@
       <w:pPr>
         <w:pStyle w:val="Balk2"/>
       </w:pPr>
-      <w:bookmarkStart w:id="39" w:name="_Toc238549471"/>
+      <w:bookmarkStart w:id="39" w:name="_Toc238555649"/>
       <w:r>
         <w:t>8.1 Kararların kısa özeti</w:t>
       </w:r>
@@ -12695,6 +12755,7 @@
               <w:rPr>
                 <w:sz w:val="18"/>
               </w:rPr>
+              <w:lastRenderedPageBreak/>
               <w:t>Ağır motor</w:t>
             </w:r>
           </w:p>
@@ -13318,7 +13379,6 @@
                 <w:color w:val="207B79"/>
                 <w:sz w:val="18"/>
               </w:rPr>
-              <w:lastRenderedPageBreak/>
               <w:t>fi/fl</w:t>
             </w:r>
             <w:r>
@@ -13484,7 +13544,7 @@
       <w:pPr>
         <w:pStyle w:val="Balk2"/>
       </w:pPr>
-      <w:bookmarkStart w:id="40" w:name="_Toc238549472"/>
+      <w:bookmarkStart w:id="40" w:name="_Toc238555650"/>
       <w:r>
         <w:t>8.2 Öncelikli açık konular</w:t>
       </w:r>
@@ -13513,10 +13573,10 @@
         </w:rPr>
       </w:pPr>
       <w:r>
-        <w:t xml:space="preserve">İkinci konu İngilizce OpenDataLoader örneklerindeki negatif net etki. Bu sonuç yalnız eşiğin biraz yüksek veya düşük olduğunu göstermiyor. Ağır motorun bu belgelerdeki hata türleri, router'ın yanlış seçimleri ve </w:t>
-      </w:r>
-      <w:r>
-        <w:t>referans metriğinin etkisi ayrı ayrı incelenmeli. Veri ailesine özel politika düşünülmeden önce farkın kaynağı anlaşılmalı.</w:t>
+        <w:t>İkinci konu İngilizce OpenDataLoader örneklerindeki negatif net etki. Bu sonuç yalnız eşiğin biraz yüksek veya düşük olduğunu göstermiyor. Ağır motorun bu belgelerdeki hata türleri, router'ın yanlış seçimleri ve referans m</w:t>
+      </w:r>
+      <w:r>
+        <w:t>etriğinin etkisi ayrı ayrı incelenmeli. Veri ailesine özel politika düşünülmeden önce farkın kaynağı anlaşılmalı.</w:t>
       </w:r>
     </w:p>
     <w:p>
@@ -13526,10 +13586,10 @@
         </w:rPr>
       </w:pPr>
       <w:r>
-        <w:t xml:space="preserve">Üçüncü konu ağır çıktıyı reddetme sinyali. Tolerans değişikliği gereksiz redlerin çoğunu azalttı, ancak mevcut bozulma skoru gerçek </w:t>
-      </w:r>
-      <w:r>
-        <w:t>faydayla ilişkili değil. Okuma sırası, içerik kapsamı ve tablo korunmasını birlikte değerlendiren yeni bir kabul ölçütü gerekiyor. Bu ölçüt referansa ihtiyaç duymadan çalışmalı, fakat geliştirme aşamasında gerçek faydayla korelasyonu gösterilmelidir.</w:t>
+        <w:t>Üçüncü konu ağır çıktıyı reddetme sinyali. Tolerans değişikliği gereksiz redlerin çoğunu azalttı, ancak mevcut bozulma skoru gerçek faydayla i</w:t>
+      </w:r>
+      <w:r>
+        <w:t>lişkili değil. Okuma sırası, içerik kapsamı ve tablo korunmasını birlikte değerlendiren yeni bir kabul ölçütü gerekiyor. Bu ölçüt referansa ihtiyaç duymadan çalışmalı, fakat geliştirme aşamasında gerçek faydayla korelasyonu gösterilmelidir.</w:t>
       </w:r>
     </w:p>
     <w:p>
@@ -13539,10 +13599,10 @@
         </w:rPr>
       </w:pPr>
       <w:r>
-        <w:t>GPU ç</w:t>
-      </w:r>
-      <w:r>
-        <w:t>alışmasında ağır motorun ham süresi ve kalite korpusunun tamamı ölçüldü; yönlendirilmiş sistemin toplam maliyeti bu birim sürelerden hesaplandı. Ligatür düzeltmesini de içeren güncel kodun doğrudan uçtan uca koşusu henüz alınmadı.</w:t>
+        <w:t>GPU çalışmasınd</w:t>
+      </w:r>
+      <w:r>
+        <w:t>a ağır motorun ham süresi ve kalite korpusunun tamamı ölçüldü; yönlendirilmiş sistemin toplam maliyeti bu birim sürelerden hesaplandı. Ligatür düzeltmesini de içeren güncel kodun doğrudan uçtan uca koşusu henüz alınmadı.</w:t>
       </w:r>
     </w:p>
     <w:p>
@@ -13552,10 +13612,10 @@
         </w:rPr>
       </w:pPr>
       <w:r>
-        <w:t>Tekrarlar arasındaki süre</w:t>
-      </w:r>
-      <w:r>
-        <w:t xml:space="preserve"> değiştiği için hızlanma tek sayı yerine aralık olarak verildi. İlk ortamda gözlenen yedi sayfalık farkın kaynağı da GPU mimarisiyle birlikte Docling sürümü değiştiği için kesin olarak ayrılamadı.</w:t>
+        <w:t>Tekrarlar arasındaki süre değiştiği</w:t>
+      </w:r>
+      <w:r>
+        <w:t xml:space="preserve"> için hızlanma tek sayı yerine aralık olarak verildi. İlk ortamda gözlenen yedi sayfalık farkın kaynağı da GPU mimarisiyle birlikte Docling sürümü değiştiği için kesin olarak ayrılamadı.</w:t>
       </w:r>
     </w:p>
     <w:p>
@@ -13565,13 +13625,13 @@
         </w:rPr>
       </w:pPr>
       <w:r>
-        <w:t>Gerçek taranmış ve çok sayfalı PDF kümesi OCR tarafındaki e</w:t>
-      </w:r>
-      <w:r>
-        <w:t xml:space="preserve">n belirgin veri açığı. Bugünkü sentetik örnek metin katmanı olmayan durumu sınasa da gerçek taramalardaki eğiklik, gürültü, düşük çözünürlük ve karışık metin/görsel sayfalarını temsil etmiyor. OCRTurk'ün tek sayfalı olması da sayfa birleştirme sorunlarını </w:t>
-      </w:r>
-      <w:r>
-        <w:t>açık bırakıyor.</w:t>
+        <w:t>Gerçek taranmış ve çok sayfalı PDF kümesi OCR tarafındaki en belirgin</w:t>
+      </w:r>
+      <w:r>
+        <w:t xml:space="preserve"> veri açığı. Bugünkü sentetik örnek metin katmanı olmayan durumu sınasa da gerçek taramalardaki eğiklik, gürültü, düşük çözünürlük ve karışık metin/görsel sayfalarını temsil etmiyor. OCRTurk'ün tek sayfalı olması da sayfa birleştirme sorunlarını açık bırak</w:t>
+      </w:r>
+      <w:r>
+        <w:t>ıyor.</w:t>
       </w:r>
     </w:p>
     <w:p>
@@ -13592,10 +13652,10 @@
         <w:t>fi/fl</w:t>
       </w:r>
       <w:r>
-        <w:t xml:space="preserve"> kayıplarını güvenli biçimde azaltıyor, ancak bütün yazı tipi ve ligatür türlerini çözdüğü varsayılmamalı. Önceden ayrıştırılmış belgelerin bu düzeltmeden yararlanması için yeniden işlenmesi gerekir. Kalite ara</w:t>
-      </w:r>
-      <w:r>
-        <w:t>yüzleri de yönlendirme ve birleştirme çıktısının yanında üretimdeki son normalizasyonu göstermeli; aksi halde arayüzdeki “seçilen” metin ile nihai parser çıktısı farklılaşabilir.</w:t>
+        <w:t xml:space="preserve"> kayıplarını güvenli biçimde azaltıyor, ancak bütün yazı tipi ve ligatür türlerini çözdüğü varsayılmamalı. Önceden ayrıştırılmış belgelerin bu düzeltmeden yararlanması için yeniden işlenmesi gerekir. Kalite arayüzleri de</w:t>
+      </w:r>
+      <w:r>
+        <w:t xml:space="preserve"> yönlendirme ve birleştirme çıktısının yanında üretimdeki son normalizasyonu göstermeli; aksi halde arayüzdeki “seçilen” metin ile nihai parser çıktısı farklılaşabilir.</w:t>
       </w:r>
     </w:p>
     <w:p>
@@ -13605,20 +13665,21 @@
         </w:rPr>
       </w:pPr>
       <w:r>
-        <w:t>İkinci öncelik grubunda okuma sırası ve sütun geçişini doğrudan ölçen bir düz</w:t>
-      </w:r>
-      <w:r>
-        <w:t xml:space="preserve">en sinyali, Table Transformer'ın yalnız belirsiz sayfalarda görünmez ikinci görüş olarak ölçülmesi, MinerU'nun seçilmiş zor sayfalarda denenmesi ve Docling için kalıcı çalışan havuzu bulunuyor. Formül anlamı, tablo hücresi ilişkisi ve alıntı sadakati gibi </w:t>
-      </w:r>
-      <w:r>
-        <w:t>semantik ölçümler de mevcut yüzey benzerliği metriklerini tamamlamalı.</w:t>
+        <w:lastRenderedPageBreak/>
+        <w:t>İkinci öncelik grubunda okuma sırası ve sütun geçişini doğrudan ölçen bir düzen sinyali</w:t>
+      </w:r>
+      <w:r>
+        <w:t>, Table Transformer'ın yalnız belirsiz sayfalarda görünmez ikinci görüş olarak ölçülmesi, MinerU'nun seçilmiş zor sayfalarda denenmesi ve Docling için kalıcı çalışan havuzu bulunuyor. Formül anlamı, tablo hücresi ilişkisi ve alıntı sadakati gibi semantik ö</w:t>
+      </w:r>
+      <w:r>
+        <w:t>lçümler de mevcut yüzey benzerliği metriklerini tamamlamalı.</w:t>
       </w:r>
     </w:p>
     <w:p>
       <w:pPr>
         <w:pStyle w:val="Balk2"/>
       </w:pPr>
-      <w:bookmarkStart w:id="41" w:name="_Toc238549473"/>
+      <w:bookmarkStart w:id="41" w:name="_Toc238555651"/>
       <w:r>
         <w:t>8.3 Sonuç</w:t>
       </w:r>
@@ -13631,10 +13692,10 @@
         </w:rPr>
       </w:pPr>
       <w:r>
-        <w:t>Çalışma, hazır parser'ları sıralayan tek bir benchmark olarak kalmadı. Farklı motorların güçlü yanlarını birleştiren, sayfa düzeyinde karar veren ve kararın izini sonuçla birl</w:t>
-      </w:r>
-      <w:r>
-        <w:t>ikte taşıyan çalışan bir PDF hattına dönüştü. Hızlı motor temiz sayfaların maliyetini düşük tutarken ağır motor tablo, OCR ve karmaşık düzen bulunan sayfalarda seçici biçimde kullanılabiliyor.</w:t>
+        <w:t>Çalışma, hazır parser'ları sıralayan tek bir benchmark olarak kalmadı. Farklı motorların güçlü yanlarını birleştiren, sayfa düzeyinde karar veren ve kararın izini sonuçla birlikte taşıy</w:t>
+      </w:r>
+      <w:r>
+        <w:t>an çalışan bir PDF hattına dönüştü. Hızlı motor temiz sayfaların maliyetini düşük tutarken ağır motor tablo, OCR ve karmaşık düzen bulunan sayfalarda seçici biçimde kullanılabiliyor.</w:t>
       </w:r>
     </w:p>
     <w:p>
@@ -13644,17 +13705,13 @@
         </w:rPr>
       </w:pPr>
       <w:r>
-        <w:t>Ölçümler aynı zamanda sistemin sınırlarını da görünür hale geti</w:t>
-      </w:r>
-      <w:r>
-        <w:t xml:space="preserve">rdi. OCRTurk veri ailesinde yönlendirme ölçülebilir fayda sağladı, fakat İngilizce OpenDataLoader örneklerinde ortak politika </w:t>
-      </w:r>
-      <w:r>
-        <w:lastRenderedPageBreak/>
-        <w:t xml:space="preserve">zarar verdi. Tablo sinyali yüksek yakalama sağlıyor ancak gereksiz ağır çağrı üretmeye devam ediyor. Red denetiminin yanlış karar </w:t>
-      </w:r>
-      <w:r>
-        <w:t>alanı daraltıldı, buna karşılık gerçek faydayı ayırma gücü zayıf kaldı.</w:t>
+        <w:t>Ölçümler aynı zamanda sistemin sınırlarını da görünür hale getirdi. OCRTu</w:t>
+      </w:r>
+      <w:r>
+        <w:t>rk veri ailesinde yönlendirme ölçülebilir fayda sağladı, fakat İngilizce OpenDataLoader örneklerinde ortak politika zarar verdi. Tablo sinyali yüksek yakalama sağlıyor ancak gereksiz ağır çağrı üretmeye devam ediyor. Red denetiminin yanlış karar alanı dara</w:t>
+      </w:r>
+      <w:r>
+        <w:t>ltıldı, buna karşılık gerçek faydayı ayırma gücü zayıf kaldı.</w:t>
       </w:r>
     </w:p>
     <w:p>
@@ -13664,13 +13721,13 @@
         </w:rPr>
       </w:pPr>
       <w:r>
-        <w:t xml:space="preserve">Bu nedenle bugünkü sonuç, eşikleri kesinleştirip bütün belgelere uygulamak biçiminde değil. Daha doğru sonuç, sayfa düzeyinde yönlendirme mimarisinin çalıştığı; ancak sinyallerin veri </w:t>
-      </w:r>
-      <w:r>
-        <w:t>ailelerine göre geliştirilmesi ve bağımsız belgeler üzerinde yeniden doğrulanması gerektiğidir. Ağır motorun GPU maliyeti ölçüldü ve güncel dağılım için toplam maliyet hesaplandı. Gerçek OCR kümesi, yeni kabul sinyali ve güncel kodla doğrudan uçtan uca koş</w:t>
-      </w:r>
-      <w:r>
-        <w:t>u eklendiğinde kalite ile maliyet dengesi daha güvenilir biçimde değerlendirilebilir.</w:t>
+        <w:t>Bu nedenle bugünkü sonuç, eşikleri kesinleştirip bütün belgelere uygulamak biçiminde değil. Daha doğru sonuç, sayfa düzeyinde yönlendirme mimarisinin çalıştığı; ancak sinyallerin veri ailelerine</w:t>
+      </w:r>
+      <w:r>
+        <w:t xml:space="preserve"> göre geliştirilmesi ve bağımsız belgeler üzerinde yeniden doğrulanması gerektiğidir. Ağır motorun GPU maliyeti ölçüldü ve güncel dağılım için toplam maliyet hesaplandı. Gerçek OCR kümesi, yeni kabul sinyali ve güncel kodla doğrudan uçtan uca koşu eklendiğ</w:t>
+      </w:r>
+      <w:r>
+        <w:t>inde kalite ile maliyet dengesi daha güvenilir biçimde değerlendirilebilir.</w:t>
       </w:r>
     </w:p>
     <w:p>
@@ -13680,7 +13737,7 @@
           <w:bottom w:val="single" w:sz="8" w:space="5" w:color="207B79"/>
         </w:pBdr>
       </w:pPr>
-      <w:bookmarkStart w:id="42" w:name="_Toc238549474"/>
+      <w:bookmarkStart w:id="42" w:name="_Toc238555652"/>
       <w:r>
         <w:t>Ek A. Ölçüm Notu</w:t>
       </w:r>
@@ -13693,10 +13750,10 @@
         </w:rPr>
       </w:pPr>
       <w:r>
-        <w:t xml:space="preserve">Rapordaki sayısal sonuçlar, proje deposundaki benchmark kayıtları, yönlendirme koşuları ve GPU ölçümlerinden kontrol edilerek aktarıldı. Ayrıntılı deney </w:t>
-      </w:r>
-      <w:r>
-        <w:t>çıktıları araştırma alanında, güncel mimari ve yapılandırma ise uygulama alanında tutuluyor. Metnin bağımsız okunabilmesi için tek tek dosya adları ana akışa taşınmadı.</w:t>
+        <w:t xml:space="preserve">Rapordaki sayısal sonuçlar, proje deposundaki benchmark kayıtları, yönlendirme koşuları ve GPU ölçümlerinden kontrol edilerek aktarıldı. Ayrıntılı deney çıktıları </w:t>
+      </w:r>
+      <w:r>
+        <w:t>araştırma alanında, güncel mimari ve yapılandırma ise uygulama alanında tutuluyor. Metnin bağımsız okunabilmesi için tek tek dosya adları ana akışa taşınmadı.</w:t>
       </w:r>
     </w:p>
     <w:p>
@@ -13706,18 +13763,18 @@
         </w:rPr>
       </w:pPr>
       <w:r>
-        <w:t>OpenDataLoader benchmark ile C1 birleşik fayda puanı aynı ölçüm değildir. Benchmark oku</w:t>
-      </w:r>
-      <w:r>
-        <w:t>ma sırası, tablo ve başlık yapısını ortak bir değerlendirme çerçevesinde inceler. C1 puanı ise hızlı, ağır ve yönlendirilmiş çıktıyı referans metne göre karşılaştırmak için proje içinde oluşturulmuştur. Bu nedenle iki sayı grubu rapor boyunca ayrı bağlamla</w:t>
-      </w:r>
-      <w:r>
-        <w:t>rda yorumlandı.</w:t>
+        <w:t>OpenDataLoader benchmark ile C1 birleşik fayda puanı aynı ölçüm değildir. Benchmark okuma sırası,</w:t>
+      </w:r>
+      <w:r>
+        <w:t xml:space="preserve"> tablo ve başlık yapısını ortak bir değerlendirme çerçevesinde inceler. C1 puanı ise hızlı, ağır ve yönlendirilmiş çıktıyı referans metne göre karşılaştırmak için proje içinde oluşturulmuştur. Bu nedenle iki sayı grubu rapor boyunca ayrı bağlamlarda yoruml</w:t>
+      </w:r>
+      <w:r>
+        <w:t>andı.</w:t>
       </w:r>
     </w:p>
     <w:sectPr>
-      <w:headerReference w:type="default" r:id="rId16"/>
-      <w:footerReference w:type="default" r:id="rId17"/>
+      <w:headerReference w:type="default" r:id="rId17"/>
+      <w:footerReference w:type="default" r:id="rId18"/>
       <w:pgSz w:w="11906" w:h="16838"/>
       <w:pgMar w:top="1077" w:right="1219" w:bottom="1049" w:left="1219" w:header="454" w:footer="454" w:gutter="0"/>
       <w:cols w:space="720"/>
@@ -25554,7 +25611,7 @@
     <w:autoRedefine/>
     <w:uiPriority w:val="39"/>
     <w:unhideWhenUsed/>
-    <w:rsid w:val="00CB4C6E"/>
+    <w:rsid w:val="003E0650"/>
     <w:pPr>
       <w:spacing w:after="0" w:line="240" w:lineRule="auto"/>
     </w:pPr>
@@ -25569,7 +25626,7 @@
     <w:autoRedefine/>
     <w:uiPriority w:val="39"/>
     <w:unhideWhenUsed/>
-    <w:rsid w:val="00CB4C6E"/>
+    <w:rsid w:val="003E0650"/>
     <w:pPr>
       <w:spacing w:after="0" w:line="240" w:lineRule="auto"/>
       <w:ind w:left="220"/>
@@ -25585,7 +25642,7 @@
     <w:autoRedefine/>
     <w:uiPriority w:val="39"/>
     <w:unhideWhenUsed/>
-    <w:rsid w:val="00CB4C6E"/>
+    <w:rsid w:val="003E0650"/>
     <w:pPr>
       <w:spacing w:after="0" w:line="240" w:lineRule="auto"/>
       <w:ind w:left="440"/>
@@ -25599,7 +25656,7 @@
     <w:basedOn w:val="VarsaylanParagrafYazTipi"/>
     <w:uiPriority w:val="99"/>
     <w:unhideWhenUsed/>
-    <w:rsid w:val="00CB4C6E"/>
+    <w:rsid w:val="003E0650"/>
     <w:rPr>
       <w:color w:val="0000FF" w:themeColor="hyperlink"/>
       <w:u w:val="single"/>

</xml_diff>

<commit_message>
docs(pdf-parser): shorten open issues
</commit_message>
<xml_diff>
--- a/research/pdf-parser/reports/PDF_Parser_Degerlendirme_ve_Yonlendirme_Raporu_Agustos_2026.docx
+++ b/research/pdf-parser/reports/PDF_Parser_Degerlendirme_ve_Yonlendirme_Raporu_Agustos_2026.docx
@@ -139,7 +139,7 @@
       <w:r>
         <w:fldChar w:fldCharType="separate"/>
       </w:r>
-      <w:hyperlink w:anchor="_Toc238558080" w:history="1">
+      <w:hyperlink w:anchor="_Toc238558226" w:history="1">
         <w:r>
           <w:rPr>
             <w:rStyle w:val="Kpr"/>
@@ -166,7 +166,7 @@
             <w:noProof/>
             <w:webHidden/>
           </w:rPr>
-          <w:instrText xml:space="preserve"> PAGEREF _Toc238558080 \h </w:instrText>
+          <w:instrText xml:space="preserve"> PAGEREF _Toc238558226 \h </w:instrText>
         </w:r>
         <w:r>
           <w:rPr>
@@ -213,7 +213,7 @@
           <w:lang w:val="tr-TR" w:eastAsia="tr-TR"/>
         </w:rPr>
       </w:pPr>
-      <w:hyperlink w:anchor="_Toc238558081" w:history="1">
+      <w:hyperlink w:anchor="_Toc238558227" w:history="1">
         <w:r>
           <w:rPr>
             <w:rStyle w:val="Kpr"/>
@@ -240,7 +240,7 @@
             <w:noProof/>
             <w:webHidden/>
           </w:rPr>
-          <w:instrText xml:space="preserve"> PAGEREF _Toc238558081 \h </w:instrText>
+          <w:instrText xml:space="preserve"> PAGEREF _Toc238558227 \h </w:instrText>
         </w:r>
         <w:r>
           <w:rPr>
@@ -287,7 +287,7 @@
           <w:lang w:val="tr-TR" w:eastAsia="tr-TR"/>
         </w:rPr>
       </w:pPr>
-      <w:hyperlink w:anchor="_Toc238558082" w:history="1">
+      <w:hyperlink w:anchor="_Toc238558228" w:history="1">
         <w:r>
           <w:rPr>
             <w:rStyle w:val="Kpr"/>
@@ -314,7 +314,7 @@
             <w:noProof/>
             <w:webHidden/>
           </w:rPr>
-          <w:instrText xml:space="preserve"> PAGEREF _Toc238558082 \h </w:instrText>
+          <w:instrText xml:space="preserve"> PAGEREF _Toc238558228 \h </w:instrText>
         </w:r>
         <w:r>
           <w:rPr>
@@ -361,7 +361,7 @@
           <w:lang w:val="tr-TR" w:eastAsia="tr-TR"/>
         </w:rPr>
       </w:pPr>
-      <w:hyperlink w:anchor="_Toc238558083" w:history="1">
+      <w:hyperlink w:anchor="_Toc238558229" w:history="1">
         <w:r>
           <w:rPr>
             <w:rStyle w:val="Kpr"/>
@@ -388,7 +388,7 @@
             <w:noProof/>
             <w:webHidden/>
           </w:rPr>
-          <w:instrText xml:space="preserve"> PAGEREF _Toc238558083 \h </w:instrText>
+          <w:instrText xml:space="preserve"> PAGEREF _Toc238558229 \h </w:instrText>
         </w:r>
         <w:r>
           <w:rPr>
@@ -435,7 +435,7 @@
           <w:lang w:val="tr-TR" w:eastAsia="tr-TR"/>
         </w:rPr>
       </w:pPr>
-      <w:hyperlink w:anchor="_Toc238558084" w:history="1">
+      <w:hyperlink w:anchor="_Toc238558230" w:history="1">
         <w:r>
           <w:rPr>
             <w:rStyle w:val="Kpr"/>
@@ -462,7 +462,7 @@
             <w:noProof/>
             <w:webHidden/>
           </w:rPr>
-          <w:instrText xml:space="preserve"> PAGEREF _Toc238558084 \h </w:instrText>
+          <w:instrText xml:space="preserve"> PAGEREF _Toc238558230 \h </w:instrText>
         </w:r>
         <w:r>
           <w:rPr>
@@ -509,7 +509,7 @@
           <w:lang w:val="tr-TR" w:eastAsia="tr-TR"/>
         </w:rPr>
       </w:pPr>
-      <w:hyperlink w:anchor="_Toc238558085" w:history="1">
+      <w:hyperlink w:anchor="_Toc238558231" w:history="1">
         <w:r>
           <w:rPr>
             <w:rStyle w:val="Kpr"/>
@@ -536,7 +536,7 @@
             <w:noProof/>
             <w:webHidden/>
           </w:rPr>
-          <w:instrText xml:space="preserve"> PAGEREF _Toc238558085 \h </w:instrText>
+          <w:instrText xml:space="preserve"> PAGEREF _Toc238558231 \h </w:instrText>
         </w:r>
         <w:r>
           <w:rPr>
@@ -583,7 +583,7 @@
           <w:lang w:val="tr-TR" w:eastAsia="tr-TR"/>
         </w:rPr>
       </w:pPr>
-      <w:hyperlink w:anchor="_Toc238558086" w:history="1">
+      <w:hyperlink w:anchor="_Toc238558232" w:history="1">
         <w:r>
           <w:rPr>
             <w:rStyle w:val="Kpr"/>
@@ -610,7 +610,7 @@
             <w:noProof/>
             <w:webHidden/>
           </w:rPr>
-          <w:instrText xml:space="preserve"> PAGEREF _Toc238558086 \h </w:instrText>
+          <w:instrText xml:space="preserve"> PAGEREF _Toc238558232 \h </w:instrText>
         </w:r>
         <w:r>
           <w:rPr>
@@ -657,7 +657,7 @@
           <w:lang w:val="tr-TR" w:eastAsia="tr-TR"/>
         </w:rPr>
       </w:pPr>
-      <w:hyperlink w:anchor="_Toc238558087" w:history="1">
+      <w:hyperlink w:anchor="_Toc238558233" w:history="1">
         <w:r>
           <w:rPr>
             <w:rStyle w:val="Kpr"/>
@@ -684,7 +684,7 @@
             <w:noProof/>
             <w:webHidden/>
           </w:rPr>
-          <w:instrText xml:space="preserve"> PAGEREF _Toc238558087 \h </w:instrText>
+          <w:instrText xml:space="preserve"> PAGEREF _Toc238558233 \h </w:instrText>
         </w:r>
         <w:r>
           <w:rPr>
@@ -731,7 +731,7 @@
           <w:lang w:val="tr-TR" w:eastAsia="tr-TR"/>
         </w:rPr>
       </w:pPr>
-      <w:hyperlink w:anchor="_Toc238558088" w:history="1">
+      <w:hyperlink w:anchor="_Toc238558234" w:history="1">
         <w:r>
           <w:rPr>
             <w:rStyle w:val="Kpr"/>
@@ -758,7 +758,7 @@
             <w:noProof/>
             <w:webHidden/>
           </w:rPr>
-          <w:instrText xml:space="preserve"> PAGEREF _Toc238558088 \h </w:instrText>
+          <w:instrText xml:space="preserve"> PAGEREF _Toc238558234 \h </w:instrText>
         </w:r>
         <w:r>
           <w:rPr>
@@ -805,7 +805,7 @@
           <w:lang w:val="tr-TR" w:eastAsia="tr-TR"/>
         </w:rPr>
       </w:pPr>
-      <w:hyperlink w:anchor="_Toc238558089" w:history="1">
+      <w:hyperlink w:anchor="_Toc238558235" w:history="1">
         <w:r>
           <w:rPr>
             <w:rStyle w:val="Kpr"/>
@@ -832,7 +832,7 @@
             <w:noProof/>
             <w:webHidden/>
           </w:rPr>
-          <w:instrText xml:space="preserve"> PAGEREF _Toc238558089 \h </w:instrText>
+          <w:instrText xml:space="preserve"> PAGEREF _Toc238558235 \h </w:instrText>
         </w:r>
         <w:r>
           <w:rPr>
@@ -879,7 +879,7 @@
           <w:lang w:val="tr-TR" w:eastAsia="tr-TR"/>
         </w:rPr>
       </w:pPr>
-      <w:hyperlink w:anchor="_Toc238558090" w:history="1">
+      <w:hyperlink w:anchor="_Toc238558236" w:history="1">
         <w:r>
           <w:rPr>
             <w:rStyle w:val="Kpr"/>
@@ -906,7 +906,7 @@
             <w:noProof/>
             <w:webHidden/>
           </w:rPr>
-          <w:instrText xml:space="preserve"> PAGEREF _Toc238558090 \h </w:instrText>
+          <w:instrText xml:space="preserve"> PAGEREF _Toc238558236 \h </w:instrText>
         </w:r>
         <w:r>
           <w:rPr>
@@ -953,7 +953,7 @@
           <w:lang w:val="tr-TR" w:eastAsia="tr-TR"/>
         </w:rPr>
       </w:pPr>
-      <w:hyperlink w:anchor="_Toc238558091" w:history="1">
+      <w:hyperlink w:anchor="_Toc238558237" w:history="1">
         <w:r>
           <w:rPr>
             <w:rStyle w:val="Kpr"/>
@@ -980,7 +980,7 @@
             <w:noProof/>
             <w:webHidden/>
           </w:rPr>
-          <w:instrText xml:space="preserve"> PAGEREF _Toc238558091 \h </w:instrText>
+          <w:instrText xml:space="preserve"> PAGEREF _Toc238558237 \h </w:instrText>
         </w:r>
         <w:r>
           <w:rPr>
@@ -1027,7 +1027,7 @@
           <w:lang w:val="tr-TR" w:eastAsia="tr-TR"/>
         </w:rPr>
       </w:pPr>
-      <w:hyperlink w:anchor="_Toc238558092" w:history="1">
+      <w:hyperlink w:anchor="_Toc238558238" w:history="1">
         <w:r>
           <w:rPr>
             <w:rStyle w:val="Kpr"/>
@@ -1054,7 +1054,7 @@
             <w:noProof/>
             <w:webHidden/>
           </w:rPr>
-          <w:instrText xml:space="preserve"> PAGEREF _Toc238558092 \h </w:instrText>
+          <w:instrText xml:space="preserve"> PAGEREF _Toc238558238 \h </w:instrText>
         </w:r>
         <w:r>
           <w:rPr>
@@ -1101,7 +1101,7 @@
           <w:lang w:val="tr-TR" w:eastAsia="tr-TR"/>
         </w:rPr>
       </w:pPr>
-      <w:hyperlink w:anchor="_Toc238558093" w:history="1">
+      <w:hyperlink w:anchor="_Toc238558239" w:history="1">
         <w:r>
           <w:rPr>
             <w:rStyle w:val="Kpr"/>
@@ -1128,7 +1128,7 @@
             <w:noProof/>
             <w:webHidden/>
           </w:rPr>
-          <w:instrText xml:space="preserve"> PAGEREF _Toc238558093 \h </w:instrText>
+          <w:instrText xml:space="preserve"> PAGEREF _Toc238558239 \h </w:instrText>
         </w:r>
         <w:r>
           <w:rPr>
@@ -1175,7 +1175,7 @@
           <w:lang w:val="tr-TR" w:eastAsia="tr-TR"/>
         </w:rPr>
       </w:pPr>
-      <w:hyperlink w:anchor="_Toc238558094" w:history="1">
+      <w:hyperlink w:anchor="_Toc238558240" w:history="1">
         <w:r>
           <w:rPr>
             <w:rStyle w:val="Kpr"/>
@@ -1202,7 +1202,7 @@
             <w:noProof/>
             <w:webHidden/>
           </w:rPr>
-          <w:instrText xml:space="preserve"> PAGEREF _Toc238558094 \h </w:instrText>
+          <w:instrText xml:space="preserve"> PAGEREF _Toc238558240 \h </w:instrText>
         </w:r>
         <w:r>
           <w:rPr>
@@ -1249,7 +1249,7 @@
           <w:lang w:val="tr-TR" w:eastAsia="tr-TR"/>
         </w:rPr>
       </w:pPr>
-      <w:hyperlink w:anchor="_Toc238558095" w:history="1">
+      <w:hyperlink w:anchor="_Toc238558241" w:history="1">
         <w:r>
           <w:rPr>
             <w:rStyle w:val="Kpr"/>
@@ -1276,7 +1276,7 @@
             <w:noProof/>
             <w:webHidden/>
           </w:rPr>
-          <w:instrText xml:space="preserve"> PAGEREF _Toc238558095 \h </w:instrText>
+          <w:instrText xml:space="preserve"> PAGEREF _Toc238558241 \h </w:instrText>
         </w:r>
         <w:r>
           <w:rPr>
@@ -1323,7 +1323,7 @@
           <w:lang w:val="tr-TR" w:eastAsia="tr-TR"/>
         </w:rPr>
       </w:pPr>
-      <w:hyperlink w:anchor="_Toc238558096" w:history="1">
+      <w:hyperlink w:anchor="_Toc238558242" w:history="1">
         <w:r>
           <w:rPr>
             <w:rStyle w:val="Kpr"/>
@@ -1350,7 +1350,7 @@
             <w:noProof/>
             <w:webHidden/>
           </w:rPr>
-          <w:instrText xml:space="preserve"> PAGEREF _Toc238558096 \h </w:instrText>
+          <w:instrText xml:space="preserve"> PAGEREF _Toc238558242 \h </w:instrText>
         </w:r>
         <w:r>
           <w:rPr>
@@ -1397,7 +1397,7 @@
           <w:lang w:val="tr-TR" w:eastAsia="tr-TR"/>
         </w:rPr>
       </w:pPr>
-      <w:hyperlink w:anchor="_Toc238558097" w:history="1">
+      <w:hyperlink w:anchor="_Toc238558243" w:history="1">
         <w:r>
           <w:rPr>
             <w:rStyle w:val="Kpr"/>
@@ -1424,7 +1424,7 @@
             <w:noProof/>
             <w:webHidden/>
           </w:rPr>
-          <w:instrText xml:space="preserve"> PAGEREF _Toc238558097 \h </w:instrText>
+          <w:instrText xml:space="preserve"> PAGEREF _Toc238558243 \h </w:instrText>
         </w:r>
         <w:r>
           <w:rPr>
@@ -1471,7 +1471,7 @@
           <w:lang w:val="tr-TR" w:eastAsia="tr-TR"/>
         </w:rPr>
       </w:pPr>
-      <w:hyperlink w:anchor="_Toc238558098" w:history="1">
+      <w:hyperlink w:anchor="_Toc238558244" w:history="1">
         <w:r>
           <w:rPr>
             <w:rStyle w:val="Kpr"/>
@@ -1498,7 +1498,7 @@
             <w:noProof/>
             <w:webHidden/>
           </w:rPr>
-          <w:instrText xml:space="preserve"> PAGEREF _Toc238558098 \h </w:instrText>
+          <w:instrText xml:space="preserve"> PAGEREF _Toc238558244 \h </w:instrText>
         </w:r>
         <w:r>
           <w:rPr>
@@ -1545,7 +1545,7 @@
           <w:lang w:val="tr-TR" w:eastAsia="tr-TR"/>
         </w:rPr>
       </w:pPr>
-      <w:hyperlink w:anchor="_Toc238558099" w:history="1">
+      <w:hyperlink w:anchor="_Toc238558245" w:history="1">
         <w:r>
           <w:rPr>
             <w:rStyle w:val="Kpr"/>
@@ -1572,7 +1572,7 @@
             <w:noProof/>
             <w:webHidden/>
           </w:rPr>
-          <w:instrText xml:space="preserve"> PAGEREF _Toc238558099 \h </w:instrText>
+          <w:instrText xml:space="preserve"> PAGEREF _Toc238558245 \h </w:instrText>
         </w:r>
         <w:r>
           <w:rPr>
@@ -1619,7 +1619,7 @@
           <w:lang w:val="tr-TR" w:eastAsia="tr-TR"/>
         </w:rPr>
       </w:pPr>
-      <w:hyperlink w:anchor="_Toc238558100" w:history="1">
+      <w:hyperlink w:anchor="_Toc238558246" w:history="1">
         <w:r>
           <w:rPr>
             <w:rStyle w:val="Kpr"/>
@@ -1646,7 +1646,7 @@
             <w:noProof/>
             <w:webHidden/>
           </w:rPr>
-          <w:instrText xml:space="preserve"> PAGEREF _Toc238558100 \h </w:instrText>
+          <w:instrText xml:space="preserve"> PAGEREF _Toc238558246 \h </w:instrText>
         </w:r>
         <w:r>
           <w:rPr>
@@ -1693,7 +1693,7 @@
           <w:lang w:val="tr-TR" w:eastAsia="tr-TR"/>
         </w:rPr>
       </w:pPr>
-      <w:hyperlink w:anchor="_Toc238558101" w:history="1">
+      <w:hyperlink w:anchor="_Toc238558247" w:history="1">
         <w:r>
           <w:rPr>
             <w:rStyle w:val="Kpr"/>
@@ -1720,7 +1720,7 @@
             <w:noProof/>
             <w:webHidden/>
           </w:rPr>
-          <w:instrText xml:space="preserve"> PAGEREF _Toc238558101 \h </w:instrText>
+          <w:instrText xml:space="preserve"> PAGEREF _Toc238558247 \h </w:instrText>
         </w:r>
         <w:r>
           <w:rPr>
@@ -1767,7 +1767,7 @@
           <w:lang w:val="tr-TR" w:eastAsia="tr-TR"/>
         </w:rPr>
       </w:pPr>
-      <w:hyperlink w:anchor="_Toc238558102" w:history="1">
+      <w:hyperlink w:anchor="_Toc238558248" w:history="1">
         <w:r>
           <w:rPr>
             <w:rStyle w:val="Kpr"/>
@@ -1794,7 +1794,7 @@
             <w:noProof/>
             <w:webHidden/>
           </w:rPr>
-          <w:instrText xml:space="preserve"> PAGEREF _Toc238558102 \h </w:instrText>
+          <w:instrText xml:space="preserve"> PAGEREF _Toc238558248 \h </w:instrText>
         </w:r>
         <w:r>
           <w:rPr>
@@ -1841,7 +1841,7 @@
           <w:lang w:val="tr-TR" w:eastAsia="tr-TR"/>
         </w:rPr>
       </w:pPr>
-      <w:hyperlink w:anchor="_Toc238558103" w:history="1">
+      <w:hyperlink w:anchor="_Toc238558249" w:history="1">
         <w:r>
           <w:rPr>
             <w:rStyle w:val="Kpr"/>
@@ -1868,7 +1868,7 @@
             <w:noProof/>
             <w:webHidden/>
           </w:rPr>
-          <w:instrText xml:space="preserve"> PAGEREF _Toc238558103 \h </w:instrText>
+          <w:instrText xml:space="preserve"> PAGEREF _Toc238558249 \h </w:instrText>
         </w:r>
         <w:r>
           <w:rPr>
@@ -1915,7 +1915,7 @@
           <w:lang w:val="tr-TR" w:eastAsia="tr-TR"/>
         </w:rPr>
       </w:pPr>
-      <w:hyperlink w:anchor="_Toc238558104" w:history="1">
+      <w:hyperlink w:anchor="_Toc238558250" w:history="1">
         <w:r>
           <w:rPr>
             <w:rStyle w:val="Kpr"/>
@@ -1942,7 +1942,7 @@
             <w:noProof/>
             <w:webHidden/>
           </w:rPr>
-          <w:instrText xml:space="preserve"> PAGEREF _Toc238558104 \h </w:instrText>
+          <w:instrText xml:space="preserve"> PAGEREF _Toc238558250 \h </w:instrText>
         </w:r>
         <w:r>
           <w:rPr>
@@ -1989,7 +1989,7 @@
           <w:lang w:val="tr-TR" w:eastAsia="tr-TR"/>
         </w:rPr>
       </w:pPr>
-      <w:hyperlink w:anchor="_Toc238558105" w:history="1">
+      <w:hyperlink w:anchor="_Toc238558251" w:history="1">
         <w:r>
           <w:rPr>
             <w:rStyle w:val="Kpr"/>
@@ -2016,7 +2016,7 @@
             <w:noProof/>
             <w:webHidden/>
           </w:rPr>
-          <w:instrText xml:space="preserve"> PAGEREF _Toc238558105 \h </w:instrText>
+          <w:instrText xml:space="preserve"> PAGEREF _Toc238558251 \h </w:instrText>
         </w:r>
         <w:r>
           <w:rPr>
@@ -2063,7 +2063,7 @@
           <w:lang w:val="tr-TR" w:eastAsia="tr-TR"/>
         </w:rPr>
       </w:pPr>
-      <w:hyperlink w:anchor="_Toc238558106" w:history="1">
+      <w:hyperlink w:anchor="_Toc238558252" w:history="1">
         <w:r>
           <w:rPr>
             <w:rStyle w:val="Kpr"/>
@@ -2090,7 +2090,7 @@
             <w:noProof/>
             <w:webHidden/>
           </w:rPr>
-          <w:instrText xml:space="preserve"> PAGEREF _Toc238558106 \h </w:instrText>
+          <w:instrText xml:space="preserve"> PAGEREF _Toc238558252 \h </w:instrText>
         </w:r>
         <w:r>
           <w:rPr>
@@ -2137,7 +2137,7 @@
           <w:lang w:val="tr-TR" w:eastAsia="tr-TR"/>
         </w:rPr>
       </w:pPr>
-      <w:hyperlink w:anchor="_Toc238558107" w:history="1">
+      <w:hyperlink w:anchor="_Toc238558253" w:history="1">
         <w:r>
           <w:rPr>
             <w:rStyle w:val="Kpr"/>
@@ -2164,7 +2164,7 @@
             <w:noProof/>
             <w:webHidden/>
           </w:rPr>
-          <w:instrText xml:space="preserve"> PAGEREF _Toc238558107 \h </w:instrText>
+          <w:instrText xml:space="preserve"> PAGEREF _Toc238558253 \h </w:instrText>
         </w:r>
         <w:r>
           <w:rPr>
@@ -2211,7 +2211,7 @@
           <w:lang w:val="tr-TR" w:eastAsia="tr-TR"/>
         </w:rPr>
       </w:pPr>
-      <w:hyperlink w:anchor="_Toc238558108" w:history="1">
+      <w:hyperlink w:anchor="_Toc238558254" w:history="1">
         <w:r>
           <w:rPr>
             <w:rStyle w:val="Kpr"/>
@@ -2238,7 +2238,7 @@
             <w:noProof/>
             <w:webHidden/>
           </w:rPr>
-          <w:instrText xml:space="preserve"> PAGEREF _Toc238558108 \h </w:instrText>
+          <w:instrText xml:space="preserve"> PAGEREF _Toc238558254 \h </w:instrText>
         </w:r>
         <w:r>
           <w:rPr>
@@ -2285,7 +2285,7 @@
           <w:lang w:val="tr-TR" w:eastAsia="tr-TR"/>
         </w:rPr>
       </w:pPr>
-      <w:hyperlink w:anchor="_Toc238558109" w:history="1">
+      <w:hyperlink w:anchor="_Toc238558255" w:history="1">
         <w:r>
           <w:rPr>
             <w:rStyle w:val="Kpr"/>
@@ -2312,7 +2312,7 @@
             <w:noProof/>
             <w:webHidden/>
           </w:rPr>
-          <w:instrText xml:space="preserve"> PAGEREF _Toc238558109 \h </w:instrText>
+          <w:instrText xml:space="preserve"> PAGEREF _Toc238558255 \h </w:instrText>
         </w:r>
         <w:r>
           <w:rPr>
@@ -2359,7 +2359,7 @@
           <w:lang w:val="tr-TR" w:eastAsia="tr-TR"/>
         </w:rPr>
       </w:pPr>
-      <w:hyperlink w:anchor="_Toc238558110" w:history="1">
+      <w:hyperlink w:anchor="_Toc238558256" w:history="1">
         <w:r>
           <w:rPr>
             <w:rStyle w:val="Kpr"/>
@@ -2386,7 +2386,7 @@
             <w:noProof/>
             <w:webHidden/>
           </w:rPr>
-          <w:instrText xml:space="preserve"> PAGEREF _Toc238558110 \h </w:instrText>
+          <w:instrText xml:space="preserve"> PAGEREF _Toc238558256 \h </w:instrText>
         </w:r>
         <w:r>
           <w:rPr>
@@ -2433,7 +2433,7 @@
           <w:lang w:val="tr-TR" w:eastAsia="tr-TR"/>
         </w:rPr>
       </w:pPr>
-      <w:hyperlink w:anchor="_Toc238558111" w:history="1">
+      <w:hyperlink w:anchor="_Toc238558257" w:history="1">
         <w:r>
           <w:rPr>
             <w:rStyle w:val="Kpr"/>
@@ -2460,7 +2460,7 @@
             <w:noProof/>
             <w:webHidden/>
           </w:rPr>
-          <w:instrText xml:space="preserve"> PAGEREF _Toc238558111 \h </w:instrText>
+          <w:instrText xml:space="preserve"> PAGEREF _Toc238558257 \h </w:instrText>
         </w:r>
         <w:r>
           <w:rPr>
@@ -2507,7 +2507,7 @@
           <w:lang w:val="tr-TR" w:eastAsia="tr-TR"/>
         </w:rPr>
       </w:pPr>
-      <w:hyperlink w:anchor="_Toc238558112" w:history="1">
+      <w:hyperlink w:anchor="_Toc238558258" w:history="1">
         <w:r>
           <w:rPr>
             <w:rStyle w:val="Kpr"/>
@@ -2534,7 +2534,7 @@
             <w:noProof/>
             <w:webHidden/>
           </w:rPr>
-          <w:instrText xml:space="preserve"> PAGEREF _Toc238558112 \h </w:instrText>
+          <w:instrText xml:space="preserve"> PAGEREF _Toc238558258 \h </w:instrText>
         </w:r>
         <w:r>
           <w:rPr>
@@ -2581,7 +2581,7 @@
           <w:lang w:val="tr-TR" w:eastAsia="tr-TR"/>
         </w:rPr>
       </w:pPr>
-      <w:hyperlink w:anchor="_Toc238558113" w:history="1">
+      <w:hyperlink w:anchor="_Toc238558259" w:history="1">
         <w:r>
           <w:rPr>
             <w:rStyle w:val="Kpr"/>
@@ -2608,7 +2608,7 @@
             <w:noProof/>
             <w:webHidden/>
           </w:rPr>
-          <w:instrText xml:space="preserve"> PAGEREF _Toc238558113 \h </w:instrText>
+          <w:instrText xml:space="preserve"> PAGEREF _Toc238558259 \h </w:instrText>
         </w:r>
         <w:r>
           <w:rPr>
@@ -2655,7 +2655,7 @@
           <w:lang w:val="tr-TR" w:eastAsia="tr-TR"/>
         </w:rPr>
       </w:pPr>
-      <w:hyperlink w:anchor="_Toc238558114" w:history="1">
+      <w:hyperlink w:anchor="_Toc238558260" w:history="1">
         <w:r>
           <w:rPr>
             <w:rStyle w:val="Kpr"/>
@@ -2682,7 +2682,7 @@
             <w:noProof/>
             <w:webHidden/>
           </w:rPr>
-          <w:instrText xml:space="preserve"> PAGEREF _Toc238558114 \h </w:instrText>
+          <w:instrText xml:space="preserve"> PAGEREF _Toc238558260 \h </w:instrText>
         </w:r>
         <w:r>
           <w:rPr>
@@ -2729,7 +2729,7 @@
           <w:lang w:val="tr-TR" w:eastAsia="tr-TR"/>
         </w:rPr>
       </w:pPr>
-      <w:hyperlink w:anchor="_Toc238558115" w:history="1">
+      <w:hyperlink w:anchor="_Toc238558261" w:history="1">
         <w:r>
           <w:rPr>
             <w:rStyle w:val="Kpr"/>
@@ -2756,7 +2756,7 @@
             <w:noProof/>
             <w:webHidden/>
           </w:rPr>
-          <w:instrText xml:space="preserve"> PAGEREF _Toc238558115 \h </w:instrText>
+          <w:instrText xml:space="preserve"> PAGEREF _Toc238558261 \h </w:instrText>
         </w:r>
         <w:r>
           <w:rPr>
@@ -2803,7 +2803,7 @@
           <w:lang w:val="tr-TR" w:eastAsia="tr-TR"/>
         </w:rPr>
       </w:pPr>
-      <w:hyperlink w:anchor="_Toc238558116" w:history="1">
+      <w:hyperlink w:anchor="_Toc238558262" w:history="1">
         <w:r>
           <w:rPr>
             <w:rStyle w:val="Kpr"/>
@@ -2830,7 +2830,7 @@
             <w:noProof/>
             <w:webHidden/>
           </w:rPr>
-          <w:instrText xml:space="preserve"> PAGEREF _Toc238558116 \h </w:instrText>
+          <w:instrText xml:space="preserve"> PAGEREF _Toc238558262 \h </w:instrText>
         </w:r>
         <w:r>
           <w:rPr>
@@ -2877,7 +2877,7 @@
           <w:lang w:val="tr-TR" w:eastAsia="tr-TR"/>
         </w:rPr>
       </w:pPr>
-      <w:hyperlink w:anchor="_Toc238558117" w:history="1">
+      <w:hyperlink w:anchor="_Toc238558263" w:history="1">
         <w:r>
           <w:rPr>
             <w:rStyle w:val="Kpr"/>
@@ -2904,7 +2904,7 @@
             <w:noProof/>
             <w:webHidden/>
           </w:rPr>
-          <w:instrText xml:space="preserve"> PAGEREF _Toc238558117 \h </w:instrText>
+          <w:instrText xml:space="preserve"> PAGEREF _Toc238558263 \h </w:instrText>
         </w:r>
         <w:r>
           <w:rPr>
@@ -2951,7 +2951,7 @@
           <w:lang w:val="tr-TR" w:eastAsia="tr-TR"/>
         </w:rPr>
       </w:pPr>
-      <w:hyperlink w:anchor="_Toc238558118" w:history="1">
+      <w:hyperlink w:anchor="_Toc238558264" w:history="1">
         <w:r>
           <w:rPr>
             <w:rStyle w:val="Kpr"/>
@@ -2978,7 +2978,7 @@
             <w:noProof/>
             <w:webHidden/>
           </w:rPr>
-          <w:instrText xml:space="preserve"> PAGEREF _Toc238558118 \h </w:instrText>
+          <w:instrText xml:space="preserve"> PAGEREF _Toc238558264 \h </w:instrText>
         </w:r>
         <w:r>
           <w:rPr>
@@ -3025,7 +3025,7 @@
           <w:lang w:val="tr-TR" w:eastAsia="tr-TR"/>
         </w:rPr>
       </w:pPr>
-      <w:hyperlink w:anchor="_Toc238558119" w:history="1">
+      <w:hyperlink w:anchor="_Toc238558265" w:history="1">
         <w:r>
           <w:rPr>
             <w:rStyle w:val="Kpr"/>
@@ -3052,7 +3052,7 @@
             <w:noProof/>
             <w:webHidden/>
           </w:rPr>
-          <w:instrText xml:space="preserve"> PAGEREF _Toc238558119 \h </w:instrText>
+          <w:instrText xml:space="preserve"> PAGEREF _Toc238558265 \h </w:instrText>
         </w:r>
         <w:r>
           <w:rPr>
@@ -3099,7 +3099,7 @@
           <w:lang w:val="tr-TR" w:eastAsia="tr-TR"/>
         </w:rPr>
       </w:pPr>
-      <w:hyperlink w:anchor="_Toc238558120" w:history="1">
+      <w:hyperlink w:anchor="_Toc238558266" w:history="1">
         <w:r>
           <w:rPr>
             <w:rStyle w:val="Kpr"/>
@@ -3126,7 +3126,7 @@
             <w:noProof/>
             <w:webHidden/>
           </w:rPr>
-          <w:instrText xml:space="preserve"> PAGEREF _Toc238558120 \h </w:instrText>
+          <w:instrText xml:space="preserve"> PAGEREF _Toc238558266 \h </w:instrText>
         </w:r>
         <w:r>
           <w:rPr>
@@ -3186,7 +3186,7 @@
           <w:bottom w:val="single" w:sz="8" w:space="5" w:color="207B79"/>
         </w:pBdr>
       </w:pPr>
-      <w:bookmarkStart w:id="0" w:name="_Toc238558080"/>
+      <w:bookmarkStart w:id="0" w:name="_Toc238558226"/>
       <w:r>
         <w:lastRenderedPageBreak/>
         <w:t>1. Çalışmanın Amacı ve Genel Sonuç</w:t>
@@ -3334,7 +3334,7 @@
           <w:bottom w:val="single" w:sz="8" w:space="5" w:color="207B79"/>
         </w:pBdr>
       </w:pPr>
-      <w:bookmarkStart w:id="1" w:name="_Toc238558081"/>
+      <w:bookmarkStart w:id="1" w:name="_Toc238558227"/>
       <w:r>
         <w:t>2. Değerlendirme Yöntemi ve Veri Setleri</w:t>
       </w:r>
@@ -3344,7 +3344,7 @@
       <w:pPr>
         <w:pStyle w:val="Balk2"/>
       </w:pPr>
-      <w:bookmarkStart w:id="2" w:name="_Toc238558082"/>
+      <w:bookmarkStart w:id="2" w:name="_Toc238558228"/>
       <w:r>
         <w:t xml:space="preserve">2.1 </w:t>
       </w:r>
@@ -3397,7 +3397,7 @@
       <w:pPr>
         <w:pStyle w:val="Balk3"/>
       </w:pPr>
-      <w:bookmarkStart w:id="3" w:name="_Toc238558083"/>
+      <w:bookmarkStart w:id="3" w:name="_Toc238558229"/>
       <w:r>
         <w:t>Birleşik fayda puanı ve net fayda</w:t>
       </w:r>
@@ -3621,7 +3621,7 @@
       <w:pPr>
         <w:pStyle w:val="Balk2"/>
       </w:pPr>
-      <w:bookmarkStart w:id="4" w:name="_Toc238558084"/>
+      <w:bookmarkStart w:id="4" w:name="_Toc238558230"/>
       <w:r>
         <w:t>2.2 Kullanılan veri setleri</w:t>
       </w:r>
@@ -4377,7 +4377,7 @@
       <w:pPr>
         <w:pStyle w:val="Balk2"/>
       </w:pPr>
-      <w:bookmarkStart w:id="5" w:name="_Toc238558085"/>
+      <w:bookmarkStart w:id="5" w:name="_Toc238558231"/>
       <w:r>
         <w:t>2.3 Karşılaştırmanın ortak zemini</w:t>
       </w:r>
@@ -4419,7 +4419,7 @@
           <w:bottom w:val="single" w:sz="8" w:space="5" w:color="207B79"/>
         </w:pBdr>
       </w:pPr>
-      <w:bookmarkStart w:id="6" w:name="_Toc238558086"/>
+      <w:bookmarkStart w:id="6" w:name="_Toc238558232"/>
       <w:r>
         <w:lastRenderedPageBreak/>
         <w:t>3. Hazır Parser'ların Karşılaştırılması</w:t>
@@ -4430,7 +4430,7 @@
       <w:pPr>
         <w:pStyle w:val="Balk2"/>
       </w:pPr>
-      <w:bookmarkStart w:id="7" w:name="_Toc238558087"/>
+      <w:bookmarkStart w:id="7" w:name="_Toc238558233"/>
       <w:r>
         <w:t>3.1 Karşılaştırılan araçlar</w:t>
       </w:r>
@@ -4539,7 +4539,7 @@
       <w:pPr>
         <w:pStyle w:val="Balk2"/>
       </w:pPr>
-      <w:bookmarkStart w:id="8" w:name="_Toc238558088"/>
+      <w:bookmarkStart w:id="8" w:name="_Toc238558234"/>
       <w:r>
         <w:t>3.2 OpenDataLoader benchmark sonuçları</w:t>
       </w:r>
@@ -5634,7 +5634,7 @@
         </w:rPr>
         <w:lastRenderedPageBreak/>
         <w:drawing>
-          <wp:inline distT="0" distB="0" distL="0" distR="0" wp14:anchorId="4AC6BE97" wp14:editId="458A7947">
+          <wp:inline distT="0" distB="0" distL="0" distR="0" wp14:anchorId="785BC6E9" wp14:editId="73EAD6D2">
             <wp:extent cx="5940000" cy="2994207"/>
             <wp:effectExtent l="0" t="0" r="0" b="0"/>
             <wp:docPr id="1" name="Picture 1"/>
@@ -5735,7 +5735,7 @@
       <w:pPr>
         <w:pStyle w:val="Balk2"/>
       </w:pPr>
-      <w:bookmarkStart w:id="9" w:name="_Toc238558089"/>
+      <w:bookmarkStart w:id="9" w:name="_Toc238558235"/>
       <w:r>
         <w:t>3.3 Gözl</w:t>
       </w:r>
@@ -5842,7 +5842,7 @@
           <w:bottom w:val="single" w:sz="8" w:space="5" w:color="207B79"/>
         </w:pBdr>
       </w:pPr>
-      <w:bookmarkStart w:id="10" w:name="_Toc238558090"/>
+      <w:bookmarkStart w:id="10" w:name="_Toc238558236"/>
       <w:r>
         <w:t>4. Sayfa Düzeyinde Yönlendirme Y</w:t>
       </w:r>
@@ -5855,7 +5855,7 @@
       <w:pPr>
         <w:pStyle w:val="Balk2"/>
       </w:pPr>
-      <w:bookmarkStart w:id="11" w:name="_Toc238558091"/>
+      <w:bookmarkStart w:id="11" w:name="_Toc238558237"/>
       <w:r>
         <w:t>4.1 İlk prototipteki yanlış varsayım</w:t>
       </w:r>
@@ -5894,7 +5894,7 @@
       <w:pPr>
         <w:pStyle w:val="Balk2"/>
       </w:pPr>
-      <w:bookmarkStart w:id="12" w:name="_Toc238558092"/>
+      <w:bookmarkStart w:id="12" w:name="_Toc238558238"/>
       <w:r>
         <w:t>4.2 Belge yerine sayfa düzeyinde karar</w:t>
       </w:r>
@@ -5933,7 +5933,7 @@
       <w:pPr>
         <w:pStyle w:val="Balk2"/>
       </w:pPr>
-      <w:bookmarkStart w:id="13" w:name="_Toc238558093"/>
+      <w:bookmarkStart w:id="13" w:name="_Toc238558239"/>
       <w:r>
         <w:t>4.3 Önce hızlı çıkar, sonra seç</w:t>
       </w:r>
@@ -5972,7 +5972,7 @@
       <w:pPr>
         <w:pStyle w:val="Balk2"/>
       </w:pPr>
-      <w:bookmarkStart w:id="14" w:name="_Toc238558094"/>
+      <w:bookmarkStart w:id="14" w:name="_Toc238558240"/>
       <w:r>
         <w:t>4.4 Tek kalite puanından ayrı sinyallere geçiş</w:t>
       </w:r>
@@ -6015,7 +6015,7 @@
       <w:pPr>
         <w:pStyle w:val="Balk2"/>
       </w:pPr>
-      <w:bookmarkStart w:id="15" w:name="_Toc238558095"/>
+      <w:bookmarkStart w:id="15" w:name="_Toc238558241"/>
       <w:r>
         <w:t>4.5 OCR kararı</w:t>
       </w:r>
@@ -6067,7 +6067,7 @@
       <w:pPr>
         <w:pStyle w:val="Balk2"/>
       </w:pPr>
-      <w:bookmarkStart w:id="16" w:name="_Toc238558096"/>
+      <w:bookmarkStart w:id="16" w:name="_Toc238558242"/>
       <w:r>
         <w:t>4.6 Tablo sinyalinin geliştirilmesi</w:t>
       </w:r>
@@ -6206,7 +6206,7 @@
       <w:pPr>
         <w:pStyle w:val="Balk2"/>
       </w:pPr>
-      <w:bookmarkStart w:id="17" w:name="_Toc238558097"/>
+      <w:bookmarkStart w:id="17" w:name="_Toc238558243"/>
       <w:r>
         <w:lastRenderedPageBreak/>
         <w:t>4.7 Hazır tablo tespit modelleri</w:t>
@@ -6928,7 +6928,7 @@
           <w:noProof/>
         </w:rPr>
         <w:drawing>
-          <wp:inline distT="0" distB="0" distL="0" distR="0" wp14:anchorId="6C5B6B23" wp14:editId="0A2A0F76">
+          <wp:inline distT="0" distB="0" distL="0" distR="0" wp14:anchorId="13403200" wp14:editId="20CAD948">
             <wp:extent cx="5940000" cy="2915423"/>
             <wp:effectExtent l="0" t="0" r="0" b="0"/>
             <wp:docPr id="2" name="Picture 2"/>
@@ -6982,7 +6982,7 @@
       <w:pPr>
         <w:pStyle w:val="Balk2"/>
       </w:pPr>
-      <w:bookmarkStart w:id="18" w:name="_Toc238558098"/>
+      <w:bookmarkStart w:id="18" w:name="_Toc238558244"/>
       <w:r>
         <w:lastRenderedPageBreak/>
         <w:t>4.8 Ağır çıktıyı denetleme</w:t>
@@ -7061,7 +7061,7 @@
       <w:pPr>
         <w:pStyle w:val="Balk2"/>
       </w:pPr>
-      <w:bookmarkStart w:id="19" w:name="_Toc238558099"/>
+      <w:bookmarkStart w:id="19" w:name="_Toc238558245"/>
       <w:r>
         <w:t>4.9 Kaynakla doğrulanan ligatür düzeltmesi</w:t>
       </w:r>
@@ -7154,7 +7154,7 @@
       <w:pPr>
         <w:pStyle w:val="Balk2"/>
       </w:pPr>
-      <w:bookmarkStart w:id="20" w:name="_Toc238558100"/>
+      <w:bookmarkStart w:id="20" w:name="_Toc238558246"/>
       <w:r>
         <w:lastRenderedPageBreak/>
         <w:t>4.10 Güncel sistem akışı</w:t>
@@ -7174,7 +7174,7 @@
           <w:noProof/>
         </w:rPr>
         <w:drawing>
-          <wp:inline distT="0" distB="0" distL="0" distR="0" wp14:anchorId="0A9FCB28" wp14:editId="2F41743B">
+          <wp:inline distT="0" distB="0" distL="0" distR="0" wp14:anchorId="20FE6A3D" wp14:editId="5B3E59C9">
             <wp:extent cx="5940000" cy="3225301"/>
             <wp:effectExtent l="0" t="0" r="0" b="0"/>
             <wp:docPr id="3" name="Picture 3"/>
@@ -7294,7 +7294,7 @@
           <w:bottom w:val="single" w:sz="8" w:space="5" w:color="207B79"/>
         </w:pBdr>
       </w:pPr>
-      <w:bookmarkStart w:id="21" w:name="_Toc238558101"/>
+      <w:bookmarkStart w:id="21" w:name="_Toc238558247"/>
       <w:r>
         <w:t>5. Kalite Doğrulaması ve Güncel Yönlendirme Karnesi</w:t>
       </w:r>
@@ -7304,7 +7304,7 @@
       <w:pPr>
         <w:pStyle w:val="Balk2"/>
       </w:pPr>
-      <w:bookmarkStart w:id="22" w:name="_Toc238558102"/>
+      <w:bookmarkStart w:id="22" w:name="_Toc238558248"/>
       <w:r>
         <w:t>5.1 Yönlendirme kararını referansa göre ölçmek</w:t>
       </w:r>
@@ -7353,7 +7353,7 @@
       <w:pPr>
         <w:pStyle w:val="Balk2"/>
       </w:pPr>
-      <w:bookmarkStart w:id="23" w:name="_Toc238558103"/>
+      <w:bookmarkStart w:id="23" w:name="_Toc238558249"/>
       <w:r>
         <w:lastRenderedPageBreak/>
         <w:t>5.2 Veri ailelerine göre güncel sonuç</w:t>
@@ -7386,7 +7386,7 @@
           <w:noProof/>
         </w:rPr>
         <w:drawing>
-          <wp:inline distT="0" distB="0" distL="0" distR="0" wp14:anchorId="7D14C5D6" wp14:editId="20F68ABF">
+          <wp:inline distT="0" distB="0" distL="0" distR="0" wp14:anchorId="020753A2" wp14:editId="6E2018A2">
             <wp:extent cx="5940000" cy="2912492"/>
             <wp:effectExtent l="0" t="0" r="0" b="0"/>
             <wp:docPr id="4" name="Picture 4"/>
@@ -8189,7 +8189,7 @@
       <w:pPr>
         <w:pStyle w:val="Balk2"/>
       </w:pPr>
-      <w:bookmarkStart w:id="24" w:name="_Toc238558104"/>
+      <w:bookmarkStart w:id="24" w:name="_Toc238558250"/>
       <w:r>
         <w:t>5.3 Ayar geliştirmede kullanılan 201 belgeli al</w:t>
       </w:r>
@@ -8924,7 +8924,7 @@
       <w:pPr>
         <w:pStyle w:val="Balk2"/>
       </w:pPr>
-      <w:bookmarkStart w:id="25" w:name="_Toc238558105"/>
+      <w:bookmarkStart w:id="25" w:name="_Toc238558251"/>
       <w:r>
         <w:t>5.4 Ayar geliştirmede seçilen önemli düzeltmeler</w:t>
       </w:r>
@@ -9583,7 +9583,7 @@
       <w:pPr>
         <w:pStyle w:val="Balk2"/>
       </w:pPr>
-      <w:bookmarkStart w:id="26" w:name="_Toc238558106"/>
+      <w:bookmarkStart w:id="26" w:name="_Toc238558252"/>
       <w:r>
         <w:t>5.5 Doğrulamanın sınırı</w:t>
       </w:r>
@@ -9619,7 +9619,7 @@
           <w:bottom w:val="single" w:sz="8" w:space="5" w:color="207B79"/>
         </w:pBdr>
       </w:pPr>
-      <w:bookmarkStart w:id="27" w:name="_Toc238558107"/>
+      <w:bookmarkStart w:id="27" w:name="_Toc238558253"/>
       <w:r>
         <w:lastRenderedPageBreak/>
         <w:t>6. Performans ve İlgili Alternatif Denemeler</w:t>
@@ -9630,7 +9630,7 @@
       <w:pPr>
         <w:pStyle w:val="Balk2"/>
       </w:pPr>
-      <w:bookmarkStart w:id="28" w:name="_Toc238558108"/>
+      <w:bookmarkStart w:id="28" w:name="_Toc238558254"/>
       <w:r>
         <w:t>6.1 Docling'in CPU ve GPU hızı</w:t>
       </w:r>
@@ -9653,7 +9653,7 @@
       <w:pPr>
         <w:pStyle w:val="Balk2"/>
       </w:pPr>
-      <w:bookmarkStart w:id="29" w:name="_Toc238558109"/>
+      <w:bookmarkStart w:id="29" w:name="_Toc238558255"/>
       <w:r>
         <w:t>6.2 Ölçüm makinesindeki ayrıntılı sonuçlar</w:t>
       </w:r>
@@ -10272,7 +10272,7 @@
       <w:pPr>
         <w:pStyle w:val="Balk2"/>
       </w:pPr>
-      <w:bookmarkStart w:id="30" w:name="_Toc238558110"/>
+      <w:bookmarkStart w:id="30" w:name="_Toc238558256"/>
       <w:r>
         <w:t>6.3 Yönlendi</w:t>
       </w:r>
@@ -10805,7 +10805,7 @@
         </w:rPr>
         <w:lastRenderedPageBreak/>
         <w:drawing>
-          <wp:inline distT="0" distB="0" distL="0" distR="0" wp14:anchorId="2D35795C" wp14:editId="777D8C32">
+          <wp:inline distT="0" distB="0" distL="0" distR="0" wp14:anchorId="605DF431" wp14:editId="0F6DD797">
             <wp:extent cx="5760000" cy="3046612"/>
             <wp:effectExtent l="0" t="0" r="0" b="0"/>
             <wp:docPr id="5" name="Picture 5"/>
@@ -10898,7 +10898,7 @@
       <w:pPr>
         <w:pStyle w:val="Balk2"/>
       </w:pPr>
-      <w:bookmarkStart w:id="31" w:name="_Toc238558111"/>
+      <w:bookmarkStart w:id="31" w:name="_Toc238558257"/>
       <w:r>
         <w:t>6.4 MinerU GPU/VLM modu</w:t>
       </w:r>
@@ -11006,7 +11006,7 @@
       <w:pPr>
         <w:pStyle w:val="Balk2"/>
       </w:pPr>
-      <w:bookmarkStart w:id="32" w:name="_Toc238558112"/>
+      <w:bookmarkStart w:id="32" w:name="_Toc238558258"/>
       <w:r>
         <w:t>6.5 Şekilleri otomatik açıklama denemesi</w:t>
       </w:r>
@@ -11061,7 +11061,7 @@
           <w:bottom w:val="single" w:sz="8" w:space="5" w:color="207B79"/>
         </w:pBdr>
       </w:pPr>
-      <w:bookmarkStart w:id="33" w:name="_Toc238558113"/>
+      <w:bookmarkStart w:id="33" w:name="_Toc238558259"/>
       <w:r>
         <w:t>7. Uygulama Tercihleri ve Proje Haritası</w:t>
       </w:r>
@@ -11071,7 +11071,7 @@
       <w:pPr>
         <w:pStyle w:val="Balk2"/>
       </w:pPr>
-      <w:bookmarkStart w:id="34" w:name="_Toc238558114"/>
+      <w:bookmarkStart w:id="34" w:name="_Toc238558260"/>
       <w:r>
         <w:t>7.1 Platformla kurulan sınır</w:t>
       </w:r>
@@ -11142,7 +11142,7 @@
       <w:pPr>
         <w:pStyle w:val="Balk2"/>
       </w:pPr>
-      <w:bookmarkStart w:id="35" w:name="_Toc238558115"/>
+      <w:bookmarkStart w:id="35" w:name="_Toc238558261"/>
       <w:r>
         <w:t xml:space="preserve">7.2 </w:t>
       </w:r>
@@ -11191,7 +11191,7 @@
         </w:rPr>
         <w:lastRenderedPageBreak/>
         <w:drawing>
-          <wp:inline distT="0" distB="0" distL="0" distR="0" wp14:anchorId="267848D6" wp14:editId="6F8EF828">
+          <wp:inline distT="0" distB="0" distL="0" distR="0" wp14:anchorId="03F482E4" wp14:editId="564E1FCC">
             <wp:extent cx="5940000" cy="3271586"/>
             <wp:effectExtent l="0" t="0" r="0" b="0"/>
             <wp:docPr id="6" name="Picture 6"/>
@@ -11848,7 +11848,7 @@
       <w:pPr>
         <w:pStyle w:val="Balk2"/>
       </w:pPr>
-      <w:bookmarkStart w:id="36" w:name="_Toc238558116"/>
+      <w:bookmarkStart w:id="36" w:name="_Toc238558262"/>
       <w:r>
         <w:t>7.3 Doğrulanan ve kapsam dışında kalan davranışlar</w:t>
       </w:r>
@@ -11890,7 +11890,7 @@
           <w:bottom w:val="single" w:sz="8" w:space="5" w:color="207B79"/>
         </w:pBdr>
       </w:pPr>
-      <w:bookmarkStart w:id="37" w:name="_Toc238558117"/>
+      <w:bookmarkStart w:id="37" w:name="_Toc238558263"/>
       <w:r>
         <w:t>8. Genel Değerlendirme ve Açık Konular</w:t>
       </w:r>
@@ -11900,7 +11900,7 @@
       <w:pPr>
         <w:pStyle w:val="Balk2"/>
       </w:pPr>
-      <w:bookmarkStart w:id="38" w:name="_Toc238558118"/>
+      <w:bookmarkStart w:id="38" w:name="_Toc238558264"/>
       <w:r>
         <w:t>8.1 Kararların kısa özeti</w:t>
       </w:r>
@@ -13032,7 +13032,7 @@
       <w:pPr>
         <w:pStyle w:val="Balk2"/>
       </w:pPr>
-      <w:bookmarkStart w:id="39" w:name="_Toc238558119"/>
+      <w:bookmarkStart w:id="39" w:name="_Toc238558265"/>
       <w:r>
         <w:t>8.2 Öncelikli açık konular</w:t>
       </w:r>
@@ -13050,10 +13050,10 @@
         <w:rPr>
           <w:b/>
         </w:rPr>
-        <w:t>Bağımsız doğrulama:</w:t>
-      </w:r>
-      <w:r>
-        <w:t xml:space="preserve"> Farklı belge türleri, gerçek taramalar ve çok sayfalı referanslı PDF'lerden oluşan yeni bir küme hazırlanmalıdır.</w:t>
+        <w:t>Bağımsız test kümesi:</w:t>
+      </w:r>
+      <w:r>
+        <w:t xml:space="preserve"> Gerçek taramalar ve çok sayfalı, referanslı PDF'lerle doğrulama yapılmalı.</w:t>
       </w:r>
     </w:p>
     <w:p>
@@ -13068,13 +13068,10 @@
         <w:rPr>
           <w:b/>
         </w:rPr>
-        <w:t>OpenDataLoader kaybı:</w:t>
-      </w:r>
-      <w:r>
-        <w:t xml:space="preserve"> Negatif etkinin ağır motordan, yanlış sayfa seçiminden veya ölçüm biçiminden kaynaklanıp kaynaklanmadığı ayrı ayrı ince</w:t>
-      </w:r>
-      <w:r>
-        <w:t>lenmelidir.</w:t>
+        <w:t>OpenDataLoader sonucu:</w:t>
+      </w:r>
+      <w:r>
+        <w:t xml:space="preserve"> Negatif etkinin motor, sayfa seçimi veya ölçümden hangisine bağlı olduğu belirlenmeli.</w:t>
       </w:r>
     </w:p>
     <w:p>
@@ -13090,10 +13087,13 @@
           <w:b/>
         </w:rPr>
         <w:lastRenderedPageBreak/>
-        <w:t>Ağır çıktıyı kabul etme kararı:</w:t>
-      </w:r>
-      <w:r>
-        <w:t xml:space="preserve"> Okuma sırası, içerik kaybı ve tablo korunmasını birlikte ele alan daha güvenilir bir denetim geliştirilmelidir.</w:t>
+        <w:t>Ağır çıktı denetimi:</w:t>
+      </w:r>
+      <w:r>
+        <w:t xml:space="preserve"> İçerik kaybını, okuma sırasını ve tablo yapısını </w:t>
+      </w:r>
+      <w:r>
+        <w:t>daha güvenilir ölçen bir kontrol geliştirilmeli.</w:t>
       </w:r>
     </w:p>
     <w:p>
@@ -13108,13 +13108,10 @@
         <w:rPr>
           <w:b/>
         </w:rPr>
-        <w:t>Gerçek OCR örnekleri:</w:t>
-      </w:r>
-      <w:r>
-        <w:t xml:space="preserve"> Eğik, gürültülü ve düşük çözünürlüklü çok sayfalı taramalarla OCR ve sayfa bir</w:t>
-      </w:r>
-      <w:r>
-        <w:t>leştirme davranışı sınanmalıdır.</w:t>
+        <w:t>Son sistem ölçümü:</w:t>
+      </w:r>
+      <w:r>
+        <w:t xml:space="preserve"> Ligatür düzeltmesi dahil güncel kod aynı makinede uçtan uca ölçülmeli.</w:t>
       </w:r>
     </w:p>
     <w:p>
@@ -13129,11 +13126,24 @@
         <w:rPr>
           <w:b/>
         </w:rPr>
-        <w:t>Son sistem ölçümü:</w:t>
-      </w:r>
-      <w:r>
-        <w:t xml:space="preserve"> Ligatür düzeltmesini de içeren güncel kod, aynı ölçüm makinesinde doğrudan uçtan uca çalıştırılmalıdır.</w:t>
-      </w:r>
+        <w:t>Sonraki adaylar:</w:t>
+      </w:r>
+      <w:r>
+        <w:t xml:space="preserve"> Table Transformer, MinerU ve kalıcı çalışan Docling işçisi yalnız gerekli sayfalarda değerlendirilme</w:t>
+      </w:r>
+      <w:r>
+        <w:t>li.</w:t>
+      </w:r>
+    </w:p>
+    <w:p>
+      <w:pPr>
+        <w:pStyle w:val="Balk2"/>
+      </w:pPr>
+      <w:bookmarkStart w:id="40" w:name="_Toc238558266"/>
+      <w:r>
+        <w:t>8.3 Sonuç</w:t>
+      </w:r>
+      <w:bookmarkEnd w:id="40"/>
     </w:p>
     <w:p>
       <w:pPr>
@@ -13142,21 +13152,11 @@
         </w:rPr>
       </w:pPr>
       <w:r>
-        <w:t>İkinci aşamada okuma sırası sinyali, Table Transformer'ın belirsiz sayfalarda ikinci görüş olarak ku</w:t>
-      </w:r>
-      <w:r>
-        <w:t>llanılması, MinerU'nun seçilmiş zor sayfalarda denenmesi ve kalıcı çalışan Docling işçisi değerlendirilebilir. Ligatür düzeltmesinin önceki çıktılara uygulanması için belgelerin yeniden işlenmesi gerekir.</w:t>
-      </w:r>
-    </w:p>
-    <w:p>
-      <w:pPr>
-        <w:pStyle w:val="Balk2"/>
-      </w:pPr>
-      <w:bookmarkStart w:id="40" w:name="_Toc238558120"/>
-      <w:r>
-        <w:t>8.3 Sonuç</w:t>
-      </w:r>
-      <w:bookmarkEnd w:id="40"/>
+        <w:t>Çalışma sonunda farklı motorların güçlü yanlarını birleştiren, sayfa düzeyinde karar veren ve karar nedenini saklayan çalışan bir PDF hattı oluştu. Hızlı motor temiz sayfalarda maliyeti düşük tutarken Docling tablo, OCR ve karmaşık düzen bulu</w:t>
+      </w:r>
+      <w:r>
+        <w:t>nan sayfalarda seçici kullanılıyor.</w:t>
+      </w:r>
     </w:p>
     <w:p>
       <w:pPr>
@@ -13165,26 +13165,10 @@
         </w:rPr>
       </w:pPr>
       <w:r>
-        <w:t>Çalışma sonunda farklı motorların güçlü y</w:t>
-      </w:r>
-      <w:r>
-        <w:t>anlarını birleştiren, sayfa düzeyinde karar veren ve karar nedenini saklayan çalışan bir PDF hattı oluştu. Hızlı motor temiz sayfalarda maliyeti düşük tutarken Docling tablo, OCR ve karmaşık düzen bulunan sayfalarda seçici kullanılıyor.</w:t>
-      </w:r>
-    </w:p>
-    <w:p>
-      <w:pPr>
-        <w:rPr>
-          <w:rFonts w:hint="eastAsia"/>
-        </w:rPr>
-      </w:pPr>
-      <w:r>
-        <w:t>Yönlendirme OCRTurk</w:t>
-      </w:r>
-      <w:r>
-        <w:t xml:space="preserve"> belgelerinde fayda sağladı, ancak OpenDataLoader örneklerinde aynı başarıyı göstermedi. Bu nedenle mevcut eşikler bütün PDF türleri için kesin çözüm sayılmamalıdır. Bağımsız doğrulama kümesi, gerçek taramalar ve daha güvenilir ağır çıktı denetimi tamamlan</w:t>
-      </w:r>
-      <w:r>
-        <w:t>dığında kalite ile maliyet dengesi daha sağlam biçimde değerlendirilebilir.</w:t>
+        <w:t>Yönlendirme OCRTurk belgelerinde fayda sağladı, ancak OpenDataLoader örneklerinde aynı başarıyı göstermedi. Bu nedenle mevcut eşikler bütün PDF türleri için kesin çözüm sayılmamalıdır. Bağımsız doğrulama kümesi, gerçek t</w:t>
+      </w:r>
+      <w:r>
+        <w:t>aramalar ve daha güvenilir ağır çıktı denetimi tamamlandığında kalite ile maliyet dengesi daha sağlam biçimde değerlendirilebilir.</w:t>
       </w:r>
     </w:p>
     <w:sectPr>
@@ -25026,7 +25010,7 @@
     <w:autoRedefine/>
     <w:uiPriority w:val="39"/>
     <w:unhideWhenUsed/>
-    <w:rsid w:val="005E7884"/>
+    <w:rsid w:val="00BE1258"/>
     <w:pPr>
       <w:spacing w:after="0" w:line="240" w:lineRule="auto"/>
     </w:pPr>
@@ -25041,7 +25025,7 @@
     <w:autoRedefine/>
     <w:uiPriority w:val="39"/>
     <w:unhideWhenUsed/>
-    <w:rsid w:val="005E7884"/>
+    <w:rsid w:val="00BE1258"/>
     <w:pPr>
       <w:spacing w:after="0" w:line="240" w:lineRule="auto"/>
       <w:ind w:left="220"/>
@@ -25057,7 +25041,7 @@
     <w:autoRedefine/>
     <w:uiPriority w:val="39"/>
     <w:unhideWhenUsed/>
-    <w:rsid w:val="005E7884"/>
+    <w:rsid w:val="00BE1258"/>
     <w:pPr>
       <w:spacing w:after="0" w:line="240" w:lineRule="auto"/>
       <w:ind w:left="440"/>
@@ -25071,7 +25055,7 @@
     <w:basedOn w:val="VarsaylanParagrafYazTipi"/>
     <w:uiPriority w:val="99"/>
     <w:unhideWhenUsed/>
-    <w:rsid w:val="005E7884"/>
+    <w:rsid w:val="00BE1258"/>
     <w:rPr>
       <w:color w:val="0000FF" w:themeColor="hyperlink"/>
       <w:u w:val="single"/>

</xml_diff>